<commit_message>
2026-07-02: TR-383 Amendment 10 Common YANG Modules for Access Networks
</commit_message>
<xml_diff>
--- a/docs/index.docx
+++ b/docs/index.docx
@@ -55,7 +55,7 @@
         </w:p>
       </w:sdtContent>
     </w:sdt>
-    <w:bookmarkStart w:id="20" w:name="list-of-figures"/>
+    <w:bookmarkStart w:id="9" w:name="list-of-figures"/>
     <w:p>
       <w:pPr>
         <w:pStyle w:val="Heading3"/>
@@ -64,8 +64,8 @@
         <w:t xml:space="preserve">List of Figures</w:t>
       </w:r>
     </w:p>
-    <w:bookmarkEnd w:id="20"/>
-    <w:bookmarkStart w:id="21" w:name="list-of-tables"/>
+    <w:bookmarkEnd w:id="9"/>
+    <w:bookmarkStart w:id="10" w:name="list-of-tables"/>
     <w:p>
       <w:pPr>
         <w:pStyle w:val="Heading3"/>
@@ -74,8 +74,8 @@
         <w:t xml:space="preserve">List of Tables</w:t>
       </w:r>
     </w:p>
-    <w:bookmarkEnd w:id="21"/>
-    <w:bookmarkStart w:id="27" w:name="sec:issue-history"/>
+    <w:bookmarkEnd w:id="10"/>
+    <w:bookmarkStart w:id="16" w:name="sec:issue-history"/>
     <w:p>
       <w:pPr>
         <w:pStyle w:val="Heading3"/>
@@ -158,7 +158,7 @@
               <w:pStyle w:val="Compact"/>
               <w:jc w:val="left"/>
             </w:pPr>
-            <w:hyperlink r:id="rId22">
+            <w:hyperlink r:id="rId11">
               <w:r>
                 <w:rPr>
                   <w:rStyle w:val="Hyperlink"/>
@@ -221,7 +221,7 @@
               <w:pStyle w:val="Compact"/>
               <w:jc w:val="left"/>
             </w:pPr>
-            <w:hyperlink r:id="rId23">
+            <w:hyperlink r:id="rId12">
               <w:r>
                 <w:rPr>
                   <w:rStyle w:val="Hyperlink"/>
@@ -296,7 +296,7 @@
               <w:pStyle w:val="Compact"/>
               <w:jc w:val="left"/>
             </w:pPr>
-            <w:hyperlink r:id="rId24">
+            <w:hyperlink r:id="rId13">
               <w:r>
                 <w:rPr>
                   <w:rStyle w:val="Hyperlink"/>
@@ -385,7 +385,7 @@
               <w:pStyle w:val="Compact"/>
               <w:jc w:val="left"/>
             </w:pPr>
-            <w:hyperlink r:id="rId25">
+            <w:hyperlink r:id="rId14">
               <w:r>
                 <w:rPr>
                   <w:rStyle w:val="Hyperlink"/>
@@ -503,7 +503,7 @@
       <w:r>
         <w:t xml:space="preserve"> </w:t>
       </w:r>
-      <w:hyperlink r:id="rId26">
+      <w:hyperlink r:id="rId15">
         <w:r>
           <w:rPr>
             <w:rStyle w:val="Hyperlink"/>
@@ -515,8 +515,8 @@
         <w:t xml:space="preserve">.</w:t>
       </w:r>
     </w:p>
-    <w:bookmarkEnd w:id="27"/>
-    <w:bookmarkStart w:id="28" w:name="sec:editors"/>
+    <w:bookmarkEnd w:id="16"/>
+    <w:bookmarkStart w:id="17" w:name="sec:editors"/>
     <w:p>
       <w:pPr>
         <w:pStyle w:val="Heading3"/>
@@ -549,8 +549,8 @@
         <w:t xml:space="preserve">Sven Ooghe, Nokia</w:t>
       </w:r>
     </w:p>
-    <w:bookmarkEnd w:id="28"/>
-    <w:bookmarkStart w:id="29" w:name="sec:notice"/>
+    <w:bookmarkEnd w:id="17"/>
+    <w:bookmarkStart w:id="18" w:name="sec:notice"/>
     <w:p>
       <w:pPr>
         <w:pStyle w:val="Heading3"/>
@@ -597,8 +597,8 @@
         <w:t xml:space="preserve">and/or copyrighted by Broadband Forum members.</w:t>
       </w:r>
     </w:p>
-    <w:bookmarkEnd w:id="29"/>
-    <w:bookmarkStart w:id="30" w:name="sec:intellectual-property"/>
+    <w:bookmarkEnd w:id="18"/>
+    <w:bookmarkStart w:id="19" w:name="sec:intellectual-property"/>
     <w:p>
       <w:pPr>
         <w:pStyle w:val="Heading3"/>
@@ -645,8 +645,8 @@
         <w:t xml:space="preserve">documentation.</w:t>
       </w:r>
     </w:p>
-    <w:bookmarkEnd w:id="30"/>
-    <w:bookmarkStart w:id="31" w:name="sec:terms-of-use"/>
+    <w:bookmarkEnd w:id="19"/>
+    <w:bookmarkStart w:id="20" w:name="sec:terms-of-use"/>
     <w:p>
       <w:pPr>
         <w:pStyle w:val="Heading3"/>
@@ -903,8 +903,8 @@
         <w:t xml:space="preserve">notices, legends, and other provisions set forth on this page.</w:t>
       </w:r>
     </w:p>
-    <w:bookmarkEnd w:id="31"/>
-    <w:bookmarkStart w:id="51" w:name="sec:references"/>
+    <w:bookmarkEnd w:id="20"/>
+    <w:bookmarkStart w:id="40" w:name="sec:references"/>
     <w:p>
       <w:pPr>
         <w:pStyle w:val="Heading1"/>
@@ -913,8 +913,8 @@
         <w:t xml:space="preserve">References</w:t>
       </w:r>
     </w:p>
-    <w:bookmarkStart w:id="50" w:name="refs"/>
-    <w:bookmarkStart w:id="33" w:name="ref-TR-383"/>
+    <w:bookmarkStart w:id="39" w:name="refs"/>
+    <w:bookmarkStart w:id="22" w:name="ref-TR-383"/>
     <w:p>
       <w:pPr>
         <w:pStyle w:val="Bibliography"/>
@@ -934,7 +934,7 @@
       <w:r>
         <w:t xml:space="preserve"> </w:t>
       </w:r>
-      <w:hyperlink r:id="rId32">
+      <w:hyperlink r:id="rId21">
         <w:r>
           <w:rPr>
             <w:rStyle w:val="Hyperlink"/>
@@ -948,8 +948,8 @@
         <w:t xml:space="preserve">, Broadband Forum, 2024</w:t>
       </w:r>
     </w:p>
-    <w:bookmarkEnd w:id="33"/>
-    <w:bookmarkStart w:id="35" w:name="ref-RFC2119"/>
+    <w:bookmarkEnd w:id="22"/>
+    <w:bookmarkStart w:id="24" w:name="ref-RFC2119"/>
     <w:p>
       <w:pPr>
         <w:pStyle w:val="Bibliography"/>
@@ -969,7 +969,7 @@
       <w:r>
         <w:t xml:space="preserve"> </w:t>
       </w:r>
-      <w:hyperlink r:id="rId34">
+      <w:hyperlink r:id="rId23">
         <w:r>
           <w:rPr>
             <w:rStyle w:val="Hyperlink"/>
@@ -1063,8 +1063,8 @@
         <w:t xml:space="preserve">, IETF, 1997</w:t>
       </w:r>
     </w:p>
-    <w:bookmarkEnd w:id="35"/>
-    <w:bookmarkStart w:id="37" w:name="ref-RFC7223"/>
+    <w:bookmarkEnd w:id="24"/>
+    <w:bookmarkStart w:id="26" w:name="ref-RFC7223"/>
     <w:p>
       <w:pPr>
         <w:pStyle w:val="Bibliography"/>
@@ -1084,7 +1084,7 @@
       <w:r>
         <w:t xml:space="preserve"> </w:t>
       </w:r>
-      <w:hyperlink r:id="rId36">
+      <w:hyperlink r:id="rId25">
         <w:r>
           <w:rPr>
             <w:rStyle w:val="Hyperlink"/>
@@ -1194,8 +1194,8 @@
         <w:t xml:space="preserve">, IETF, 2014</w:t>
       </w:r>
     </w:p>
-    <w:bookmarkEnd w:id="37"/>
-    <w:bookmarkStart w:id="39" w:name="ref-RFC7950"/>
+    <w:bookmarkEnd w:id="26"/>
+    <w:bookmarkStart w:id="28" w:name="ref-RFC7950"/>
     <w:p>
       <w:pPr>
         <w:pStyle w:val="Bibliography"/>
@@ -1215,7 +1215,7 @@
       <w:r>
         <w:t xml:space="preserve"> </w:t>
       </w:r>
-      <w:hyperlink r:id="rId38">
+      <w:hyperlink r:id="rId27">
         <w:r>
           <w:rPr>
             <w:rStyle w:val="Hyperlink"/>
@@ -1309,8 +1309,8 @@
         <w:t xml:space="preserve">, IETF, 2016</w:t>
       </w:r>
     </w:p>
-    <w:bookmarkEnd w:id="39"/>
-    <w:bookmarkStart w:id="41" w:name="ref-RFC8174"/>
+    <w:bookmarkEnd w:id="28"/>
+    <w:bookmarkStart w:id="30" w:name="ref-RFC8174"/>
     <w:p>
       <w:pPr>
         <w:pStyle w:val="Bibliography"/>
@@ -1330,7 +1330,7 @@
       <w:r>
         <w:t xml:space="preserve"> </w:t>
       </w:r>
-      <w:hyperlink r:id="rId40">
+      <w:hyperlink r:id="rId29">
         <w:r>
           <w:rPr>
             <w:rStyle w:val="Hyperlink"/>
@@ -1472,8 +1472,8 @@
         <w:t xml:space="preserve">, IETF, 2017</w:t>
       </w:r>
     </w:p>
-    <w:bookmarkEnd w:id="41"/>
-    <w:bookmarkStart w:id="43" w:name="ref-RFC8407"/>
+    <w:bookmarkEnd w:id="30"/>
+    <w:bookmarkStart w:id="32" w:name="ref-RFC8407"/>
     <w:p>
       <w:pPr>
         <w:pStyle w:val="Bibliography"/>
@@ -1493,7 +1493,7 @@
       <w:r>
         <w:t xml:space="preserve"> </w:t>
       </w:r>
-      <w:hyperlink r:id="rId42">
+      <w:hyperlink r:id="rId31">
         <w:r>
           <w:rPr>
             <w:rStyle w:val="Hyperlink"/>
@@ -1651,8 +1651,8 @@
         <w:t xml:space="preserve">, IETF, 2018</w:t>
       </w:r>
     </w:p>
-    <w:bookmarkEnd w:id="43"/>
-    <w:bookmarkStart w:id="45" w:name="ref-RFC8632"/>
+    <w:bookmarkEnd w:id="32"/>
+    <w:bookmarkStart w:id="34" w:name="ref-RFC8632"/>
     <w:p>
       <w:pPr>
         <w:pStyle w:val="Bibliography"/>
@@ -1672,7 +1672,7 @@
       <w:r>
         <w:t xml:space="preserve"> </w:t>
       </w:r>
-      <w:hyperlink r:id="rId44">
+      <w:hyperlink r:id="rId33">
         <w:r>
           <w:rPr>
             <w:rStyle w:val="Hyperlink"/>
@@ -1782,8 +1782,8 @@
         <w:t xml:space="preserve">, IETF, 2019</w:t>
       </w:r>
     </w:p>
-    <w:bookmarkEnd w:id="45"/>
-    <w:bookmarkStart w:id="47" w:name="ref-X.733"/>
+    <w:bookmarkEnd w:id="34"/>
+    <w:bookmarkStart w:id="36" w:name="ref-X.733"/>
     <w:p>
       <w:pPr>
         <w:pStyle w:val="Bibliography"/>
@@ -1803,7 +1803,7 @@
       <w:r>
         <w:t xml:space="preserve"> </w:t>
       </w:r>
-      <w:hyperlink r:id="rId46">
+      <w:hyperlink r:id="rId35">
         <w:r>
           <w:rPr>
             <w:rStyle w:val="Hyperlink"/>
@@ -1945,8 +1945,8 @@
         <w:t xml:space="preserve">, ITU-T, 1992</w:t>
       </w:r>
     </w:p>
-    <w:bookmarkEnd w:id="47"/>
-    <w:bookmarkStart w:id="49" w:name="ref-X.736"/>
+    <w:bookmarkEnd w:id="36"/>
+    <w:bookmarkStart w:id="38" w:name="ref-X.736"/>
     <w:p>
       <w:pPr>
         <w:pStyle w:val="Bibliography"/>
@@ -1966,7 +1966,7 @@
       <w:r>
         <w:t xml:space="preserve"> </w:t>
       </w:r>
-      <w:hyperlink r:id="rId48">
+      <w:hyperlink r:id="rId37">
         <w:r>
           <w:rPr>
             <w:rStyle w:val="Hyperlink"/>
@@ -2108,10 +2108,10 @@
         <w:t xml:space="preserve">, ITU-T, 1992</w:t>
       </w:r>
     </w:p>
-    <w:bookmarkEnd w:id="49"/>
-    <w:bookmarkEnd w:id="50"/>
-    <w:bookmarkEnd w:id="51"/>
-    <w:bookmarkStart w:id="53" w:name="sec:overview"/>
+    <w:bookmarkEnd w:id="38"/>
+    <w:bookmarkEnd w:id="39"/>
+    <w:bookmarkEnd w:id="40"/>
+    <w:bookmarkStart w:id="42" w:name="sec:overview"/>
     <w:p>
       <w:pPr>
         <w:pStyle w:val="Heading1"/>
@@ -2128,7 +2128,7 @@
         <w:t xml:space="preserve">OD-360 provides a set of Best Current Practices for development of YANG Data Models in the Broadband Forum (BBF). The approach taken in establishing a set of best current practices is to utilize existing practices where those are relevant to the work of the Forum. The guidelines put forth by this document not only provide guidance for authors of BBF YANG models but are also enforced prior to YANG model publication to ensure a high level of quality and consistency across BBF projects.</w:t>
       </w:r>
     </w:p>
-    <w:bookmarkStart w:id="52" w:name="sec:yang-language-version"/>
+    <w:bookmarkStart w:id="41" w:name="sec:yang-language-version"/>
     <w:p>
       <w:pPr>
         <w:pStyle w:val="Heading2"/>
@@ -2162,9 +2162,9 @@
         <w:t xml:space="preserve">for use in all BBF YANG Data Models.</w:t>
       </w:r>
     </w:p>
-    <w:bookmarkEnd w:id="52"/>
-    <w:bookmarkEnd w:id="53"/>
-    <w:bookmarkStart w:id="172" w:name="sec:yang-guidelines"/>
+    <w:bookmarkEnd w:id="41"/>
+    <w:bookmarkEnd w:id="42"/>
+    <w:bookmarkStart w:id="161" w:name="sec:yang-guidelines"/>
     <w:p>
       <w:pPr>
         <w:pStyle w:val="Heading1"/>
@@ -2205,7 +2205,7 @@
         <w:t xml:space="preserve">Additional BBF-specific guidelines</w:t>
       </w:r>
     </w:p>
-    <w:bookmarkStart w:id="54" w:name="sec:terminology"/>
+    <w:bookmarkStart w:id="43" w:name="sec:terminology"/>
     <w:p>
       <w:pPr>
         <w:pStyle w:val="Heading2"/>
@@ -2234,8 +2234,8 @@
         <w:t xml:space="preserve">submodules, the term submodule is used instead.</w:t>
       </w:r>
     </w:p>
-    <w:bookmarkEnd w:id="54"/>
-    <w:bookmarkStart w:id="56" w:name="sec:template"/>
+    <w:bookmarkEnd w:id="43"/>
+    <w:bookmarkStart w:id="45" w:name="sec:template"/>
     <w:p>
       <w:pPr>
         <w:pStyle w:val="Heading2"/>
@@ -2254,7 +2254,7 @@
       <w:r>
         <w:t xml:space="preserve"> </w:t>
       </w:r>
-      <w:hyperlink r:id="rId55">
+      <w:hyperlink r:id="rId44">
         <w:r>
           <w:rPr>
             <w:rStyle w:val="Hyperlink"/>
@@ -2278,8 +2278,8 @@
         <w:t xml:space="preserve">Guidelines.</w:t>
       </w:r>
     </w:p>
-    <w:bookmarkEnd w:id="56"/>
-    <w:bookmarkStart w:id="107" w:name="sec:ietf-yang-guidelines"/>
+    <w:bookmarkEnd w:id="45"/>
+    <w:bookmarkStart w:id="96" w:name="sec:ietf-yang-guidelines"/>
     <w:p>
       <w:pPr>
         <w:pStyle w:val="Heading2"/>
@@ -2404,7 +2404,7 @@
         <w:t xml:space="preserve">noted.</w:t>
       </w:r>
     </w:p>
-    <w:bookmarkStart w:id="58" w:name="sec:ietf-1-yang-terms"/>
+    <w:bookmarkStart w:id="47" w:name="sec:ietf-1-yang-terms"/>
     <w:p>
       <w:pPr>
         <w:pStyle w:val="Heading3"/>
@@ -2431,7 +2431,7 @@
         </w:rPr>
         <w:t xml:space="preserve"> </w:t>
       </w:r>
-      <w:hyperlink r:id="rId57">
+      <w:hyperlink r:id="rId46">
         <w:r>
           <w:rPr>
             <w:rStyle w:val="Hyperlink"/>
@@ -2536,8 +2536,8 @@
         <w:t xml:space="preserve">.</w:t>
       </w:r>
     </w:p>
-    <w:bookmarkEnd w:id="58"/>
-    <w:bookmarkStart w:id="63" w:name="sec:ietf-2-yang-validation"/>
+    <w:bookmarkEnd w:id="47"/>
+    <w:bookmarkStart w:id="52" w:name="sec:ietf-2-yang-validation"/>
     <w:p>
       <w:pPr>
         <w:pStyle w:val="Heading3"/>
@@ -2564,7 +2564,7 @@
         </w:rPr>
         <w:t xml:space="preserve"> </w:t>
       </w:r>
-      <w:hyperlink r:id="rId59">
+      <w:hyperlink r:id="rId48">
         <w:r>
           <w:rPr>
             <w:rStyle w:val="Hyperlink"/>
@@ -2700,7 +2700,7 @@
       <w:r>
         <w:t xml:space="preserve"> </w:t>
       </w:r>
-      <w:hyperlink r:id="rId60">
+      <w:hyperlink r:id="rId49">
         <w:r>
           <w:rPr>
             <w:rStyle w:val="Hyperlink"/>
@@ -2722,7 +2722,7 @@
       <w:r>
         <w:t xml:space="preserve"> </w:t>
       </w:r>
-      <w:hyperlink r:id="rId61">
+      <w:hyperlink r:id="rId50">
         <w:r>
           <w:rPr>
             <w:rStyle w:val="Hyperlink"/>
@@ -2741,7 +2741,7 @@
       <w:r>
         <w:t xml:space="preserve"> </w:t>
       </w:r>
-      <w:hyperlink r:id="rId62">
+      <w:hyperlink r:id="rId51">
         <w:r>
           <w:rPr>
             <w:rStyle w:val="Hyperlink"/>
@@ -2750,8 +2750,8 @@
         </w:r>
       </w:hyperlink>
     </w:p>
-    <w:bookmarkEnd w:id="63"/>
-    <w:bookmarkStart w:id="65" w:name="sec:ietf-3-yang-usage-guidelines"/>
+    <w:bookmarkEnd w:id="52"/>
+    <w:bookmarkStart w:id="54" w:name="sec:ietf-3-yang-usage-guidelines"/>
     <w:p>
       <w:pPr>
         <w:pStyle w:val="Heading3"/>
@@ -2778,7 +2778,7 @@
         </w:rPr>
         <w:t xml:space="preserve"> </w:t>
       </w:r>
-      <w:hyperlink r:id="rId64">
+      <w:hyperlink r:id="rId53">
         <w:r>
           <w:rPr>
             <w:rStyle w:val="Hyperlink"/>
@@ -2856,8 +2856,8 @@
         <w:t xml:space="preserve">.</w:t>
       </w:r>
     </w:p>
-    <w:bookmarkEnd w:id="65"/>
-    <w:bookmarkStart w:id="67" w:name="sec:ietf-4-file-layout"/>
+    <w:bookmarkEnd w:id="54"/>
+    <w:bookmarkStart w:id="56" w:name="sec:ietf-4-file-layout"/>
     <w:p>
       <w:pPr>
         <w:pStyle w:val="Heading3"/>
@@ -2884,7 +2884,7 @@
         </w:rPr>
         <w:t xml:space="preserve"> </w:t>
       </w:r>
-      <w:hyperlink r:id="rId66">
+      <w:hyperlink r:id="rId55">
         <w:r>
           <w:rPr>
             <w:rStyle w:val="Hyperlink"/>
@@ -2941,8 +2941,8 @@
         <w:t xml:space="preserve">Each BBF YANG module or submodule MUST be stored within a BBF YANG repository in a file called &lt;module-name&gt;.yang or &lt;submodule-name&gt;.yang without revision-date in the name.</w:t>
       </w:r>
     </w:p>
-    <w:bookmarkEnd w:id="67"/>
-    <w:bookmarkStart w:id="69" w:name="sec:ietf-5-quoting"/>
+    <w:bookmarkEnd w:id="56"/>
+    <w:bookmarkStart w:id="58" w:name="sec:ietf-5-quoting"/>
     <w:p>
       <w:pPr>
         <w:pStyle w:val="Heading3"/>
@@ -2969,7 +2969,7 @@
         </w:rPr>
         <w:t xml:space="preserve"> </w:t>
       </w:r>
-      <w:hyperlink r:id="rId68">
+      <w:hyperlink r:id="rId57">
         <w:r>
           <w:rPr>
             <w:rStyle w:val="Hyperlink"/>
@@ -3082,8 +3082,8 @@
         <w:t xml:space="preserve">  }</w:t>
       </w:r>
     </w:p>
-    <w:bookmarkEnd w:id="69"/>
-    <w:bookmarkStart w:id="71" w:name="sec:ietf-6-module-naming-conventions"/>
+    <w:bookmarkEnd w:id="58"/>
+    <w:bookmarkStart w:id="60" w:name="sec:ietf-6-module-naming-conventions"/>
     <w:p>
       <w:pPr>
         <w:pStyle w:val="Heading3"/>
@@ -3110,7 +3110,7 @@
         </w:rPr>
         <w:t xml:space="preserve"> </w:t>
       </w:r>
-      <w:hyperlink r:id="rId70">
+      <w:hyperlink r:id="rId59">
         <w:r>
           <w:rPr>
             <w:rStyle w:val="Hyperlink"/>
@@ -3238,8 +3238,8 @@
         <w:t xml:space="preserve">.</w:t>
       </w:r>
     </w:p>
-    <w:bookmarkEnd w:id="71"/>
-    <w:bookmarkStart w:id="78" w:name="X6b1d9f9c38419ad118636afcc437f3f8656b382"/>
+    <w:bookmarkEnd w:id="60"/>
+    <w:bookmarkStart w:id="67" w:name="X6b1d9f9c38419ad118636afcc437f3f8656b382"/>
     <w:p>
       <w:pPr>
         <w:pStyle w:val="Heading3"/>
@@ -3266,7 +3266,7 @@
         </w:rPr>
         <w:t xml:space="preserve"> </w:t>
       </w:r>
-      <w:hyperlink r:id="rId72">
+      <w:hyperlink r:id="rId61">
         <w:r>
           <w:rPr>
             <w:rStyle w:val="Hyperlink"/>
@@ -3315,7 +3315,7 @@
         <w:t xml:space="preserve">.</w:t>
       </w:r>
     </w:p>
-    <w:bookmarkStart w:id="73" w:name="sec:namespace"/>
+    <w:bookmarkStart w:id="62" w:name="sec:namespace"/>
     <w:p>
       <w:pPr>
         <w:pStyle w:val="Heading4"/>
@@ -3332,8 +3332,8 @@
         <w:t xml:space="preserve">See IETF-9.</w:t>
       </w:r>
     </w:p>
-    <w:bookmarkEnd w:id="73"/>
-    <w:bookmarkStart w:id="74" w:name="sec:organization"/>
+    <w:bookmarkEnd w:id="62"/>
+    <w:bookmarkStart w:id="63" w:name="sec:organization"/>
     <w:p>
       <w:pPr>
         <w:pStyle w:val="Heading4"/>
@@ -3398,8 +3398,8 @@
         <w:t xml:space="preserve">  &lt;project stream name&gt; Project Stream";</w:t>
       </w:r>
     </w:p>
-    <w:bookmarkEnd w:id="74"/>
-    <w:bookmarkStart w:id="75" w:name="sec:contact"/>
+    <w:bookmarkEnd w:id="63"/>
+    <w:bookmarkStart w:id="64" w:name="sec:contact"/>
     <w:p>
       <w:pPr>
         <w:pStyle w:val="Heading4"/>
@@ -3551,8 +3551,8 @@
         <w:t xml:space="preserve">  WA Director: &lt;name&gt;, &lt;company&gt;</w:t>
       </w:r>
     </w:p>
-    <w:bookmarkEnd w:id="75"/>
-    <w:bookmarkStart w:id="76" w:name="sec:description"/>
+    <w:bookmarkEnd w:id="64"/>
+    <w:bookmarkStart w:id="65" w:name="sec:description"/>
     <w:p>
       <w:pPr>
         <w:pStyle w:val="Heading4"/>
@@ -3569,8 +3569,8 @@
         <w:t xml:space="preserve">See IETF-8.</w:t>
       </w:r>
     </w:p>
-    <w:bookmarkEnd w:id="76"/>
-    <w:bookmarkStart w:id="77" w:name="sec:revision"/>
+    <w:bookmarkEnd w:id="65"/>
+    <w:bookmarkStart w:id="66" w:name="sec:revision"/>
     <w:p>
       <w:pPr>
         <w:pStyle w:val="Heading4"/>
@@ -3673,9 +3673,9 @@
         <w:t xml:space="preserve">.</w:t>
       </w:r>
     </w:p>
-    <w:bookmarkEnd w:id="77"/>
-    <w:bookmarkEnd w:id="78"/>
-    <w:bookmarkStart w:id="79" w:name="X08b3505cb90c3b604f08700e4b6751d9d44e4a3"/>
+    <w:bookmarkEnd w:id="66"/>
+    <w:bookmarkEnd w:id="67"/>
+    <w:bookmarkStart w:id="68" w:name="X08b3505cb90c3b604f08700e4b6751d9d44e4a3"/>
     <w:p>
       <w:pPr>
         <w:pStyle w:val="Heading3"/>
@@ -3702,7 +3702,7 @@
         </w:rPr>
         <w:t xml:space="preserve"> </w:t>
       </w:r>
-      <w:hyperlink r:id="rId72">
+      <w:hyperlink r:id="rId61">
         <w:r>
           <w:rPr>
             <w:rStyle w:val="Hyperlink"/>
@@ -3783,8 +3783,8 @@
         <w:t xml:space="preserve">BBF Notice Section</w:t>
       </w:r>
     </w:p>
-    <w:bookmarkEnd w:id="79"/>
-    <w:bookmarkStart w:id="81" w:name="sec:ietf-9-namespace-assignments"/>
+    <w:bookmarkEnd w:id="68"/>
+    <w:bookmarkStart w:id="70" w:name="sec:ietf-9-namespace-assignments"/>
     <w:p>
       <w:pPr>
         <w:pStyle w:val="Heading3"/>
@@ -3811,7 +3811,7 @@
         </w:rPr>
         <w:t xml:space="preserve"> </w:t>
       </w:r>
-      <w:hyperlink r:id="rId80">
+      <w:hyperlink r:id="rId69">
         <w:r>
           <w:rPr>
             <w:rStyle w:val="Hyperlink"/>
@@ -3944,8 +3944,8 @@
         <w:t xml:space="preserve">  urn:bbf:yang:&lt;module-name&gt;</w:t>
       </w:r>
     </w:p>
-    <w:bookmarkEnd w:id="81"/>
-    <w:bookmarkStart w:id="83" w:name="sec:ietf-10-prefixes---imported-modules"/>
+    <w:bookmarkEnd w:id="70"/>
+    <w:bookmarkStart w:id="72" w:name="sec:ietf-10-prefixes---imported-modules"/>
     <w:p>
       <w:pPr>
         <w:pStyle w:val="Heading3"/>
@@ -3972,7 +3972,7 @@
         </w:rPr>
         <w:t xml:space="preserve"> </w:t>
       </w:r>
-      <w:hyperlink r:id="rId82">
+      <w:hyperlink r:id="rId71">
         <w:r>
           <w:rPr>
             <w:rStyle w:val="Hyperlink"/>
@@ -4143,8 +4143,8 @@
         <w:t xml:space="preserve">    ...</w:t>
       </w:r>
     </w:p>
-    <w:bookmarkEnd w:id="83"/>
-    <w:bookmarkStart w:id="85" w:name="sec:ietf-11-prefixes---usage"/>
+    <w:bookmarkEnd w:id="72"/>
+    <w:bookmarkStart w:id="74" w:name="sec:ietf-11-prefixes---usage"/>
     <w:p>
       <w:pPr>
         <w:pStyle w:val="Heading3"/>
@@ -4171,7 +4171,7 @@
         </w:rPr>
         <w:t xml:space="preserve"> </w:t>
       </w:r>
-      <w:hyperlink r:id="rId82">
+      <w:hyperlink r:id="rId71">
         <w:r>
           <w:rPr>
             <w:rStyle w:val="Hyperlink"/>
@@ -4242,7 +4242,7 @@
       <w:r>
         <w:t xml:space="preserve"> </w:t>
       </w:r>
-      <w:hyperlink r:id="rId84">
+      <w:hyperlink r:id="rId73">
         <w:r>
           <w:rPr>
             <w:rStyle w:val="Hyperlink"/>
@@ -4295,8 +4295,8 @@
         <w:t xml:space="preserve">The local module prefix MAY be used for references to typedefs, groupings, extensions, features and identities defined in the module.</w:t>
       </w:r>
     </w:p>
-    <w:bookmarkEnd w:id="85"/>
-    <w:bookmarkStart w:id="87" w:name="X80044f5d3c8e8feac203f759e305a26d3483c81"/>
+    <w:bookmarkEnd w:id="74"/>
+    <w:bookmarkStart w:id="76" w:name="X80044f5d3c8e8feac203f759e305a26d3483c81"/>
     <w:p>
       <w:pPr>
         <w:pStyle w:val="Heading3"/>
@@ -4323,7 +4323,7 @@
         </w:rPr>
         <w:t xml:space="preserve"> </w:t>
       </w:r>
-      <w:hyperlink r:id="rId86">
+      <w:hyperlink r:id="rId75">
         <w:r>
           <w:rPr>
             <w:rStyle w:val="Hyperlink"/>
@@ -4428,8 +4428,8 @@
         <w:t xml:space="preserve">Identifiers SHOULD include complete words and/or well-known acronyms or abbreviations. There are some exceptions to this for performance reasons. See BBF-5 for further guidelines.</w:t>
       </w:r>
     </w:p>
-    <w:bookmarkEnd w:id="87"/>
-    <w:bookmarkStart w:id="89" w:name="sec:ietf-13-conditional-statements"/>
+    <w:bookmarkEnd w:id="76"/>
+    <w:bookmarkStart w:id="78" w:name="sec:ietf-13-conditional-statements"/>
     <w:p>
       <w:pPr>
         <w:pStyle w:val="Heading3"/>
@@ -4456,7 +4456,7 @@
         </w:rPr>
         <w:t xml:space="preserve"> </w:t>
       </w:r>
-      <w:hyperlink r:id="rId88">
+      <w:hyperlink r:id="rId77">
         <w:r>
           <w:rPr>
             <w:rStyle w:val="Hyperlink"/>
@@ -4537,8 +4537,8 @@
         <w:t xml:space="preserve">statement to constrain data based on other data nodes. At a minimum, the description should be used to convey a constraint which cannot be modeled.</w:t>
       </w:r>
     </w:p>
-    <w:bookmarkEnd w:id="89"/>
-    <w:bookmarkStart w:id="91" w:name="X7c516396929950e7009e7b01428c60f37f5e66f"/>
+    <w:bookmarkEnd w:id="78"/>
+    <w:bookmarkStart w:id="80" w:name="X7c516396929950e7009e7b01428c60f37f5e66f"/>
     <w:p>
       <w:pPr>
         <w:pStyle w:val="Heading3"/>
@@ -4565,7 +4565,7 @@
         </w:rPr>
         <w:t xml:space="preserve"> </w:t>
       </w:r>
-      <w:hyperlink r:id="rId90">
+      <w:hyperlink r:id="rId79">
         <w:r>
           <w:rPr>
             <w:rStyle w:val="Hyperlink"/>
@@ -4678,8 +4678,8 @@
         <w:t xml:space="preserve">statements to each augment.</w:t>
       </w:r>
     </w:p>
-    <w:bookmarkEnd w:id="91"/>
-    <w:bookmarkStart w:id="93" w:name="Xd2cf503170de8fa411d07213b3f484e448ff459"/>
+    <w:bookmarkEnd w:id="80"/>
+    <w:bookmarkStart w:id="82" w:name="Xd2cf503170de8fa411d07213b3f484e448ff459"/>
     <w:p>
       <w:pPr>
         <w:pStyle w:val="Heading3"/>
@@ -4706,7 +4706,7 @@
         </w:rPr>
         <w:t xml:space="preserve"> </w:t>
       </w:r>
-      <w:hyperlink r:id="rId92">
+      <w:hyperlink r:id="rId81">
         <w:r>
           <w:rPr>
             <w:rStyle w:val="Hyperlink"/>
@@ -4810,8 +4810,8 @@
         <w:t xml:space="preserve">on import and include statements.</w:t>
       </w:r>
     </w:p>
-    <w:bookmarkEnd w:id="93"/>
-    <w:bookmarkStart w:id="95" w:name="X780f7a06219eafeb084776145b6d63da678cf9a"/>
+    <w:bookmarkEnd w:id="82"/>
+    <w:bookmarkStart w:id="84" w:name="X780f7a06219eafeb084776145b6d63da678cf9a"/>
     <w:p>
       <w:pPr>
         <w:pStyle w:val="Heading3"/>
@@ -4838,7 +4838,7 @@
         </w:rPr>
         <w:t xml:space="preserve"> </w:t>
       </w:r>
-      <w:hyperlink r:id="rId94">
+      <w:hyperlink r:id="rId83">
         <w:r>
           <w:rPr>
             <w:rStyle w:val="Hyperlink"/>
@@ -4895,8 +4895,8 @@
         <w:t xml:space="preserve">BBF YANG modules MUST be written using only printable ASCII characters.</w:t>
       </w:r>
     </w:p>
-    <w:bookmarkEnd w:id="95"/>
-    <w:bookmarkStart w:id="96" w:name="X7c19e059167da67820f4fb7766b40deca1bc898"/>
+    <w:bookmarkEnd w:id="84"/>
+    <w:bookmarkStart w:id="85" w:name="X7c19e059167da67820f4fb7766b40deca1bc898"/>
     <w:p>
       <w:pPr>
         <w:pStyle w:val="Heading3"/>
@@ -4935,7 +4935,7 @@
         </w:rPr>
         <w:t xml:space="preserve"> </w:t>
       </w:r>
-      <w:hyperlink r:id="rId82">
+      <w:hyperlink r:id="rId71">
         <w:r>
           <w:rPr>
             <w:rStyle w:val="Hyperlink"/>
@@ -5101,8 +5101,8 @@
         <w:t xml:space="preserve">    ...</w:t>
       </w:r>
     </w:p>
-    <w:bookmarkEnd w:id="96"/>
-    <w:bookmarkStart w:id="98" w:name="Xcbd829666661b195829cbb3bb38c2991255df6e"/>
+    <w:bookmarkEnd w:id="85"/>
+    <w:bookmarkStart w:id="87" w:name="Xcbd829666661b195829cbb3bb38c2991255df6e"/>
     <w:p>
       <w:pPr>
         <w:pStyle w:val="Heading3"/>
@@ -5153,7 +5153,7 @@
         </w:rPr>
         <w:t xml:space="preserve"> </w:t>
       </w:r>
-      <w:hyperlink r:id="rId97">
+      <w:hyperlink r:id="rId86">
         <w:r>
           <w:rPr>
             <w:rStyle w:val="Hyperlink"/>
@@ -5234,8 +5234,8 @@
         <w:t xml:space="preserve">statements in configuration data nodes for proper communication of the constraint validation failure.</w:t>
       </w:r>
     </w:p>
-    <w:bookmarkEnd w:id="98"/>
-    <w:bookmarkStart w:id="100" w:name="X80921fc05d606ee502d97a8f594d3fc1e4af16c"/>
+    <w:bookmarkEnd w:id="87"/>
+    <w:bookmarkStart w:id="89" w:name="X80921fc05d606ee502d97a8f594d3fc1e4af16c"/>
     <w:p>
       <w:pPr>
         <w:pStyle w:val="Heading3"/>
@@ -5286,7 +5286,7 @@
         </w:rPr>
         <w:t xml:space="preserve"> </w:t>
       </w:r>
-      <w:hyperlink r:id="rId99">
+      <w:hyperlink r:id="rId88">
         <w:r>
           <w:rPr>
             <w:rStyle w:val="Hyperlink"/>
@@ -5367,8 +5367,8 @@
         <w:t xml:space="preserve">condition in easy to understand language.</w:t>
       </w:r>
     </w:p>
-    <w:bookmarkEnd w:id="100"/>
-    <w:bookmarkStart w:id="101" w:name="sec:ietf-20-tabs-and-spacing"/>
+    <w:bookmarkEnd w:id="89"/>
+    <w:bookmarkStart w:id="90" w:name="sec:ietf-20-tabs-and-spacing"/>
     <w:p>
       <w:pPr>
         <w:pStyle w:val="Heading3"/>
@@ -5395,7 +5395,7 @@
         </w:rPr>
         <w:t xml:space="preserve"> </w:t>
       </w:r>
-      <w:hyperlink r:id="rId68">
+      <w:hyperlink r:id="rId57">
         <w:r>
           <w:rPr>
             <w:rStyle w:val="Hyperlink"/>
@@ -5452,8 +5452,8 @@
         <w:t xml:space="preserve">BBF YANG modules MUST NOT contain any tab characters and MUST use 2 space characters for indentation.</w:t>
       </w:r>
     </w:p>
-    <w:bookmarkEnd w:id="101"/>
-    <w:bookmarkStart w:id="103" w:name="sec:ietf-21-normative-language"/>
+    <w:bookmarkEnd w:id="90"/>
+    <w:bookmarkStart w:id="92" w:name="sec:ietf-21-normative-language"/>
     <w:p>
       <w:pPr>
         <w:pStyle w:val="Heading3"/>
@@ -5480,7 +5480,7 @@
         </w:rPr>
         <w:t xml:space="preserve"> </w:t>
       </w:r>
-      <w:hyperlink r:id="rId102">
+      <w:hyperlink r:id="rId91">
         <w:r>
           <w:rPr>
             <w:rStyle w:val="Hyperlink"/>
@@ -5576,8 +5576,8 @@
         <w:t xml:space="preserve">This does not apply to the license text included as part of each top-level module description.</w:t>
       </w:r>
     </w:p>
-    <w:bookmarkEnd w:id="103"/>
-    <w:bookmarkStart w:id="105" w:name="sec:ietf-22-leafref-path-in-a-grouping"/>
+    <w:bookmarkEnd w:id="92"/>
+    <w:bookmarkStart w:id="94" w:name="sec:ietf-22-leafref-path-in-a-grouping"/>
     <w:p>
       <w:pPr>
         <w:pStyle w:val="Heading3"/>
@@ -5622,7 +5622,7 @@
         </w:rPr>
         <w:t xml:space="preserve"> </w:t>
       </w:r>
-      <w:hyperlink r:id="rId104">
+      <w:hyperlink r:id="rId93">
         <w:r>
           <w:rPr>
             <w:rStyle w:val="Hyperlink"/>
@@ -6098,8 +6098,8 @@
         <w:t xml:space="preserve">}</w:t>
       </w:r>
     </w:p>
-    <w:bookmarkEnd w:id="105"/>
-    <w:bookmarkStart w:id="106" w:name="sec:ietf-23-prefix-naming-conventions"/>
+    <w:bookmarkEnd w:id="94"/>
+    <w:bookmarkStart w:id="95" w:name="sec:ietf-23-prefix-naming-conventions"/>
     <w:p>
       <w:pPr>
         <w:pStyle w:val="Heading3"/>
@@ -6126,7 +6126,7 @@
         </w:rPr>
         <w:t xml:space="preserve"> </w:t>
       </w:r>
-      <w:hyperlink r:id="rId82">
+      <w:hyperlink r:id="rId71">
         <w:r>
           <w:rPr>
             <w:rStyle w:val="Hyperlink"/>
@@ -6204,15 +6204,732 @@
         <w:t xml:space="preserve">in the module bbf-yang-types.</w:t>
       </w:r>
     </w:p>
+    <w:bookmarkEnd w:id="95"/>
+    <w:bookmarkEnd w:id="96"/>
+    <w:bookmarkStart w:id="139" w:name="sec:bbf-yang-guidelines"/>
+    <w:p>
+      <w:pPr>
+        <w:pStyle w:val="Heading2"/>
+      </w:pPr>
+      <w:r>
+        <w:t xml:space="preserve">BBF YANG Guidelines</w:t>
+      </w:r>
+    </w:p>
+    <w:p>
+      <w:pPr>
+        <w:pStyle w:val="FirstParagraph"/>
+      </w:pPr>
+      <w:r>
+        <w:t xml:space="preserve">This section adds BBF-specific guidelines that go beyond the scope of the IETF</w:t>
+      </w:r>
+      <w:r>
+        <w:t xml:space="preserve"> </w:t>
+      </w:r>
+      <w:r>
+        <w:t xml:space="preserve">YANG Guidelines.</w:t>
+      </w:r>
+    </w:p>
+    <w:bookmarkStart w:id="97" w:name="sec:bbf-1-use-of-ianaietf-yang-modules"/>
+    <w:p>
+      <w:pPr>
+        <w:pStyle w:val="Heading3"/>
+      </w:pPr>
+      <w:r>
+        <w:t xml:space="preserve">BBF-1: Use of IANA/IETF YANG Modules</w:t>
+      </w:r>
+    </w:p>
+    <w:p>
+      <w:pPr>
+        <w:pStyle w:val="FirstParagraph"/>
+      </w:pPr>
+      <w:r>
+        <w:t xml:space="preserve">BBF YANG modules MUST use standard IANA/IETF YANG modules whenever possible. In</w:t>
+      </w:r>
+      <w:r>
+        <w:t xml:space="preserve"> </w:t>
+      </w:r>
+      <w:r>
+        <w:t xml:space="preserve">this context,</w:t>
+      </w:r>
+      <w:r>
+        <w:t xml:space="preserve"> </w:t>
+      </w:r>
+      <w:r>
+        <w:t xml:space="preserve">“use”</w:t>
+      </w:r>
+      <w:r>
+        <w:t xml:space="preserve"> </w:t>
+      </w:r>
+      <w:r>
+        <w:t xml:space="preserve">implies adherence to the letter and spirit of such modules</w:t>
+      </w:r>
+      <w:r>
+        <w:t xml:space="preserve"> </w:t>
+      </w:r>
+      <w:r>
+        <w:t xml:space="preserve">and of their defining RFCs.</w:t>
+      </w:r>
+    </w:p>
+    <w:p>
+      <w:pPr>
+        <w:pStyle w:val="BodyText"/>
+      </w:pPr>
+      <w:r>
+        <w:t xml:space="preserve">Individual Working Text documents MUST reference the standard models which</w:t>
+      </w:r>
+      <w:r>
+        <w:t xml:space="preserve"> </w:t>
+      </w:r>
+      <w:r>
+        <w:t xml:space="preserve">are applicable.</w:t>
+      </w:r>
+    </w:p>
+    <w:bookmarkEnd w:id="97"/>
+    <w:bookmarkStart w:id="98" w:name="sec:bbf-2-line-length"/>
+    <w:p>
+      <w:pPr>
+        <w:pStyle w:val="Heading3"/>
+      </w:pPr>
+      <w:r>
+        <w:t xml:space="preserve">BBF-2: Line Length</w:t>
+      </w:r>
+    </w:p>
+    <w:p>
+      <w:pPr>
+        <w:pStyle w:val="FirstParagraph"/>
+      </w:pPr>
+      <w:r>
+        <w:t xml:space="preserve">The length of each line of text in a YANG module MUST not exceed 70 characters.</w:t>
+      </w:r>
+    </w:p>
+    <w:bookmarkEnd w:id="98"/>
+    <w:bookmarkStart w:id="99" w:name="sec:bbf-3-deviations"/>
+    <w:p>
+      <w:pPr>
+        <w:pStyle w:val="Heading3"/>
+      </w:pPr>
+      <w:r>
+        <w:t xml:space="preserve">BBF-3: Deviations</w:t>
+      </w:r>
+    </w:p>
+    <w:p>
+      <w:pPr>
+        <w:pStyle w:val="FirstParagraph"/>
+      </w:pPr>
+      <w:r>
+        <w:t xml:space="preserve">Deviations MUST NOT be used in BBF YANG modules.</w:t>
+      </w:r>
+    </w:p>
+    <w:p>
+      <w:pPr>
+        <w:pStyle w:val="BodyText"/>
+      </w:pPr>
+      <w:r>
+        <w:t xml:space="preserve">However, deviations can be used alongside BBF YANG modules as described in the section BBF Deviation Guidelines.</w:t>
+      </w:r>
+    </w:p>
+    <w:bookmarkEnd w:id="99"/>
+    <w:bookmarkStart w:id="100" w:name="sec:bbf-4-short-names"/>
+    <w:p>
+      <w:pPr>
+        <w:pStyle w:val="Heading3"/>
+      </w:pPr>
+      <w:r>
+        <w:t xml:space="preserve">BBF-4: Short Names</w:t>
+      </w:r>
+    </w:p>
+    <w:p>
+      <w:pPr>
+        <w:pStyle w:val="FirstParagraph"/>
+      </w:pPr>
+      <w:r>
+        <w:t xml:space="preserve">Lists and leaf-lists may have many elements resulting in large amounts of data present on the line. For XML encoding, the name of each node appears twice for every element of the list or leaf-list. Although IETF-12 states that identifiers SHOULD include complete words, the expedient use of short names SHOULD be imposed to shorten on-the-wire messaging and improve efficiency.</w:t>
+      </w:r>
+    </w:p>
+    <w:bookmarkEnd w:id="100"/>
+    <w:bookmarkStart w:id="101" w:name="sec:bbf-5-descriptions-and-references"/>
+    <w:p>
+      <w:pPr>
+        <w:pStyle w:val="Heading3"/>
+      </w:pPr>
+      <w:r>
+        <w:t xml:space="preserve">BBF-5: Descriptions and References</w:t>
+      </w:r>
+    </w:p>
+    <w:p>
+      <w:pPr>
+        <w:pStyle w:val="FirstParagraph"/>
+      </w:pPr>
+      <w:r>
+        <w:t xml:space="preserve">All descriptions MUST read as sentences or sentence fragments containing proper capitalization and punctuation, e.g., ending with periods. However,</w:t>
+      </w:r>
+      <w:r>
+        <w:t xml:space="preserve"> </w:t>
+      </w:r>
+      <w:hyperlink w:anchor="sec:bbf-25-reference-statements">
+        <w:r>
+          <w:rPr>
+            <w:rStyle w:val="Hyperlink"/>
+          </w:rPr>
+          <w:t xml:space="preserve">reference statements</w:t>
+        </w:r>
+      </w:hyperlink>
+      <w:r>
+        <w:t xml:space="preserve"> </w:t>
+      </w:r>
+      <w:r>
+        <w:t xml:space="preserve">need not meet this requirement and do not need to terminate with a period.</w:t>
+      </w:r>
+    </w:p>
+    <w:bookmarkEnd w:id="101"/>
+    <w:bookmarkStart w:id="102" w:name="sec:bbf-6-special-values"/>
+    <w:p>
+      <w:pPr>
+        <w:pStyle w:val="Heading3"/>
+      </w:pPr>
+      <w:r>
+        <w:t xml:space="preserve">BBF-6: Special Values</w:t>
+      </w:r>
+    </w:p>
+    <w:p>
+      <w:pPr>
+        <w:pStyle w:val="FirstParagraph"/>
+      </w:pPr>
+      <w:r>
+        <w:t xml:space="preserve">Special values SHOULD be parameterized in an enumeration as part of a union with the normal values.</w:t>
+      </w:r>
+    </w:p>
+    <w:p>
+      <w:pPr>
+        <w:pStyle w:val="BodyText"/>
+      </w:pPr>
+      <w:r>
+        <w:t xml:space="preserve">Enumerations SHOULD NOT be used in cases where a special value means</w:t>
+      </w:r>
+      <w:r>
+        <w:t xml:space="preserve"> </w:t>
+      </w:r>
+      <w:r>
+        <w:t xml:space="preserve">“XXX or less”</w:t>
+      </w:r>
+      <w:r>
+        <w:t xml:space="preserve"> </w:t>
+      </w:r>
+      <w:r>
+        <w:t xml:space="preserve">or</w:t>
+      </w:r>
+      <w:r>
+        <w:t xml:space="preserve"> </w:t>
+      </w:r>
+      <w:r>
+        <w:t xml:space="preserve">“YYY or more”</w:t>
+      </w:r>
+      <w:r>
+        <w:t xml:space="preserve">.</w:t>
+      </w:r>
+    </w:p>
+    <w:p>
+      <w:pPr>
+        <w:pStyle w:val="BodyText"/>
+      </w:pPr>
+      <w:r>
+        <w:t xml:space="preserve">Example:</w:t>
+      </w:r>
+    </w:p>
+    <w:p>
+      <w:pPr>
+        <w:pStyle w:val="SourceCode"/>
+      </w:pPr>
+      <w:r>
+        <w:rPr>
+          <w:rStyle w:val="VerbatimChar"/>
+        </w:rPr>
+        <w:t xml:space="preserve">  typedef snr-margin {</w:t>
+      </w:r>
+      <w:r>
+        <w:br/>
+      </w:r>
+      <w:r>
+        <w:rPr>
+          <w:rStyle w:val="VerbatimChar"/>
+        </w:rPr>
+        <w:t xml:space="preserve">    type union {</w:t>
+      </w:r>
+      <w:r>
+        <w:br/>
+      </w:r>
+      <w:r>
+        <w:rPr>
+          <w:rStyle w:val="VerbatimChar"/>
+        </w:rPr>
+        <w:t xml:space="preserve">      type enumeration {</w:t>
+      </w:r>
+      <w:r>
+        <w:br/>
+      </w:r>
+      <w:r>
+        <w:rPr>
+          <w:rStyle w:val="VerbatimChar"/>
+        </w:rPr>
+        <w:t xml:space="preserve">        enum "undetermined" {</w:t>
+      </w:r>
+      <w:r>
+        <w:br/>
+      </w:r>
+      <w:r>
+        <w:rPr>
+          <w:rStyle w:val="VerbatimChar"/>
+        </w:rPr>
+        <w:t xml:space="preserve">          description</w:t>
+      </w:r>
+      <w:r>
+        <w:br/>
+      </w:r>
+      <w:r>
+        <w:rPr>
+          <w:rStyle w:val="VerbatimChar"/>
+        </w:rPr>
+        <w:t xml:space="preserve">            "Indicates the value is not determined.";</w:t>
+      </w:r>
+      <w:r>
+        <w:br/>
+      </w:r>
+      <w:r>
+        <w:rPr>
+          <w:rStyle w:val="VerbatimChar"/>
+        </w:rPr>
+        <w:t xml:space="preserve">        }</w:t>
+      </w:r>
+      <w:r>
+        <w:br/>
+      </w:r>
+      <w:r>
+        <w:rPr>
+          <w:rStyle w:val="VerbatimChar"/>
+        </w:rPr>
+        <w:t xml:space="preserve">      }</w:t>
+      </w:r>
+      <w:r>
+        <w:br/>
+      </w:r>
+      <w:r>
+        <w:rPr>
+          <w:rStyle w:val="VerbatimChar"/>
+        </w:rPr>
+        <w:t xml:space="preserve">      type int16 {</w:t>
+      </w:r>
+      <w:r>
+        <w:br/>
+      </w:r>
+      <w:r>
+        <w:rPr>
+          <w:rStyle w:val="VerbatimChar"/>
+        </w:rPr>
+        <w:t xml:space="preserve">        range "-511..511";</w:t>
+      </w:r>
+      <w:r>
+        <w:br/>
+      </w:r>
+      <w:r>
+        <w:rPr>
+          <w:rStyle w:val="VerbatimChar"/>
+        </w:rPr>
+        <w:t xml:space="preserve">      }</w:t>
+      </w:r>
+      <w:r>
+        <w:br/>
+      </w:r>
+      <w:r>
+        <w:rPr>
+          <w:rStyle w:val="VerbatimChar"/>
+        </w:rPr>
+        <w:t xml:space="preserve">    }</w:t>
+      </w:r>
+      <w:r>
+        <w:br/>
+      </w:r>
+      <w:r>
+        <w:rPr>
+          <w:rStyle w:val="VerbatimChar"/>
+        </w:rPr>
+        <w:t xml:space="preserve">    description</w:t>
+      </w:r>
+      <w:r>
+        <w:br/>
+      </w:r>
+      <w:r>
+        <w:rPr>
+          <w:rStyle w:val="VerbatimChar"/>
+        </w:rPr>
+        <w:t xml:space="preserve">      "Reports the signal-to-noise ratio margin. A first special value</w:t>
+      </w:r>
+      <w:r>
+        <w:br/>
+      </w:r>
+      <w:r>
+        <w:rPr>
+          <w:rStyle w:val="VerbatimChar"/>
+        </w:rPr>
+        <w:t xml:space="preserve">       (undetermined) indicates that the signal-to-noise ratio margin</w:t>
+      </w:r>
+      <w:r>
+        <w:br/>
+      </w:r>
+      <w:r>
+        <w:rPr>
+          <w:rStyle w:val="VerbatimChar"/>
+        </w:rPr>
+        <w:t xml:space="preserve">       is undetermined. A second special value (-511) indicates that</w:t>
+      </w:r>
+      <w:r>
+        <w:br/>
+      </w:r>
+      <w:r>
+        <w:rPr>
+          <w:rStyle w:val="VerbatimChar"/>
+        </w:rPr>
+        <w:t xml:space="preserve">       the signal-to-noise ratio margin is less than or equal to -51.1</w:t>
+      </w:r>
+      <w:r>
+        <w:br/>
+      </w:r>
+      <w:r>
+        <w:rPr>
+          <w:rStyle w:val="VerbatimChar"/>
+        </w:rPr>
+        <w:t xml:space="preserve">       dB. A third special value (+511) indicates that the</w:t>
+      </w:r>
+      <w:r>
+        <w:br/>
+      </w:r>
+      <w:r>
+        <w:rPr>
+          <w:rStyle w:val="VerbatimChar"/>
+        </w:rPr>
+        <w:t xml:space="preserve">       signal-to-noise ratio margin is greater than or equal to</w:t>
+      </w:r>
+      <w:r>
+        <w:br/>
+      </w:r>
+      <w:r>
+        <w:rPr>
+          <w:rStyle w:val="VerbatimChar"/>
+        </w:rPr>
+        <w:t xml:space="preserve">       +51.1dB.";</w:t>
+      </w:r>
+    </w:p>
+    <w:p>
+      <w:pPr>
+        <w:pStyle w:val="FirstParagraph"/>
+      </w:pPr>
+      <w:r>
+        <w:t xml:space="preserve">In the above example, -511 refers to a value less than or equal to -51.1; +511 refers to a value greater than or equal to +51.1 and the enum</w:t>
+      </w:r>
+      <w:r>
+        <w:t xml:space="preserve"> </w:t>
+      </w:r>
+      <w:r>
+        <w:t xml:space="preserve">“undetermined”</w:t>
+      </w:r>
+      <w:r>
+        <w:t xml:space="preserve"> </w:t>
+      </w:r>
+      <w:r>
+        <w:t xml:space="preserve">refers to a value which is undetermined.</w:t>
+      </w:r>
+    </w:p>
+    <w:bookmarkEnd w:id="102"/>
+    <w:bookmarkStart w:id="103" w:name="Xbd0877fc21f18b9e0b42c79cdcd23a12ea24acb"/>
+    <w:p>
+      <w:pPr>
+        <w:pStyle w:val="Heading3"/>
+      </w:pPr>
+      <w:r>
+        <w:t xml:space="preserve">BBF-7: Paragraph Separation in Description Statements</w:t>
+      </w:r>
+    </w:p>
+    <w:p>
+      <w:pPr>
+        <w:pStyle w:val="FirstParagraph"/>
+      </w:pPr>
+      <w:r>
+        <w:t xml:space="preserve">For description statements which contain multiple paragraphs, each paragraph SHOULD be separated using a blank line.</w:t>
+      </w:r>
+    </w:p>
+    <w:p>
+      <w:pPr>
+        <w:pStyle w:val="BodyText"/>
+      </w:pPr>
+      <w:r>
+        <w:t xml:space="preserve">Example:</w:t>
+      </w:r>
+    </w:p>
+    <w:p>
+      <w:pPr>
+        <w:pStyle w:val="SourceCode"/>
+      </w:pPr>
+      <w:r>
+        <w:rPr>
+          <w:rStyle w:val="VerbatimChar"/>
+        </w:rPr>
+        <w:t xml:space="preserve">  description</w:t>
+      </w:r>
+      <w:r>
+        <w:br/>
+      </w:r>
+      <w:r>
+        <w:rPr>
+          <w:rStyle w:val="VerbatimChar"/>
+        </w:rPr>
+        <w:t xml:space="preserve">    "This is the first paragraph of the description.</w:t>
+      </w:r>
+      <w:r>
+        <w:br/>
+      </w:r>
+      <w:r>
+        <w:br/>
+      </w:r>
+      <w:r>
+        <w:rPr>
+          <w:rStyle w:val="VerbatimChar"/>
+        </w:rPr>
+        <w:t xml:space="preserve">     This is the second paragraph of the description.";</w:t>
+      </w:r>
+    </w:p>
+    <w:bookmarkEnd w:id="103"/>
+    <w:bookmarkStart w:id="104" w:name="sec:bbf-8-revision-statements"/>
+    <w:p>
+      <w:pPr>
+        <w:pStyle w:val="Heading3"/>
+      </w:pPr>
+      <w:r>
+        <w:t xml:space="preserve">BBF-8: Revision Statements</w:t>
+      </w:r>
+    </w:p>
+    <w:p>
+      <w:pPr>
+        <w:pStyle w:val="FirstParagraph"/>
+      </w:pPr>
+      <w:r>
+        <w:t xml:space="preserve">Superseded by BBF-15.</w:t>
+      </w:r>
+    </w:p>
+    <w:bookmarkEnd w:id="104"/>
+    <w:bookmarkStart w:id="105" w:name="sec:bbf-9-explicit-modeling"/>
+    <w:p>
+      <w:pPr>
+        <w:pStyle w:val="Heading3"/>
+      </w:pPr>
+      <w:r>
+        <w:t xml:space="preserve">BBF-9: Explicit Modeling</w:t>
+      </w:r>
+    </w:p>
+    <w:p>
+      <w:pPr>
+        <w:pStyle w:val="FirstParagraph"/>
+      </w:pPr>
+      <w:r>
+        <w:t xml:space="preserve">Where YANG allows something or some behavior to be explicitly modeled (e.g., enumerations, range, units, must, etc.) then this SHOULD always be done. Mandatory requirements in descriptions SHOULD be used only where it is not possible or practical to use formal YANG modeling to convey the requirement.</w:t>
+      </w:r>
+    </w:p>
+    <w:p>
+      <w:pPr>
+        <w:pStyle w:val="BodyText"/>
+      </w:pPr>
+      <w:r>
+        <w:t xml:space="preserve">Example:</w:t>
+      </w:r>
+    </w:p>
+    <w:p>
+      <w:pPr>
+        <w:pStyle w:val="SourceCode"/>
+      </w:pPr>
+      <w:r>
+        <w:rPr>
+          <w:rStyle w:val="VerbatimChar"/>
+        </w:rPr>
+        <w:t xml:space="preserve">  leaf forwarder {</w:t>
+      </w:r>
+      <w:r>
+        <w:br/>
+      </w:r>
+      <w:r>
+        <w:rPr>
+          <w:rStyle w:val="VerbatimChar"/>
+        </w:rPr>
+        <w:t xml:space="preserve">    type bbf-l2-fwd:forwarder-ref;</w:t>
+      </w:r>
+      <w:r>
+        <w:br/>
+      </w:r>
+      <w:r>
+        <w:rPr>
+          <w:rStyle w:val="VerbatimChar"/>
+        </w:rPr>
+        <w:t xml:space="preserve">    description</w:t>
+      </w:r>
+      <w:r>
+        <w:br/>
+      </w:r>
+      <w:r>
+        <w:rPr>
+          <w:rStyle w:val="VerbatimChar"/>
+        </w:rPr>
+        <w:t xml:space="preserve">      "A reference to a forwarder.</w:t>
+      </w:r>
+      <w:r>
+        <w:br/>
+      </w:r>
+      <w:r>
+        <w:br/>
+      </w:r>
+      <w:r>
+        <w:rPr>
+          <w:rStyle w:val="VerbatimChar"/>
+        </w:rPr>
+        <w:t xml:space="preserve">       The following is a constraint that could not be captured in</w:t>
+      </w:r>
+      <w:r>
+        <w:br/>
+      </w:r>
+      <w:r>
+        <w:rPr>
+          <w:rStyle w:val="VerbatimChar"/>
+        </w:rPr>
+        <w:t xml:space="preserve">       YANG: multiple Maintenance Groups referencing the same</w:t>
+      </w:r>
+      <w:r>
+        <w:br/>
+      </w:r>
+      <w:r>
+        <w:rPr>
+          <w:rStyle w:val="VerbatimChar"/>
+        </w:rPr>
+        <w:t xml:space="preserve">       forwarder are allowed, but only if they have a different</w:t>
+      </w:r>
+      <w:r>
+        <w:br/>
+      </w:r>
+      <w:r>
+        <w:rPr>
+          <w:rStyle w:val="VerbatimChar"/>
+        </w:rPr>
+        <w:t xml:space="preserve">       level.</w:t>
+      </w:r>
+      <w:r>
+        <w:br/>
+      </w:r>
+      <w:r>
+        <w:br/>
+      </w:r>
+      <w:r>
+        <w:rPr>
+          <w:rStyle w:val="VerbatimChar"/>
+        </w:rPr>
+        <w:t xml:space="preserve">       Note that there is no BBF requirement for multiple levels</w:t>
+      </w:r>
+      <w:r>
+        <w:br/>
+      </w:r>
+      <w:r>
+        <w:rPr>
+          <w:rStyle w:val="VerbatimChar"/>
+        </w:rPr>
+        <w:t xml:space="preserve">       with up-MEPs. Within BBF context multiple levels on a</w:t>
+      </w:r>
+      <w:r>
+        <w:br/>
+      </w:r>
+      <w:r>
+        <w:rPr>
+          <w:rStyle w:val="VerbatimChar"/>
+        </w:rPr>
+        <w:t xml:space="preserve">       forwarder go together with one level using up-MEPs and a</w:t>
+      </w:r>
+      <w:r>
+        <w:br/>
+      </w:r>
+      <w:r>
+        <w:rPr>
+          <w:rStyle w:val="VerbatimChar"/>
+        </w:rPr>
+        <w:t xml:space="preserve">       higher level using MIPs.";</w:t>
+      </w:r>
+      <w:r>
+        <w:br/>
+      </w:r>
+      <w:r>
+        <w:rPr>
+          <w:rStyle w:val="VerbatimChar"/>
+        </w:rPr>
+        <w:t xml:space="preserve">  }</w:t>
+      </w:r>
+    </w:p>
+    <w:bookmarkEnd w:id="105"/>
+    <w:bookmarkStart w:id="106" w:name="Xc8822cf271b3ba3489c4f60b5f40bba4bb3e20d"/>
+    <w:p>
+      <w:pPr>
+        <w:pStyle w:val="Heading3"/>
+      </w:pPr>
+      <w:r>
+        <w:t xml:space="preserve">BBF-10: Retroactive Application of OD-360 Guidelines</w:t>
+      </w:r>
+    </w:p>
+    <w:p>
+      <w:pPr>
+        <w:pStyle w:val="FirstParagraph"/>
+      </w:pPr>
+      <w:r>
+        <w:t xml:space="preserve">OD-360 guidelines MAY be retroactively applied to published BBF YANG modules but MUST NOT be applied if the resulting change is backward incompatible with the previously published version. For example, an existing node named using an underscore ’_’ instead of a dash</w:t>
+      </w:r>
+      <w:r>
+        <w:t xml:space="preserve"> </w:t>
+      </w:r>
+      <w:r>
+        <w:t xml:space="preserve">‘-’</w:t>
+      </w:r>
+      <w:r>
+        <w:t xml:space="preserve"> </w:t>
+      </w:r>
+      <w:r>
+        <w:t xml:space="preserve">MUST NOT be changed in published module as the resulting renaming is not backward compatible.</w:t>
+      </w:r>
+    </w:p>
     <w:bookmarkEnd w:id="106"/>
+    <w:bookmarkStart w:id="107" w:name="sec:bbf-11-multi-word-identifiers"/>
+    <w:p>
+      <w:pPr>
+        <w:pStyle w:val="Heading3"/>
+      </w:pPr>
+      <w:r>
+        <w:t xml:space="preserve">BBF-11: Multi-word Identifiers</w:t>
+      </w:r>
+    </w:p>
+    <w:p>
+      <w:pPr>
+        <w:pStyle w:val="FirstParagraph"/>
+      </w:pPr>
+      <w:r>
+        <w:t xml:space="preserve">YANG identifiers which represent multiple words, e.g., target margin, SHOULD use a dash between the normally whitespace separated words, e.g.,</w:t>
+      </w:r>
+      <w:r>
+        <w:t xml:space="preserve"> </w:t>
+      </w:r>
+      <w:r>
+        <w:t xml:space="preserve">‘target-margin’</w:t>
+      </w:r>
+      <w:r>
+        <w:t xml:space="preserve">.</w:t>
+      </w:r>
+    </w:p>
     <w:bookmarkEnd w:id="107"/>
-    <w:bookmarkStart w:id="150" w:name="sec:bbf-yang-guidelines"/>
-    <w:p>
-      <w:pPr>
-        <w:pStyle w:val="Heading2"/>
-      </w:pPr>
-      <w:r>
-        <w:t xml:space="preserve">BBF YANG Guidelines</w:t>
+    <w:bookmarkStart w:id="108" w:name="X967a2fedd362844d661e2a0b6a18bc64ee49eef"/>
+    <w:p>
+      <w:pPr>
+        <w:pStyle w:val="Heading3"/>
+      </w:pPr>
+      <w:r>
+        <w:t xml:space="preserve">BBF-12: Acronyms in Description Statements</w:t>
       </w:r>
     </w:p>
     <w:p>
@@ -6220,22 +6937,90 @@
         <w:pStyle w:val="FirstParagraph"/>
       </w:pPr>
       <w:r>
-        <w:t xml:space="preserve">This section adds BBF-specific guidelines that go beyond the scope of the IETF</w:t>
-      </w:r>
-      <w:r>
-        <w:t xml:space="preserve"> </w:t>
-      </w:r>
-      <w:r>
-        <w:t xml:space="preserve">YANG Guidelines.</w:t>
-      </w:r>
-    </w:p>
-    <w:bookmarkStart w:id="108" w:name="sec:bbf-1-use-of-ianaietf-yang-modules"/>
+        <w:t xml:space="preserve">Acronyms can be used in description statements. However, the first instance of the acronym in a description statement SHOULD have its meaning clearly conveyed.</w:t>
+      </w:r>
+    </w:p>
+    <w:p>
+      <w:pPr>
+        <w:pStyle w:val="BodyText"/>
+      </w:pPr>
+      <w:r>
+        <w:t xml:space="preserve">For example:</w:t>
+      </w:r>
+    </w:p>
+    <w:p>
+      <w:pPr>
+        <w:pStyle w:val="SourceCode"/>
+      </w:pPr>
+      <w:r>
+        <w:rPr>
+          <w:rStyle w:val="VerbatimChar"/>
+        </w:rPr>
+        <w:t xml:space="preserve">  leaf cbs {</w:t>
+      </w:r>
+      <w:r>
+        <w:br/>
+      </w:r>
+      <w:r>
+        <w:rPr>
+          <w:rStyle w:val="VerbatimChar"/>
+        </w:rPr>
+        <w:t xml:space="preserve">    type bbf-qos-plc-tp:burst-size;</w:t>
+      </w:r>
+      <w:r>
+        <w:br/>
+      </w:r>
+      <w:r>
+        <w:rPr>
+          <w:rStyle w:val="VerbatimChar"/>
+        </w:rPr>
+        <w:t xml:space="preserve">    description</w:t>
+      </w:r>
+      <w:r>
+        <w:br/>
+      </w:r>
+      <w:r>
+        <w:rPr>
+          <w:rStyle w:val="VerbatimChar"/>
+        </w:rPr>
+        <w:t xml:space="preserve">      "Committed Burst Size (CBS) defines the amount of traffic</w:t>
+      </w:r>
+      <w:r>
+        <w:br/>
+      </w:r>
+      <w:r>
+        <w:rPr>
+          <w:rStyle w:val="VerbatimChar"/>
+        </w:rPr>
+        <w:t xml:space="preserve">       that can be admitted above the Committed Information Rate</w:t>
+      </w:r>
+      <w:r>
+        <w:br/>
+      </w:r>
+      <w:r>
+        <w:rPr>
+          <w:rStyle w:val="VerbatimChar"/>
+        </w:rPr>
+        <w:t xml:space="preserve">       (CIR) and considered green.";</w:t>
+      </w:r>
+      <w:r>
+        <w:br/>
+      </w:r>
+      <w:r>
+        <w:rPr>
+          <w:rStyle w:val="VerbatimChar"/>
+        </w:rPr>
+        <w:t xml:space="preserve">  }</w:t>
+      </w:r>
+    </w:p>
+    <w:bookmarkEnd w:id="108"/>
+    <w:bookmarkStart w:id="109" w:name="X990ed97808c690fc0c84dc0b1ccdecd491363d3"/>
     <w:p>
       <w:pPr>
         <w:pStyle w:val="Heading3"/>
       </w:pPr>
       <w:r>
-        <w:t xml:space="preserve">BBF-1: Use of IANA/IETF YANG Modules</w:t>
+        <w:t xml:space="preserve">BBF-13: Abbreviations in Description Statements</w:t>
       </w:r>
     </w:p>
     <w:p>
@@ -6243,796 +7028,11 @@
         <w:pStyle w:val="FirstParagraph"/>
       </w:pPr>
       <w:r>
-        <w:t xml:space="preserve">BBF YANG modules MUST use standard IANA/IETF YANG modules whenever possible. In</w:t>
-      </w:r>
-      <w:r>
-        <w:t xml:space="preserve"> </w:t>
-      </w:r>
-      <w:r>
-        <w:t xml:space="preserve">this context,</w:t>
-      </w:r>
-      <w:r>
-        <w:t xml:space="preserve"> </w:t>
-      </w:r>
-      <w:r>
-        <w:t xml:space="preserve">“use”</w:t>
-      </w:r>
-      <w:r>
-        <w:t xml:space="preserve"> </w:t>
-      </w:r>
-      <w:r>
-        <w:t xml:space="preserve">implies adherence to the letter and spirit of such modules</w:t>
-      </w:r>
-      <w:r>
-        <w:t xml:space="preserve"> </w:t>
-      </w:r>
-      <w:r>
-        <w:t xml:space="preserve">and of their defining RFCs.</w:t>
-      </w:r>
-    </w:p>
-    <w:p>
-      <w:pPr>
-        <w:pStyle w:val="BodyText"/>
-      </w:pPr>
-      <w:r>
-        <w:t xml:space="preserve">Individual Working Text documents MUST reference the standard models which</w:t>
-      </w:r>
-      <w:r>
-        <w:t xml:space="preserve"> </w:t>
-      </w:r>
-      <w:r>
-        <w:t xml:space="preserve">are applicable.</w:t>
-      </w:r>
-    </w:p>
-    <w:bookmarkEnd w:id="108"/>
-    <w:bookmarkStart w:id="109" w:name="sec:bbf-2-line-length"/>
-    <w:p>
-      <w:pPr>
-        <w:pStyle w:val="Heading3"/>
-      </w:pPr>
-      <w:r>
-        <w:t xml:space="preserve">BBF-2: Line Length</w:t>
-      </w:r>
-    </w:p>
-    <w:p>
-      <w:pPr>
-        <w:pStyle w:val="FirstParagraph"/>
-      </w:pPr>
-      <w:r>
-        <w:t xml:space="preserve">The length of each line of text in a YANG module MUST not exceed 70 characters.</w:t>
+        <w:t xml:space="preserve">Abbreviations can be used in description statements. However, the first instance of the abbreviation in a description statement SHOULD have its meaning clearly conveyed.</w:t>
       </w:r>
     </w:p>
     <w:bookmarkEnd w:id="109"/>
-    <w:bookmarkStart w:id="110" w:name="sec:bbf-3-deviations"/>
-    <w:p>
-      <w:pPr>
-        <w:pStyle w:val="Heading3"/>
-      </w:pPr>
-      <w:r>
-        <w:t xml:space="preserve">BBF-3: Deviations</w:t>
-      </w:r>
-    </w:p>
-    <w:p>
-      <w:pPr>
-        <w:pStyle w:val="FirstParagraph"/>
-      </w:pPr>
-      <w:r>
-        <w:t xml:space="preserve">Deviations MUST NOT be used in BBF YANG modules.</w:t>
-      </w:r>
-    </w:p>
-    <w:p>
-      <w:pPr>
-        <w:pStyle w:val="BodyText"/>
-      </w:pPr>
-      <w:r>
-        <w:t xml:space="preserve">However, deviations can be used alongside BBF YANG modules as described in the section BBF Deviation Guidelines.</w:t>
-      </w:r>
-    </w:p>
-    <w:bookmarkEnd w:id="110"/>
-    <w:bookmarkStart w:id="111" w:name="sec:bbf-4-short-names"/>
-    <w:p>
-      <w:pPr>
-        <w:pStyle w:val="Heading3"/>
-      </w:pPr>
-      <w:r>
-        <w:t xml:space="preserve">BBF-4: Short Names</w:t>
-      </w:r>
-    </w:p>
-    <w:p>
-      <w:pPr>
-        <w:pStyle w:val="FirstParagraph"/>
-      </w:pPr>
-      <w:r>
-        <w:t xml:space="preserve">Lists and leaf-lists may have many elements resulting in large amounts of data present on the line. For XML encoding, the name of each node appears twice for every element of the list or leaf-list. Although IETF-12 states that identifiers SHOULD include complete words, the expedient use of short names SHOULD be imposed to shorten on-the-wire messaging and improve efficiency.</w:t>
-      </w:r>
-    </w:p>
-    <w:bookmarkEnd w:id="111"/>
-    <w:bookmarkStart w:id="112" w:name="sec:bbf-5-descriptions-and-references"/>
-    <w:p>
-      <w:pPr>
-        <w:pStyle w:val="Heading3"/>
-      </w:pPr>
-      <w:r>
-        <w:t xml:space="preserve">BBF-5: Descriptions and References</w:t>
-      </w:r>
-    </w:p>
-    <w:p>
-      <w:pPr>
-        <w:pStyle w:val="FirstParagraph"/>
-      </w:pPr>
-      <w:r>
-        <w:t xml:space="preserve">All descriptions MUST read as sentences or sentence fragments containing proper capitalization and punctuation, e.g., ending with periods. However,</w:t>
-      </w:r>
-      <w:r>
-        <w:t xml:space="preserve"> </w:t>
-      </w:r>
-      <w:hyperlink w:anchor="sec:bbf-25-reference-statements">
-        <w:r>
-          <w:rPr>
-            <w:rStyle w:val="Hyperlink"/>
-          </w:rPr>
-          <w:t xml:space="preserve">reference statements</w:t>
-        </w:r>
-      </w:hyperlink>
-      <w:r>
-        <w:t xml:space="preserve"> </w:t>
-      </w:r>
-      <w:r>
-        <w:t xml:space="preserve">need not meet this requirement and do not need to terminate with a period.</w:t>
-      </w:r>
-    </w:p>
-    <w:bookmarkEnd w:id="112"/>
-    <w:bookmarkStart w:id="113" w:name="sec:bbf-6-special-values"/>
-    <w:p>
-      <w:pPr>
-        <w:pStyle w:val="Heading3"/>
-      </w:pPr>
-      <w:r>
-        <w:t xml:space="preserve">BBF-6: Special Values</w:t>
-      </w:r>
-    </w:p>
-    <w:p>
-      <w:pPr>
-        <w:pStyle w:val="FirstParagraph"/>
-      </w:pPr>
-      <w:r>
-        <w:t xml:space="preserve">Special values SHOULD be parameterized in an enumeration as part of a union with the normal values.</w:t>
-      </w:r>
-    </w:p>
-    <w:p>
-      <w:pPr>
-        <w:pStyle w:val="BodyText"/>
-      </w:pPr>
-      <w:r>
-        <w:t xml:space="preserve">Enumerations SHOULD NOT be used in cases where a special value means</w:t>
-      </w:r>
-      <w:r>
-        <w:t xml:space="preserve"> </w:t>
-      </w:r>
-      <w:r>
-        <w:t xml:space="preserve">“XXX or less”</w:t>
-      </w:r>
-      <w:r>
-        <w:t xml:space="preserve"> </w:t>
-      </w:r>
-      <w:r>
-        <w:t xml:space="preserve">or</w:t>
-      </w:r>
-      <w:r>
-        <w:t xml:space="preserve"> </w:t>
-      </w:r>
-      <w:r>
-        <w:t xml:space="preserve">“YYY or more”</w:t>
-      </w:r>
-      <w:r>
-        <w:t xml:space="preserve">.</w:t>
-      </w:r>
-    </w:p>
-    <w:p>
-      <w:pPr>
-        <w:pStyle w:val="BodyText"/>
-      </w:pPr>
-      <w:r>
-        <w:t xml:space="preserve">Example:</w:t>
-      </w:r>
-    </w:p>
-    <w:p>
-      <w:pPr>
-        <w:pStyle w:val="SourceCode"/>
-      </w:pPr>
-      <w:r>
-        <w:rPr>
-          <w:rStyle w:val="VerbatimChar"/>
-        </w:rPr>
-        <w:t xml:space="preserve">  typedef snr-margin {</w:t>
-      </w:r>
-      <w:r>
-        <w:br/>
-      </w:r>
-      <w:r>
-        <w:rPr>
-          <w:rStyle w:val="VerbatimChar"/>
-        </w:rPr>
-        <w:t xml:space="preserve">    type union {</w:t>
-      </w:r>
-      <w:r>
-        <w:br/>
-      </w:r>
-      <w:r>
-        <w:rPr>
-          <w:rStyle w:val="VerbatimChar"/>
-        </w:rPr>
-        <w:t xml:space="preserve">      type enumeration {</w:t>
-      </w:r>
-      <w:r>
-        <w:br/>
-      </w:r>
-      <w:r>
-        <w:rPr>
-          <w:rStyle w:val="VerbatimChar"/>
-        </w:rPr>
-        <w:t xml:space="preserve">        enum "undetermined" {</w:t>
-      </w:r>
-      <w:r>
-        <w:br/>
-      </w:r>
-      <w:r>
-        <w:rPr>
-          <w:rStyle w:val="VerbatimChar"/>
-        </w:rPr>
-        <w:t xml:space="preserve">          description</w:t>
-      </w:r>
-      <w:r>
-        <w:br/>
-      </w:r>
-      <w:r>
-        <w:rPr>
-          <w:rStyle w:val="VerbatimChar"/>
-        </w:rPr>
-        <w:t xml:space="preserve">            "Indicates the value is not determined.";</w:t>
-      </w:r>
-      <w:r>
-        <w:br/>
-      </w:r>
-      <w:r>
-        <w:rPr>
-          <w:rStyle w:val="VerbatimChar"/>
-        </w:rPr>
-        <w:t xml:space="preserve">        }</w:t>
-      </w:r>
-      <w:r>
-        <w:br/>
-      </w:r>
-      <w:r>
-        <w:rPr>
-          <w:rStyle w:val="VerbatimChar"/>
-        </w:rPr>
-        <w:t xml:space="preserve">      }</w:t>
-      </w:r>
-      <w:r>
-        <w:br/>
-      </w:r>
-      <w:r>
-        <w:rPr>
-          <w:rStyle w:val="VerbatimChar"/>
-        </w:rPr>
-        <w:t xml:space="preserve">      type int16 {</w:t>
-      </w:r>
-      <w:r>
-        <w:br/>
-      </w:r>
-      <w:r>
-        <w:rPr>
-          <w:rStyle w:val="VerbatimChar"/>
-        </w:rPr>
-        <w:t xml:space="preserve">        range "-511..511";</w:t>
-      </w:r>
-      <w:r>
-        <w:br/>
-      </w:r>
-      <w:r>
-        <w:rPr>
-          <w:rStyle w:val="VerbatimChar"/>
-        </w:rPr>
-        <w:t xml:space="preserve">      }</w:t>
-      </w:r>
-      <w:r>
-        <w:br/>
-      </w:r>
-      <w:r>
-        <w:rPr>
-          <w:rStyle w:val="VerbatimChar"/>
-        </w:rPr>
-        <w:t xml:space="preserve">    }</w:t>
-      </w:r>
-      <w:r>
-        <w:br/>
-      </w:r>
-      <w:r>
-        <w:rPr>
-          <w:rStyle w:val="VerbatimChar"/>
-        </w:rPr>
-        <w:t xml:space="preserve">    description</w:t>
-      </w:r>
-      <w:r>
-        <w:br/>
-      </w:r>
-      <w:r>
-        <w:rPr>
-          <w:rStyle w:val="VerbatimChar"/>
-        </w:rPr>
-        <w:t xml:space="preserve">      "Reports the signal-to-noise ratio margin. A first special value</w:t>
-      </w:r>
-      <w:r>
-        <w:br/>
-      </w:r>
-      <w:r>
-        <w:rPr>
-          <w:rStyle w:val="VerbatimChar"/>
-        </w:rPr>
-        <w:t xml:space="preserve">       (undetermined) indicates that the signal-to-noise ratio margin</w:t>
-      </w:r>
-      <w:r>
-        <w:br/>
-      </w:r>
-      <w:r>
-        <w:rPr>
-          <w:rStyle w:val="VerbatimChar"/>
-        </w:rPr>
-        <w:t xml:space="preserve">       is undetermined. A second special value (-511) indicates that</w:t>
-      </w:r>
-      <w:r>
-        <w:br/>
-      </w:r>
-      <w:r>
-        <w:rPr>
-          <w:rStyle w:val="VerbatimChar"/>
-        </w:rPr>
-        <w:t xml:space="preserve">       the signal-to-noise ratio margin is less than or equal to -51.1</w:t>
-      </w:r>
-      <w:r>
-        <w:br/>
-      </w:r>
-      <w:r>
-        <w:rPr>
-          <w:rStyle w:val="VerbatimChar"/>
-        </w:rPr>
-        <w:t xml:space="preserve">       dB. A third special value (+511) indicates that the</w:t>
-      </w:r>
-      <w:r>
-        <w:br/>
-      </w:r>
-      <w:r>
-        <w:rPr>
-          <w:rStyle w:val="VerbatimChar"/>
-        </w:rPr>
-        <w:t xml:space="preserve">       signal-to-noise ratio margin is greater than or equal to</w:t>
-      </w:r>
-      <w:r>
-        <w:br/>
-      </w:r>
-      <w:r>
-        <w:rPr>
-          <w:rStyle w:val="VerbatimChar"/>
-        </w:rPr>
-        <w:t xml:space="preserve">       +51.1dB.";</w:t>
-      </w:r>
-    </w:p>
-    <w:p>
-      <w:pPr>
-        <w:pStyle w:val="FirstParagraph"/>
-      </w:pPr>
-      <w:r>
-        <w:t xml:space="preserve">In the above example, -511 refers to a value less than or equal to -51.1; +511 refers to a value greater than or equal to +51.1 and the enum</w:t>
-      </w:r>
-      <w:r>
-        <w:t xml:space="preserve"> </w:t>
-      </w:r>
-      <w:r>
-        <w:t xml:space="preserve">“undetermined”</w:t>
-      </w:r>
-      <w:r>
-        <w:t xml:space="preserve"> </w:t>
-      </w:r>
-      <w:r>
-        <w:t xml:space="preserve">refers to a value which is undetermined.</w:t>
-      </w:r>
-    </w:p>
-    <w:bookmarkEnd w:id="113"/>
-    <w:bookmarkStart w:id="114" w:name="Xbd0877fc21f18b9e0b42c79cdcd23a12ea24acb"/>
-    <w:p>
-      <w:pPr>
-        <w:pStyle w:val="Heading3"/>
-      </w:pPr>
-      <w:r>
-        <w:t xml:space="preserve">BBF-7: Paragraph Separation in Description Statements</w:t>
-      </w:r>
-    </w:p>
-    <w:p>
-      <w:pPr>
-        <w:pStyle w:val="FirstParagraph"/>
-      </w:pPr>
-      <w:r>
-        <w:t xml:space="preserve">For description statements which contain multiple paragraphs, each paragraph SHOULD be separated using a blank line.</w:t>
-      </w:r>
-    </w:p>
-    <w:p>
-      <w:pPr>
-        <w:pStyle w:val="BodyText"/>
-      </w:pPr>
-      <w:r>
-        <w:t xml:space="preserve">Example:</w:t>
-      </w:r>
-    </w:p>
-    <w:p>
-      <w:pPr>
-        <w:pStyle w:val="SourceCode"/>
-      </w:pPr>
-      <w:r>
-        <w:rPr>
-          <w:rStyle w:val="VerbatimChar"/>
-        </w:rPr>
-        <w:t xml:space="preserve">  description</w:t>
-      </w:r>
-      <w:r>
-        <w:br/>
-      </w:r>
-      <w:r>
-        <w:rPr>
-          <w:rStyle w:val="VerbatimChar"/>
-        </w:rPr>
-        <w:t xml:space="preserve">    "This is the first paragraph of the description.</w:t>
-      </w:r>
-      <w:r>
-        <w:br/>
-      </w:r>
-      <w:r>
-        <w:br/>
-      </w:r>
-      <w:r>
-        <w:rPr>
-          <w:rStyle w:val="VerbatimChar"/>
-        </w:rPr>
-        <w:t xml:space="preserve">     This is the second paragraph of the description.";</w:t>
-      </w:r>
-    </w:p>
-    <w:bookmarkEnd w:id="114"/>
-    <w:bookmarkStart w:id="115" w:name="sec:bbf-8-revision-statements"/>
-    <w:p>
-      <w:pPr>
-        <w:pStyle w:val="Heading3"/>
-      </w:pPr>
-      <w:r>
-        <w:t xml:space="preserve">BBF-8: Revision Statements</w:t>
-      </w:r>
-    </w:p>
-    <w:p>
-      <w:pPr>
-        <w:pStyle w:val="FirstParagraph"/>
-      </w:pPr>
-      <w:r>
-        <w:t xml:space="preserve">Superseded by BBF-15.</w:t>
-      </w:r>
-    </w:p>
-    <w:bookmarkEnd w:id="115"/>
-    <w:bookmarkStart w:id="116" w:name="sec:bbf-9-explicit-modeling"/>
-    <w:p>
-      <w:pPr>
-        <w:pStyle w:val="Heading3"/>
-      </w:pPr>
-      <w:r>
-        <w:t xml:space="preserve">BBF-9: Explicit Modeling</w:t>
-      </w:r>
-    </w:p>
-    <w:p>
-      <w:pPr>
-        <w:pStyle w:val="FirstParagraph"/>
-      </w:pPr>
-      <w:r>
-        <w:t xml:space="preserve">Where YANG allows something or some behavior to be explicitly modeled (e.g., enumerations, range, units, must, etc.) then this SHOULD always be done. Mandatory requirements in descriptions SHOULD be used only where it is not possible or practical to use formal YANG modeling to convey the requirement.</w:t>
-      </w:r>
-    </w:p>
-    <w:p>
-      <w:pPr>
-        <w:pStyle w:val="BodyText"/>
-      </w:pPr>
-      <w:r>
-        <w:t xml:space="preserve">Example:</w:t>
-      </w:r>
-    </w:p>
-    <w:p>
-      <w:pPr>
-        <w:pStyle w:val="SourceCode"/>
-      </w:pPr>
-      <w:r>
-        <w:rPr>
-          <w:rStyle w:val="VerbatimChar"/>
-        </w:rPr>
-        <w:t xml:space="preserve">  leaf forwarder {</w:t>
-      </w:r>
-      <w:r>
-        <w:br/>
-      </w:r>
-      <w:r>
-        <w:rPr>
-          <w:rStyle w:val="VerbatimChar"/>
-        </w:rPr>
-        <w:t xml:space="preserve">    type bbf-l2-fwd:forwarder-ref;</w:t>
-      </w:r>
-      <w:r>
-        <w:br/>
-      </w:r>
-      <w:r>
-        <w:rPr>
-          <w:rStyle w:val="VerbatimChar"/>
-        </w:rPr>
-        <w:t xml:space="preserve">    description</w:t>
-      </w:r>
-      <w:r>
-        <w:br/>
-      </w:r>
-      <w:r>
-        <w:rPr>
-          <w:rStyle w:val="VerbatimChar"/>
-        </w:rPr>
-        <w:t xml:space="preserve">      "A reference to a forwarder.</w:t>
-      </w:r>
-      <w:r>
-        <w:br/>
-      </w:r>
-      <w:r>
-        <w:br/>
-      </w:r>
-      <w:r>
-        <w:rPr>
-          <w:rStyle w:val="VerbatimChar"/>
-        </w:rPr>
-        <w:t xml:space="preserve">       The following is a constraint that could not be captured in</w:t>
-      </w:r>
-      <w:r>
-        <w:br/>
-      </w:r>
-      <w:r>
-        <w:rPr>
-          <w:rStyle w:val="VerbatimChar"/>
-        </w:rPr>
-        <w:t xml:space="preserve">       YANG: multiple Maintenance Groups referencing the same</w:t>
-      </w:r>
-      <w:r>
-        <w:br/>
-      </w:r>
-      <w:r>
-        <w:rPr>
-          <w:rStyle w:val="VerbatimChar"/>
-        </w:rPr>
-        <w:t xml:space="preserve">       forwarder are allowed, but only if they have a different</w:t>
-      </w:r>
-      <w:r>
-        <w:br/>
-      </w:r>
-      <w:r>
-        <w:rPr>
-          <w:rStyle w:val="VerbatimChar"/>
-        </w:rPr>
-        <w:t xml:space="preserve">       level.</w:t>
-      </w:r>
-      <w:r>
-        <w:br/>
-      </w:r>
-      <w:r>
-        <w:br/>
-      </w:r>
-      <w:r>
-        <w:rPr>
-          <w:rStyle w:val="VerbatimChar"/>
-        </w:rPr>
-        <w:t xml:space="preserve">       Note that there is no BBF requirement for multiple levels</w:t>
-      </w:r>
-      <w:r>
-        <w:br/>
-      </w:r>
-      <w:r>
-        <w:rPr>
-          <w:rStyle w:val="VerbatimChar"/>
-        </w:rPr>
-        <w:t xml:space="preserve">       with up-MEPs. Within BBF context multiple levels on a</w:t>
-      </w:r>
-      <w:r>
-        <w:br/>
-      </w:r>
-      <w:r>
-        <w:rPr>
-          <w:rStyle w:val="VerbatimChar"/>
-        </w:rPr>
-        <w:t xml:space="preserve">       forwarder go together with one level using up-MEPs and a</w:t>
-      </w:r>
-      <w:r>
-        <w:br/>
-      </w:r>
-      <w:r>
-        <w:rPr>
-          <w:rStyle w:val="VerbatimChar"/>
-        </w:rPr>
-        <w:t xml:space="preserve">       higher level using MIPs.";</w:t>
-      </w:r>
-      <w:r>
-        <w:br/>
-      </w:r>
-      <w:r>
-        <w:rPr>
-          <w:rStyle w:val="VerbatimChar"/>
-        </w:rPr>
-        <w:t xml:space="preserve">  }</w:t>
-      </w:r>
-    </w:p>
-    <w:bookmarkEnd w:id="116"/>
-    <w:bookmarkStart w:id="117" w:name="Xc8822cf271b3ba3489c4f60b5f40bba4bb3e20d"/>
-    <w:p>
-      <w:pPr>
-        <w:pStyle w:val="Heading3"/>
-      </w:pPr>
-      <w:r>
-        <w:t xml:space="preserve">BBF-10: Retroactive Application of OD-360 Guidelines</w:t>
-      </w:r>
-    </w:p>
-    <w:p>
-      <w:pPr>
-        <w:pStyle w:val="FirstParagraph"/>
-      </w:pPr>
-      <w:r>
-        <w:t xml:space="preserve">OD-360 guidelines MAY be retroactively applied to published BBF YANG modules but MUST NOT be applied if the resulting change is backward incompatible with the previously published version. For example, an existing node named using an underscore ’_’ instead of a dash</w:t>
-      </w:r>
-      <w:r>
-        <w:t xml:space="preserve"> </w:t>
-      </w:r>
-      <w:r>
-        <w:t xml:space="preserve">‘-’</w:t>
-      </w:r>
-      <w:r>
-        <w:t xml:space="preserve"> </w:t>
-      </w:r>
-      <w:r>
-        <w:t xml:space="preserve">MUST NOT be changed in published module as the resulting renaming is not backward compatible.</w:t>
-      </w:r>
-    </w:p>
-    <w:bookmarkEnd w:id="117"/>
-    <w:bookmarkStart w:id="118" w:name="sec:bbf-11-multi-word-identifiers"/>
-    <w:p>
-      <w:pPr>
-        <w:pStyle w:val="Heading3"/>
-      </w:pPr>
-      <w:r>
-        <w:t xml:space="preserve">BBF-11: Multi-word Identifiers</w:t>
-      </w:r>
-    </w:p>
-    <w:p>
-      <w:pPr>
-        <w:pStyle w:val="FirstParagraph"/>
-      </w:pPr>
-      <w:r>
-        <w:t xml:space="preserve">YANG identifiers which represent multiple words, e.g., target margin, SHOULD use a dash between the normally whitespace separated words, e.g.,</w:t>
-      </w:r>
-      <w:r>
-        <w:t xml:space="preserve"> </w:t>
-      </w:r>
-      <w:r>
-        <w:t xml:space="preserve">‘target-margin’</w:t>
-      </w:r>
-      <w:r>
-        <w:t xml:space="preserve">.</w:t>
-      </w:r>
-    </w:p>
-    <w:bookmarkEnd w:id="118"/>
-    <w:bookmarkStart w:id="119" w:name="X967a2fedd362844d661e2a0b6a18bc64ee49eef"/>
-    <w:p>
-      <w:pPr>
-        <w:pStyle w:val="Heading3"/>
-      </w:pPr>
-      <w:r>
-        <w:t xml:space="preserve">BBF-12: Acronyms in Description Statements</w:t>
-      </w:r>
-    </w:p>
-    <w:p>
-      <w:pPr>
-        <w:pStyle w:val="FirstParagraph"/>
-      </w:pPr>
-      <w:r>
-        <w:t xml:space="preserve">Acronyms can be used in description statements. However, the first instance of the acronym in a description statement SHOULD have its meaning clearly conveyed.</w:t>
-      </w:r>
-    </w:p>
-    <w:p>
-      <w:pPr>
-        <w:pStyle w:val="BodyText"/>
-      </w:pPr>
-      <w:r>
-        <w:t xml:space="preserve">For example:</w:t>
-      </w:r>
-    </w:p>
-    <w:p>
-      <w:pPr>
-        <w:pStyle w:val="SourceCode"/>
-      </w:pPr>
-      <w:r>
-        <w:rPr>
-          <w:rStyle w:val="VerbatimChar"/>
-        </w:rPr>
-        <w:t xml:space="preserve">  leaf cbs {</w:t>
-      </w:r>
-      <w:r>
-        <w:br/>
-      </w:r>
-      <w:r>
-        <w:rPr>
-          <w:rStyle w:val="VerbatimChar"/>
-        </w:rPr>
-        <w:t xml:space="preserve">    type bbf-qos-plc-tp:burst-size;</w:t>
-      </w:r>
-      <w:r>
-        <w:br/>
-      </w:r>
-      <w:r>
-        <w:rPr>
-          <w:rStyle w:val="VerbatimChar"/>
-        </w:rPr>
-        <w:t xml:space="preserve">    description</w:t>
-      </w:r>
-      <w:r>
-        <w:br/>
-      </w:r>
-      <w:r>
-        <w:rPr>
-          <w:rStyle w:val="VerbatimChar"/>
-        </w:rPr>
-        <w:t xml:space="preserve">      "Committed Burst Size (CBS) defines the amount of traffic</w:t>
-      </w:r>
-      <w:r>
-        <w:br/>
-      </w:r>
-      <w:r>
-        <w:rPr>
-          <w:rStyle w:val="VerbatimChar"/>
-        </w:rPr>
-        <w:t xml:space="preserve">       that can be admitted above the Committed Information Rate</w:t>
-      </w:r>
-      <w:r>
-        <w:br/>
-      </w:r>
-      <w:r>
-        <w:rPr>
-          <w:rStyle w:val="VerbatimChar"/>
-        </w:rPr>
-        <w:t xml:space="preserve">       (CIR) and considered green.";</w:t>
-      </w:r>
-      <w:r>
-        <w:br/>
-      </w:r>
-      <w:r>
-        <w:rPr>
-          <w:rStyle w:val="VerbatimChar"/>
-        </w:rPr>
-        <w:t xml:space="preserve">  }</w:t>
-      </w:r>
-    </w:p>
-    <w:bookmarkEnd w:id="119"/>
-    <w:bookmarkStart w:id="120" w:name="X990ed97808c690fc0c84dc0b1ccdecd491363d3"/>
-    <w:p>
-      <w:pPr>
-        <w:pStyle w:val="Heading3"/>
-      </w:pPr>
-      <w:r>
-        <w:t xml:space="preserve">BBF-13: Abbreviations in Description Statements</w:t>
-      </w:r>
-    </w:p>
-    <w:p>
-      <w:pPr>
-        <w:pStyle w:val="FirstParagraph"/>
-      </w:pPr>
-      <w:r>
-        <w:t xml:space="preserve">Abbreviations can be used in description statements. However, the first instance of the abbreviation in a description statement SHOULD have its meaning clearly conveyed.</w:t>
-      </w:r>
-    </w:p>
-    <w:bookmarkEnd w:id="120"/>
-    <w:bookmarkStart w:id="121" w:name="X365a74e662931a7eefdfcf499af0597b5ba63d7"/>
+    <w:bookmarkStart w:id="110" w:name="X365a74e662931a7eefdfcf499af0597b5ba63d7"/>
     <w:p>
       <w:pPr>
         <w:pStyle w:val="Heading3"/>
@@ -7196,8 +7196,8 @@
         <w:t xml:space="preserve">The new requirement must be reviewed by any Work Area(s) or Project Stream(s) for which it is clearly applicable (e.g., a PON related requirement is to be reviewed by the FAN WA).</w:t>
       </w:r>
     </w:p>
-    <w:bookmarkEnd w:id="121"/>
-    <w:bookmarkStart w:id="125" w:name="Xfd86df72343459f7f132fd88c2e94d18a11bec1"/>
+    <w:bookmarkEnd w:id="110"/>
+    <w:bookmarkStart w:id="114" w:name="Xfd86df72343459f7f132fd88c2e94d18a11bec1"/>
     <w:p>
       <w:pPr>
         <w:pStyle w:val="Heading3"/>
@@ -7258,7 +7258,7 @@
         <w:t xml:space="preserve">In order to allow BBF members to consume BBF YANG models in any state, the following apply with regards to revision statements and license text.</w:t>
       </w:r>
     </w:p>
-    <w:bookmarkStart w:id="122" w:name="sec:published"/>
+    <w:bookmarkStart w:id="111" w:name="sec:published"/>
     <w:p>
       <w:pPr>
         <w:pStyle w:val="Heading4"/>
@@ -7311,8 +7311,8 @@
         <w:t xml:space="preserve">contain the standard BBF software license with correct copyright year(s).</w:t>
       </w:r>
     </w:p>
-    <w:bookmarkEnd w:id="122"/>
-    <w:bookmarkStart w:id="123" w:name="sec:draft"/>
+    <w:bookmarkEnd w:id="111"/>
+    <w:bookmarkStart w:id="112" w:name="sec:draft"/>
     <w:p>
       <w:pPr>
         <w:pStyle w:val="Heading4"/>
@@ -7365,8 +7365,8 @@
         <w:t xml:space="preserve">contain the draft BBF software license with correct copyright year(s).</w:t>
       </w:r>
     </w:p>
-    <w:bookmarkEnd w:id="123"/>
-    <w:bookmarkStart w:id="124" w:name="sec:development"/>
+    <w:bookmarkEnd w:id="112"/>
+    <w:bookmarkStart w:id="113" w:name="sec:development"/>
     <w:p>
       <w:pPr>
         <w:pStyle w:val="Heading4"/>
@@ -7529,9 +7529,9 @@
         <w:t xml:space="preserve">  }</w:t>
       </w:r>
     </w:p>
-    <w:bookmarkEnd w:id="124"/>
-    <w:bookmarkEnd w:id="125"/>
-    <w:bookmarkStart w:id="126" w:name="sec:bbf-16-enum-naming"/>
+    <w:bookmarkEnd w:id="113"/>
+    <w:bookmarkEnd w:id="114"/>
+    <w:bookmarkStart w:id="115" w:name="sec:bbf-16-enum-naming"/>
     <w:p>
       <w:pPr>
         <w:pStyle w:val="Heading3"/>
@@ -7919,8 +7919,8 @@
         <w:t xml:space="preserve">    }</w:t>
       </w:r>
     </w:p>
-    <w:bookmarkEnd w:id="126"/>
-    <w:bookmarkStart w:id="127" w:name="sec:bbf-17-value-statements"/>
+    <w:bookmarkEnd w:id="115"/>
+    <w:bookmarkStart w:id="116" w:name="sec:bbf-17-value-statements"/>
     <w:p>
       <w:pPr>
         <w:pStyle w:val="Heading3"/>
@@ -8198,8 +8198,8 @@
         <w:t xml:space="preserve">    }</w:t>
       </w:r>
     </w:p>
-    <w:bookmarkEnd w:id="127"/>
-    <w:bookmarkStart w:id="128" w:name="Xc0a7f9e5a82313fbca8666f2d3b491f4f3b8663"/>
+    <w:bookmarkEnd w:id="116"/>
+    <w:bookmarkStart w:id="117" w:name="Xc0a7f9e5a82313fbca8666f2d3b491f4f3b8663"/>
     <w:p>
       <w:pPr>
         <w:pStyle w:val="Heading3"/>
@@ -8536,8 +8536,8 @@
         <w:t xml:space="preserve">  }</w:t>
       </w:r>
     </w:p>
-    <w:bookmarkEnd w:id="128"/>
-    <w:bookmarkStart w:id="131" w:name="Xcb8ec127efd0a3543271a81f49bbc6152df386b"/>
+    <w:bookmarkEnd w:id="117"/>
+    <w:bookmarkStart w:id="120" w:name="Xcb8ec127efd0a3543271a81f49bbc6152df386b"/>
     <w:p>
       <w:pPr>
         <w:pStyle w:val="Heading3"/>
@@ -8564,7 +8564,7 @@
         </w:rPr>
         <w:t xml:space="preserve"> </w:t>
       </w:r>
-      <w:hyperlink r:id="rId129">
+      <w:hyperlink r:id="rId118">
         <w:r>
           <w:rPr>
             <w:rStyle w:val="Hyperlink"/>
@@ -8595,7 +8595,7 @@
         </w:rPr>
         <w:t xml:space="preserve"> </w:t>
       </w:r>
-      <w:hyperlink r:id="rId130">
+      <w:hyperlink r:id="rId119">
         <w:r>
           <w:rPr>
             <w:rStyle w:val="Hyperlink"/>
@@ -9031,8 +9031,8 @@
         <w:t xml:space="preserve">  }</w:t>
       </w:r>
     </w:p>
-    <w:bookmarkEnd w:id="131"/>
-    <w:bookmarkStart w:id="132" w:name="Xa6044de28c4be7f5f32a38ecbb8c01b0d409037"/>
+    <w:bookmarkEnd w:id="120"/>
+    <w:bookmarkStart w:id="121" w:name="Xa6044de28c4be7f5f32a38ecbb8c01b0d409037"/>
     <w:p>
       <w:pPr>
         <w:pStyle w:val="Heading3"/>
@@ -9144,7 +9144,7 @@
       <w:r>
         <w:t xml:space="preserve"> </w:t>
       </w:r>
-      <w:hyperlink r:id="rId68">
+      <w:hyperlink r:id="rId57">
         <w:r>
           <w:rPr>
             <w:rStyle w:val="Hyperlink"/>
@@ -9262,8 +9262,8 @@
         <w:t xml:space="preserve">&lt;error-message&gt;The name of a multicast interface to host can not be the name of a multicast network interface.&lt;/error-message&gt;</w:t>
       </w:r>
     </w:p>
-    <w:bookmarkEnd w:id="132"/>
-    <w:bookmarkStart w:id="133" w:name="X4dec392c9843aa4f569c2015eb960eb0d83ae6b"/>
+    <w:bookmarkEnd w:id="121"/>
+    <w:bookmarkStart w:id="122" w:name="X4dec392c9843aa4f569c2015eb960eb0d83ae6b"/>
     <w:p>
       <w:pPr>
         <w:pStyle w:val="Heading3"/>
@@ -9426,8 +9426,8 @@
         <w:t xml:space="preserve">The obsoleted data nodes MUST never be deleted from the YANG model.</w:t>
       </w:r>
     </w:p>
-    <w:bookmarkEnd w:id="133"/>
-    <w:bookmarkStart w:id="136" w:name="sec:bbf-22-backwards-compatibility"/>
+    <w:bookmarkEnd w:id="122"/>
+    <w:bookmarkStart w:id="125" w:name="sec:bbf-22-backwards-compatibility"/>
     <w:p>
       <w:pPr>
         <w:pStyle w:val="Heading3"/>
@@ -9471,7 +9471,7 @@
       <w:r>
         <w:t xml:space="preserve"> </w:t>
       </w:r>
-      <w:hyperlink r:id="rId134">
+      <w:hyperlink r:id="rId123">
         <w:r>
           <w:rPr>
             <w:rStyle w:val="Hyperlink"/>
@@ -9502,7 +9502,7 @@
       <w:r>
         <w:t xml:space="preserve"> </w:t>
       </w:r>
-      <w:hyperlink r:id="rId135">
+      <w:hyperlink r:id="rId124">
         <w:r>
           <w:rPr>
             <w:rStyle w:val="Hyperlink"/>
@@ -9556,7 +9556,7 @@
       <w:r>
         <w:t xml:space="preserve"> </w:t>
       </w:r>
-      <w:hyperlink r:id="rId134">
+      <w:hyperlink r:id="rId123">
         <w:r>
           <w:rPr>
             <w:rStyle w:val="Hyperlink"/>
@@ -9602,7 +9602,7 @@
       <w:r>
         <w:t xml:space="preserve"> </w:t>
       </w:r>
-      <w:hyperlink r:id="rId134">
+      <w:hyperlink r:id="rId123">
         <w:r>
           <w:rPr>
             <w:rStyle w:val="Hyperlink"/>
@@ -9637,8 +9637,8 @@
         <w:t xml:space="preserve">Before agreeing to such changes to a published YANG module, Work Areas must ensure, to the greatest possible extent, that these changes will indeed be backwards compatible and not impact any existing operator configuration or operations or other SDOs or vendors augmentations of these standardized modules.</w:t>
       </w:r>
     </w:p>
-    <w:bookmarkEnd w:id="136"/>
-    <w:bookmarkStart w:id="137" w:name="sec:bbf-23-enable-vs.-enabled"/>
+    <w:bookmarkEnd w:id="125"/>
+    <w:bookmarkStart w:id="126" w:name="sec:bbf-23-enable-vs.-enabled"/>
     <w:p>
       <w:pPr>
         <w:pStyle w:val="Heading3"/>
@@ -9712,8 +9712,8 @@
         <w:t xml:space="preserve">. This also applies to the names of enums or bits.</w:t>
       </w:r>
     </w:p>
-    <w:bookmarkEnd w:id="137"/>
-    <w:bookmarkStart w:id="138" w:name="sec:bbf-24-oper-state-vs.-oper-status"/>
+    <w:bookmarkEnd w:id="126"/>
+    <w:bookmarkStart w:id="127" w:name="sec:bbf-24-oper-state-vs.-oper-status"/>
     <w:p>
       <w:pPr>
         <w:pStyle w:val="Heading3"/>
@@ -9775,8 +9775,8 @@
         <w:t xml:space="preserve">.</w:t>
       </w:r>
     </w:p>
-    <w:bookmarkEnd w:id="138"/>
-    <w:bookmarkStart w:id="139" w:name="sec:bbf-25-reference-statements"/>
+    <w:bookmarkEnd w:id="127"/>
+    <w:bookmarkStart w:id="128" w:name="sec:bbf-25-reference-statements"/>
     <w:p>
       <w:pPr>
         <w:pStyle w:val="Heading3"/>
@@ -10453,8 +10453,8 @@
         <w:t xml:space="preserve">URL references should be periodically reviewed to ensure they still exist or have not been moved.</w:t>
       </w:r>
     </w:p>
-    <w:bookmarkEnd w:id="139"/>
-    <w:bookmarkStart w:id="142" w:name="sec:bbf-26-body-statements"/>
+    <w:bookmarkEnd w:id="128"/>
+    <w:bookmarkStart w:id="131" w:name="sec:bbf-26-body-statements"/>
     <w:p>
       <w:pPr>
         <w:pStyle w:val="Heading3"/>
@@ -10490,7 +10490,7 @@
       <w:r>
         <w:t xml:space="preserve"> </w:t>
       </w:r>
-      <w:hyperlink r:id="rId140">
+      <w:hyperlink r:id="rId129">
         <w:r>
           <w:rPr>
             <w:rStyle w:val="Hyperlink"/>
@@ -10524,7 +10524,7 @@
       <w:r>
         <w:t xml:space="preserve"> </w:t>
       </w:r>
-      <w:hyperlink r:id="rId141">
+      <w:hyperlink r:id="rId130">
         <w:r>
           <w:rPr>
             <w:rStyle w:val="Hyperlink"/>
@@ -10661,8 +10661,8 @@
         <w:t xml:space="preserve">notification statements</w:t>
       </w:r>
     </w:p>
-    <w:bookmarkEnd w:id="142"/>
-    <w:bookmarkStart w:id="143" w:name="Xba1c62665070be3155a84b4d1da73d5a18d616d"/>
+    <w:bookmarkEnd w:id="131"/>
+    <w:bookmarkStart w:id="132" w:name="Xba1c62665070be3155a84b4d1da73d5a18d616d"/>
     <w:p>
       <w:pPr>
         <w:pStyle w:val="Heading3"/>
@@ -11050,8 +11050,8 @@
         <w:t xml:space="preserve">}</w:t>
       </w:r>
     </w:p>
-    <w:bookmarkEnd w:id="143"/>
-    <w:bookmarkStart w:id="144" w:name="Xec0f6fb32d61293c49cd1103edc2f277edb476e"/>
+    <w:bookmarkEnd w:id="132"/>
+    <w:bookmarkStart w:id="133" w:name="Xec0f6fb32d61293c49cd1103edc2f277edb476e"/>
     <w:p>
       <w:pPr>
         <w:pStyle w:val="Heading3"/>
@@ -11242,8 +11242,8 @@
         <w:t xml:space="preserve">}</w:t>
       </w:r>
     </w:p>
-    <w:bookmarkEnd w:id="144"/>
-    <w:bookmarkStart w:id="145" w:name="sec:bbf-29-use-of-english-contractions"/>
+    <w:bookmarkEnd w:id="133"/>
+    <w:bookmarkStart w:id="134" w:name="sec:bbf-29-use-of-english-contractions"/>
     <w:p>
       <w:pPr>
         <w:pStyle w:val="Heading3"/>
@@ -11260,8 +11260,8 @@
         <w:t xml:space="preserve">Descriptions in YANG modules are considered to be formal documentation. Therefore, English contractions, e.g., can’t, isn’t, etc., SHALL NOT be used in description statements.</w:t>
       </w:r>
     </w:p>
-    <w:bookmarkEnd w:id="145"/>
-    <w:bookmarkStart w:id="146" w:name="sec:bbf-30-use-of-presence-statements"/>
+    <w:bookmarkEnd w:id="134"/>
+    <w:bookmarkStart w:id="135" w:name="sec:bbf-30-use-of-presence-statements"/>
     <w:p>
       <w:pPr>
         <w:pStyle w:val="Heading3"/>
@@ -11549,8 +11549,8 @@
         <w:t xml:space="preserve">        mandatory true;  &lt;&lt; to make this leaf conditionally mandatory</w:t>
       </w:r>
     </w:p>
-    <w:bookmarkEnd w:id="146"/>
-    <w:bookmarkStart w:id="147" w:name="X79b6fd6ecbb4358b3ec3fadbfda31be16bc6461"/>
+    <w:bookmarkEnd w:id="135"/>
+    <w:bookmarkStart w:id="136" w:name="X79b6fd6ecbb4358b3ec3fadbfda31be16bc6461"/>
     <w:p>
       <w:pPr>
         <w:pStyle w:val="Heading3"/>
@@ -11930,8 +11930,8 @@
         <w:t xml:space="preserve">    }</w:t>
       </w:r>
     </w:p>
-    <w:bookmarkEnd w:id="147"/>
-    <w:bookmarkStart w:id="148" w:name="sec:bbf-32-naming-choices"/>
+    <w:bookmarkEnd w:id="136"/>
+    <w:bookmarkStart w:id="137" w:name="sec:bbf-32-naming-choices"/>
     <w:p>
       <w:pPr>
         <w:pStyle w:val="Heading3"/>
@@ -12305,8 +12305,8 @@
         <w:t xml:space="preserve">    }</w:t>
       </w:r>
     </w:p>
-    <w:bookmarkEnd w:id="148"/>
-    <w:bookmarkStart w:id="149" w:name="X2e42482474bff85602ba9b0a80398eec573ea06"/>
+    <w:bookmarkEnd w:id="137"/>
+    <w:bookmarkStart w:id="138" w:name="X2e42482474bff85602ba9b0a80398eec573ea06"/>
     <w:p>
       <w:pPr>
         <w:pStyle w:val="Heading3"/>
@@ -13413,9 +13413,9 @@
         <w:t xml:space="preserve">     }</w:t>
       </w:r>
     </w:p>
-    <w:bookmarkEnd w:id="149"/>
-    <w:bookmarkEnd w:id="150"/>
-    <w:bookmarkStart w:id="159" w:name="sec:bbf-deviation-guidelines"/>
+    <w:bookmarkEnd w:id="138"/>
+    <w:bookmarkEnd w:id="139"/>
+    <w:bookmarkStart w:id="148" w:name="sec:bbf-deviation-guidelines"/>
     <w:p>
       <w:pPr>
         <w:pStyle w:val="Heading2"/>
@@ -13480,7 +13480,7 @@
         <w:t xml:space="preserve">they are expected to be used in the Broadband Forum.</w:t>
       </w:r>
     </w:p>
-    <w:bookmarkStart w:id="151" w:name="sec:types-of-deviations"/>
+    <w:bookmarkStart w:id="140" w:name="sec:types-of-deviations"/>
     <w:p>
       <w:pPr>
         <w:pStyle w:val="Heading3"/>
@@ -13609,8 +13609,8 @@
         <w:t xml:space="preserve">Deletes existing properties of the target node.</w:t>
       </w:r>
     </w:p>
-    <w:bookmarkEnd w:id="151"/>
-    <w:bookmarkStart w:id="152" w:name="sec:dev-1-not-supported"/>
+    <w:bookmarkEnd w:id="140"/>
+    <w:bookmarkStart w:id="141" w:name="sec:dev-1-not-supported"/>
     <w:p>
       <w:pPr>
         <w:pStyle w:val="Heading3"/>
@@ -13753,8 +13753,8 @@
         <w:t xml:space="preserve">  }</w:t>
       </w:r>
     </w:p>
-    <w:bookmarkEnd w:id="152"/>
-    <w:bookmarkStart w:id="153" w:name="sec:dev-2-add---number-of-elements"/>
+    <w:bookmarkEnd w:id="141"/>
+    <w:bookmarkStart w:id="142" w:name="sec:dev-2-add---number-of-elements"/>
     <w:p>
       <w:pPr>
         <w:pStyle w:val="Heading3"/>
@@ -14053,8 +14053,8 @@
         <w:t xml:space="preserve">  }</w:t>
       </w:r>
     </w:p>
-    <w:bookmarkEnd w:id="153"/>
-    <w:bookmarkStart w:id="154" w:name="sec:dev-3-add---must-constraints"/>
+    <w:bookmarkEnd w:id="142"/>
+    <w:bookmarkStart w:id="143" w:name="sec:dev-3-add---must-constraints"/>
     <w:p>
       <w:pPr>
         <w:pStyle w:val="Heading3"/>
@@ -14205,8 +14205,8 @@
         <w:t xml:space="preserve">  }</w:t>
       </w:r>
     </w:p>
-    <w:bookmarkEnd w:id="154"/>
-    <w:bookmarkStart w:id="155" w:name="sec:dev-4-replace---data-type"/>
+    <w:bookmarkEnd w:id="143"/>
+    <w:bookmarkStart w:id="144" w:name="sec:dev-4-replace---data-type"/>
     <w:p>
       <w:pPr>
         <w:pStyle w:val="Heading3"/>
@@ -14585,8 +14585,8 @@
         <w:t xml:space="preserve">  }</w:t>
       </w:r>
     </w:p>
-    <w:bookmarkEnd w:id="155"/>
-    <w:bookmarkStart w:id="156" w:name="sec:dev-5-replace---number-of-elements"/>
+    <w:bookmarkEnd w:id="144"/>
+    <w:bookmarkStart w:id="145" w:name="sec:dev-5-replace---number-of-elements"/>
     <w:p>
       <w:pPr>
         <w:pStyle w:val="Heading3"/>
@@ -14854,8 +14854,8 @@
         <w:t xml:space="preserve">  }</w:t>
       </w:r>
     </w:p>
-    <w:bookmarkEnd w:id="156"/>
-    <w:bookmarkStart w:id="157" w:name="sec:dev-6-delete"/>
+    <w:bookmarkEnd w:id="145"/>
+    <w:bookmarkStart w:id="146" w:name="sec:dev-6-delete"/>
     <w:p>
       <w:pPr>
         <w:pStyle w:val="Heading3"/>
@@ -14896,8 +14896,8 @@
         <w:t xml:space="preserve">By deleting a property, the value space of an object is typically being expanded which means the value accepted by the deviated definition is not valid per the original definition and thus, should never be allowed.</w:t>
       </w:r>
     </w:p>
-    <w:bookmarkEnd w:id="157"/>
-    <w:bookmarkStart w:id="158" w:name="sec:dev-7-add---mandatory-leaf"/>
+    <w:bookmarkEnd w:id="146"/>
+    <w:bookmarkStart w:id="147" w:name="sec:dev-7-add---mandatory-leaf"/>
     <w:p>
       <w:pPr>
         <w:pStyle w:val="Heading3"/>
@@ -15068,9 +15068,9 @@
         <w:t xml:space="preserve">Note that this is similar to the deviation of introducing a min-elements to a list or leaf-list that also makes one or more elements in the list mandatory.</w:t>
       </w:r>
     </w:p>
-    <w:bookmarkEnd w:id="158"/>
-    <w:bookmarkEnd w:id="159"/>
-    <w:bookmarkStart w:id="171" w:name="sec:bbf-guidelines-for-units-statements"/>
+    <w:bookmarkEnd w:id="147"/>
+    <w:bookmarkEnd w:id="148"/>
+    <w:bookmarkStart w:id="160" w:name="sec:bbf-guidelines-for-units-statements"/>
     <w:p>
       <w:pPr>
         <w:pStyle w:val="Heading2"/>
@@ -15143,7 +15143,7 @@
           <w:numId w:val="1048"/>
         </w:numPr>
       </w:pPr>
-      <w:hyperlink r:id="rId160">
+      <w:hyperlink r:id="rId149">
         <w:r>
           <w:rPr>
             <w:rStyle w:val="Hyperlink"/>
@@ -15152,7 +15152,7 @@
         </w:r>
       </w:hyperlink>
     </w:p>
-    <w:bookmarkStart w:id="161" w:name="sec:terminology-1"/>
+    <w:bookmarkStart w:id="150" w:name="sec:terminology-1"/>
     <w:p>
       <w:pPr>
         <w:pStyle w:val="Heading3"/>
@@ -15292,8 +15292,8 @@
         </w:tc>
       </w:tr>
     </w:tbl>
-    <w:bookmarkEnd w:id="161"/>
-    <w:bookmarkStart w:id="162" w:name="sec:units-1-unit-vs-symbol"/>
+    <w:bookmarkEnd w:id="150"/>
+    <w:bookmarkStart w:id="151" w:name="sec:units-1-unit-vs-symbol"/>
     <w:p>
       <w:pPr>
         <w:pStyle w:val="Heading3"/>
@@ -15406,8 +15406,8 @@
         <w:t xml:space="preserve">is not commonly used.</w:t>
       </w:r>
     </w:p>
-    <w:bookmarkEnd w:id="162"/>
-    <w:bookmarkStart w:id="163" w:name="sec:units-2-plural-form"/>
+    <w:bookmarkEnd w:id="151"/>
+    <w:bookmarkStart w:id="152" w:name="sec:units-2-plural-form"/>
     <w:p>
       <w:pPr>
         <w:pStyle w:val="Heading3"/>
@@ -15436,8 +15436,8 @@
         <w:t xml:space="preserve">text SHALL be written in plural form, e.g., seconds vs. second. This differs from the definitions in IEEE Std. 260.1 but aligns with NIST 811 as well as the current practice in industry standard YANG data models.</w:t>
       </w:r>
     </w:p>
-    <w:bookmarkEnd w:id="163"/>
-    <w:bookmarkStart w:id="164" w:name="sec:units-3-base-vs-derived"/>
+    <w:bookmarkEnd w:id="152"/>
+    <w:bookmarkStart w:id="153" w:name="sec:units-3-base-vs-derived"/>
     <w:p>
       <w:pPr>
         <w:pStyle w:val="Heading3"/>
@@ -15478,8 +15478,8 @@
         <w:t xml:space="preserve">from the base, e.g., seconds, milliseconds, nanoseconds.</w:t>
       </w:r>
     </w:p>
-    <w:bookmarkEnd w:id="164"/>
-    <w:bookmarkStart w:id="165" w:name="sec:units-4-memory"/>
+    <w:bookmarkEnd w:id="153"/>
+    <w:bookmarkStart w:id="154" w:name="sec:units-4-memory"/>
     <w:p>
       <w:pPr>
         <w:pStyle w:val="Heading3"/>
@@ -15517,8 +15517,8 @@
         <w:t xml:space="preserve">, e.g., bytes, kibibytes, mebibytes.</w:t>
       </w:r>
     </w:p>
-    <w:bookmarkEnd w:id="165"/>
-    <w:bookmarkStart w:id="166" w:name="sec:units-5-unit-combinations"/>
+    <w:bookmarkEnd w:id="154"/>
+    <w:bookmarkStart w:id="155" w:name="sec:units-5-unit-combinations"/>
     <w:p>
       <w:pPr>
         <w:pStyle w:val="Heading3"/>
@@ -15595,8 +15595,8 @@
         <w:t xml:space="preserve">.</w:t>
       </w:r>
     </w:p>
-    <w:bookmarkEnd w:id="166"/>
-    <w:bookmarkStart w:id="167" w:name="sec:units-6-equivalent-units"/>
+    <w:bookmarkEnd w:id="155"/>
+    <w:bookmarkStart w:id="156" w:name="sec:units-6-equivalent-units"/>
     <w:p>
       <w:pPr>
         <w:pStyle w:val="Heading3"/>
@@ -15646,8 +15646,8 @@
         <w:t xml:space="preserve">.</w:t>
       </w:r>
     </w:p>
-    <w:bookmarkEnd w:id="167"/>
-    <w:bookmarkStart w:id="168" w:name="sec:units-7-use-of-decimal64"/>
+    <w:bookmarkEnd w:id="156"/>
+    <w:bookmarkStart w:id="157" w:name="sec:units-7-use-of-decimal64"/>
     <w:p>
       <w:pPr>
         <w:pStyle w:val="Heading3"/>
@@ -15875,8 +15875,8 @@
         <w:t xml:space="preserve">.</w:t>
       </w:r>
     </w:p>
-    <w:bookmarkEnd w:id="168"/>
-    <w:bookmarkStart w:id="169" w:name="sec:units-8-exceptions"/>
+    <w:bookmarkEnd w:id="157"/>
+    <w:bookmarkStart w:id="158" w:name="sec:units-8-exceptions"/>
     <w:p>
       <w:pPr>
         <w:pStyle w:val="Heading3"/>
@@ -15947,8 +15947,8 @@
         <w:t xml:space="preserve">is as equally important as is the representation of time.</w:t>
       </w:r>
     </w:p>
-    <w:bookmarkEnd w:id="169"/>
-    <w:bookmarkStart w:id="170" w:name="X04bb541aae3b3cf33164758e7fb4852ff067084"/>
+    <w:bookmarkEnd w:id="158"/>
+    <w:bookmarkStart w:id="159" w:name="X04bb541aae3b3cf33164758e7fb4852ff067084"/>
     <w:p>
       <w:pPr>
         <w:pStyle w:val="Heading3"/>
@@ -16070,10 +16070,14 @@
         <w:t xml:space="preserve">when referring to protocols, e.g., DHCP messages, IGMP messages, etc.</w:t>
       </w:r>
     </w:p>
-    <w:bookmarkEnd w:id="170"/>
-    <w:bookmarkEnd w:id="171"/>
-    <w:bookmarkEnd w:id="172"/>
-    <w:sectPr/>
+    <w:bookmarkEnd w:id="159"/>
+    <w:bookmarkEnd w:id="160"/>
+    <w:bookmarkEnd w:id="161"/>
+    <w:sectPr>
+      <w:footnotePr>
+        <w:numRestart w:val="eachSect"/>
+      </w:footnotePr>
+    </w:sectPr>
   </w:body>
 </w:document>
 </file>
@@ -16772,10 +16776,10 @@
   <w:docDefaults>
     <w:rPrDefault>
       <w:rPr>
-        <w:rFonts w:asciiTheme="minorHAnsi" w:cstheme="minorBidi" w:eastAsiaTheme="minorHAnsi" w:hAnsiTheme="minorHAnsi"/>
+        <w:rFonts w:asciiTheme="minorHAnsi" w:cstheme="minorBidi" w:eastAsiaTheme="minorEastAsia" w:hAnsiTheme="minorHAnsi"/>
         <w:sz w:val="24"/>
         <w:szCs w:val="24"/>
-        <w:lang w:bidi="ar-SA" w:eastAsia="en-US" w:val="en-US"/>
+        <w:lang w:bidi="ar-SA" w:eastAsia="zh-CN" w:val="en-US"/>
       </w:rPr>
     </w:rPrDefault>
     <w:pPrDefault>
@@ -16827,8 +16831,6 @@
     </w:pPr>
     <w:rPr>
       <w:rFonts w:asciiTheme="majorHAnsi" w:cstheme="majorBidi" w:eastAsiaTheme="majorEastAsia" w:hAnsiTheme="majorHAnsi"/>
-      <w:spacing w:val="-10"/>
-      <w:kern w:val="28"/>
       <w:sz w:val="56"/>
       <w:szCs w:val="56"/>
     </w:rPr>
@@ -16841,8 +16843,6 @@
     <w:rsid w:val="00A10FD9"/>
     <w:rPr>
       <w:rFonts w:asciiTheme="majorHAnsi" w:cstheme="majorBidi" w:eastAsiaTheme="majorEastAsia" w:hAnsiTheme="majorHAnsi"/>
-      <w:spacing w:val="-10"/>
-      <w:kern w:val="28"/>
       <w:sz w:val="56"/>
       <w:szCs w:val="56"/>
     </w:rPr>
@@ -16883,23 +16883,31 @@
   </w:style>
   <w:style w:customStyle="1" w:styleId="Author" w:type="paragraph">
     <w:name w:val="Author"/>
+    <w:basedOn w:val="Title"/>
     <w:next w:val="BodyText"/>
     <w:qFormat/>
     <w:pPr>
       <w:keepNext/>
       <w:keepLines/>
-      <w:jc w:val="center"/>
     </w:pPr>
+    <w:rPr>
+      <w:sz w:val="24"/>
+      <w:szCs w:val="24"/>
+    </w:rPr>
   </w:style>
   <w:style w:styleId="Date" w:type="paragraph">
     <w:name w:val="Date"/>
+    <w:basedOn w:val="Title"/>
     <w:next w:val="BodyText"/>
     <w:qFormat/>
     <w:pPr>
       <w:keepNext/>
       <w:keepLines/>
-      <w:jc w:val="center"/>
     </w:pPr>
+    <w:rPr>
+      <w:sz w:val="24"/>
+      <w:szCs w:val="24"/>
+    </w:rPr>
   </w:style>
   <w:style w:customStyle="1" w:styleId="AbstractTitle" w:type="paragraph">
     <w:name w:val="Abstract Title"/>
@@ -17312,13 +17320,6 @@
       </w:tblCellMar>
     </w:tblPr>
     <w:tblStylePr w:type="firstRow">
-      <w:tblPr>
-        <w:jc w:val="left"/>
-        <w:tblInd w:type="dxa" w:w="0"/>
-      </w:tblPr>
-      <w:trPr>
-        <w:jc w:val="left"/>
-      </w:trPr>
       <w:tcPr>
         <w:tcBorders>
           <w:bottom w:val="single"/>

</xml_diff>

<commit_message>
2026-10-19: TR-383 Amendment 11 Common YANG Modules for Access Networks
</commit_message>
<xml_diff>
--- a/docs/index.docx
+++ b/docs/index.docx
@@ -55,34 +55,35 @@
         </w:p>
       </w:sdtContent>
     </w:sdt>
-    <w:bookmarkStart w:id="9" w:name="list-of-figures"/>
     <w:p>
       <w:pPr>
         <w:pStyle w:val="Heading3"/>
       </w:pPr>
+      <w:bookmarkStart w:id="9" w:name="_f742a1a4b8d4adc352672b7858cd31b7f4d0972"/>
       <w:r>
         <w:t xml:space="preserve">List of Figures</w:t>
       </w:r>
-    </w:p>
-    <w:bookmarkEnd w:id="9"/>
-    <w:bookmarkStart w:id="10" w:name="list-of-tables"/>
+      <w:bookmarkEnd w:id="9"/>
+    </w:p>
     <w:p>
       <w:pPr>
         <w:pStyle w:val="Heading3"/>
       </w:pPr>
+      <w:bookmarkStart w:id="10" w:name="_05d3edcf1911c8e89bfeb1b8c208493461f609b"/>
       <w:r>
         <w:t xml:space="preserve">List of Tables</w:t>
       </w:r>
-    </w:p>
-    <w:bookmarkEnd w:id="10"/>
-    <w:bookmarkStart w:id="16" w:name="sec:issue-history"/>
+      <w:bookmarkEnd w:id="10"/>
+    </w:p>
     <w:p>
       <w:pPr>
         <w:pStyle w:val="Heading3"/>
       </w:pPr>
+      <w:bookmarkStart w:id="11" w:name="_143e7f2b74494b04838ef07d1932890d8d194e3"/>
       <w:r>
         <w:t xml:space="preserve">Issue History</w:t>
       </w:r>
+      <w:bookmarkEnd w:id="11"/>
     </w:p>
     <w:tbl>
       <w:tblPr>
@@ -158,7 +159,7 @@
               <w:pStyle w:val="Compact"/>
               <w:jc w:val="left"/>
             </w:pPr>
-            <w:hyperlink r:id="rId11">
+            <w:hyperlink r:id="rId12">
               <w:r>
                 <w:rPr>
                   <w:rStyle w:val="Hyperlink"/>
@@ -221,7 +222,7 @@
               <w:pStyle w:val="Compact"/>
               <w:jc w:val="left"/>
             </w:pPr>
-            <w:hyperlink r:id="rId12">
+            <w:hyperlink r:id="rId13">
               <w:r>
                 <w:rPr>
                   <w:rStyle w:val="Hyperlink"/>
@@ -296,7 +297,7 @@
               <w:pStyle w:val="Compact"/>
               <w:jc w:val="left"/>
             </w:pPr>
-            <w:hyperlink r:id="rId13">
+            <w:hyperlink r:id="rId14">
               <w:r>
                 <w:rPr>
                   <w:rStyle w:val="Hyperlink"/>
@@ -385,7 +386,7 @@
               <w:pStyle w:val="Compact"/>
               <w:jc w:val="left"/>
             </w:pPr>
-            <w:hyperlink r:id="rId14">
+            <w:hyperlink r:id="rId15">
               <w:r>
                 <w:rPr>
                   <w:rStyle w:val="Hyperlink"/>
@@ -503,7 +504,7 @@
       <w:r>
         <w:t xml:space="preserve"> </w:t>
       </w:r>
-      <w:hyperlink r:id="rId15">
+      <w:hyperlink r:id="rId16">
         <w:r>
           <w:rPr>
             <w:rStyle w:val="Hyperlink"/>
@@ -515,15 +516,15 @@
         <w:t xml:space="preserve">.</w:t>
       </w:r>
     </w:p>
-    <w:bookmarkEnd w:id="16"/>
-    <w:bookmarkStart w:id="17" w:name="sec:editors"/>
     <w:p>
       <w:pPr>
         <w:pStyle w:val="Heading3"/>
       </w:pPr>
+      <w:bookmarkStart w:id="17" w:name="_4fef1be4eb93ac5f8fa84491660c36afa339e03"/>
       <w:r>
         <w:t xml:space="preserve">Editors</w:t>
       </w:r>
+      <w:bookmarkEnd w:id="17"/>
     </w:p>
     <w:p>
       <w:pPr>
@@ -549,15 +550,15 @@
         <w:t xml:space="preserve">Sven Ooghe, Nokia</w:t>
       </w:r>
     </w:p>
-    <w:bookmarkEnd w:id="17"/>
-    <w:bookmarkStart w:id="18" w:name="sec:notice"/>
     <w:p>
       <w:pPr>
         <w:pStyle w:val="Heading3"/>
       </w:pPr>
+      <w:bookmarkStart w:id="18" w:name="_d4c85d3d7e71c404ed36af87e5aadfc52ebb55a"/>
       <w:r>
         <w:t xml:space="preserve">Notice</w:t>
       </w:r>
+      <w:bookmarkEnd w:id="18"/>
     </w:p>
     <w:p>
       <w:pPr>
@@ -597,15 +598,15 @@
         <w:t xml:space="preserve">and/or copyrighted by Broadband Forum members.</w:t>
       </w:r>
     </w:p>
-    <w:bookmarkEnd w:id="18"/>
-    <w:bookmarkStart w:id="19" w:name="sec:intellectual-property"/>
     <w:p>
       <w:pPr>
         <w:pStyle w:val="Heading3"/>
       </w:pPr>
+      <w:bookmarkStart w:id="19" w:name="_044c5a7b2231e7c8153317dc5b2e2f90f06088b"/>
       <w:r>
         <w:t xml:space="preserve">Intellectual Property</w:t>
       </w:r>
+      <w:bookmarkEnd w:id="19"/>
     </w:p>
     <w:p>
       <w:pPr>
@@ -645,15 +646,15 @@
         <w:t xml:space="preserve">documentation.</w:t>
       </w:r>
     </w:p>
-    <w:bookmarkEnd w:id="19"/>
-    <w:bookmarkStart w:id="20" w:name="sec:terms-of-use"/>
     <w:p>
       <w:pPr>
         <w:pStyle w:val="Heading3"/>
       </w:pPr>
+      <w:bookmarkStart w:id="20" w:name="_2c4a3b55e277a7fdc80abfce3b61246cecb032e"/>
       <w:r>
         <w:t xml:space="preserve">Terms of Use</w:t>
       </w:r>
+      <w:bookmarkEnd w:id="20"/>
     </w:p>
     <w:p>
       <w:pPr>
@@ -903,18 +904,18 @@
         <w:t xml:space="preserve">notices, legends, and other provisions set forth on this page.</w:t>
       </w:r>
     </w:p>
-    <w:bookmarkEnd w:id="20"/>
-    <w:bookmarkStart w:id="40" w:name="sec:references"/>
     <w:p>
       <w:pPr>
         <w:pStyle w:val="Heading1"/>
       </w:pPr>
+      <w:bookmarkStart w:id="21" w:name="_e101cb4db063275589cf296bc23cc80577ab383"/>
       <w:r>
         <w:t xml:space="preserve">References</w:t>
       </w:r>
-    </w:p>
-    <w:bookmarkStart w:id="39" w:name="refs"/>
-    <w:bookmarkStart w:id="22" w:name="ref-TR-383"/>
+      <w:bookmarkEnd w:id="21"/>
+    </w:p>
+    <w:bookmarkStart w:id="40" w:name="_refs"/>
+    <w:bookmarkStart w:id="23" w:name="_c881cfca486279894d799dfa985220a9373daeb"/>
     <w:p>
       <w:pPr>
         <w:pStyle w:val="Bibliography"/>
@@ -934,7 +935,7 @@
       <w:r>
         <w:t xml:space="preserve"> </w:t>
       </w:r>
-      <w:hyperlink r:id="rId21">
+      <w:hyperlink r:id="rId22">
         <w:r>
           <w:rPr>
             <w:rStyle w:val="Hyperlink"/>
@@ -948,8 +949,8 @@
         <w:t xml:space="preserve">, Broadband Forum, 2024</w:t>
       </w:r>
     </w:p>
-    <w:bookmarkEnd w:id="22"/>
-    <w:bookmarkStart w:id="24" w:name="ref-RFC2119"/>
+    <w:bookmarkEnd w:id="23"/>
+    <w:bookmarkStart w:id="25" w:name="_6c4b3b0cc44b9f22320d733ea58300db69e066a"/>
     <w:p>
       <w:pPr>
         <w:pStyle w:val="Bibliography"/>
@@ -969,7 +970,7 @@
       <w:r>
         <w:t xml:space="preserve"> </w:t>
       </w:r>
-      <w:hyperlink r:id="rId23">
+      <w:hyperlink r:id="rId24">
         <w:r>
           <w:rPr>
             <w:rStyle w:val="Hyperlink"/>
@@ -1063,8 +1064,8 @@
         <w:t xml:space="preserve">, IETF, 1997</w:t>
       </w:r>
     </w:p>
-    <w:bookmarkEnd w:id="24"/>
-    <w:bookmarkStart w:id="26" w:name="ref-RFC7223"/>
+    <w:bookmarkEnd w:id="25"/>
+    <w:bookmarkStart w:id="27" w:name="_f831072a942d0ab6406c7261ba9cac8a33a6879"/>
     <w:p>
       <w:pPr>
         <w:pStyle w:val="Bibliography"/>
@@ -1084,7 +1085,7 @@
       <w:r>
         <w:t xml:space="preserve"> </w:t>
       </w:r>
-      <w:hyperlink r:id="rId25">
+      <w:hyperlink r:id="rId26">
         <w:r>
           <w:rPr>
             <w:rStyle w:val="Hyperlink"/>
@@ -1194,8 +1195,8 @@
         <w:t xml:space="preserve">, IETF, 2014</w:t>
       </w:r>
     </w:p>
-    <w:bookmarkEnd w:id="26"/>
-    <w:bookmarkStart w:id="28" w:name="ref-RFC7950"/>
+    <w:bookmarkEnd w:id="27"/>
+    <w:bookmarkStart w:id="29" w:name="_9aa1375053d51ce8fa8cdf71cde3bc0571671c1"/>
     <w:p>
       <w:pPr>
         <w:pStyle w:val="Bibliography"/>
@@ -1215,7 +1216,7 @@
       <w:r>
         <w:t xml:space="preserve"> </w:t>
       </w:r>
-      <w:hyperlink r:id="rId27">
+      <w:hyperlink r:id="rId28">
         <w:r>
           <w:rPr>
             <w:rStyle w:val="Hyperlink"/>
@@ -1309,8 +1310,8 @@
         <w:t xml:space="preserve">, IETF, 2016</w:t>
       </w:r>
     </w:p>
-    <w:bookmarkEnd w:id="28"/>
-    <w:bookmarkStart w:id="30" w:name="ref-RFC8174"/>
+    <w:bookmarkEnd w:id="29"/>
+    <w:bookmarkStart w:id="31" w:name="_943b97c665eaf72ff6d393a545d612758cbcb3a"/>
     <w:p>
       <w:pPr>
         <w:pStyle w:val="Bibliography"/>
@@ -1330,7 +1331,7 @@
       <w:r>
         <w:t xml:space="preserve"> </w:t>
       </w:r>
-      <w:hyperlink r:id="rId29">
+      <w:hyperlink r:id="rId30">
         <w:r>
           <w:rPr>
             <w:rStyle w:val="Hyperlink"/>
@@ -1472,8 +1473,8 @@
         <w:t xml:space="preserve">, IETF, 2017</w:t>
       </w:r>
     </w:p>
-    <w:bookmarkEnd w:id="30"/>
-    <w:bookmarkStart w:id="32" w:name="ref-RFC8407"/>
+    <w:bookmarkEnd w:id="31"/>
+    <w:bookmarkStart w:id="33" w:name="_3ad76c0cb9b1ead647a1dff13fc24ddd70b3bb0"/>
     <w:p>
       <w:pPr>
         <w:pStyle w:val="Bibliography"/>
@@ -1493,7 +1494,7 @@
       <w:r>
         <w:t xml:space="preserve"> </w:t>
       </w:r>
-      <w:hyperlink r:id="rId31">
+      <w:hyperlink r:id="rId32">
         <w:r>
           <w:rPr>
             <w:rStyle w:val="Hyperlink"/>
@@ -1651,8 +1652,8 @@
         <w:t xml:space="preserve">, IETF, 2018</w:t>
       </w:r>
     </w:p>
-    <w:bookmarkEnd w:id="32"/>
-    <w:bookmarkStart w:id="34" w:name="ref-RFC8632"/>
+    <w:bookmarkEnd w:id="33"/>
+    <w:bookmarkStart w:id="35" w:name="_989e6c6e50f32938c6eb9e2e354cca8a0aff0ae"/>
     <w:p>
       <w:pPr>
         <w:pStyle w:val="Bibliography"/>
@@ -1672,7 +1673,7 @@
       <w:r>
         <w:t xml:space="preserve"> </w:t>
       </w:r>
-      <w:hyperlink r:id="rId33">
+      <w:hyperlink r:id="rId34">
         <w:r>
           <w:rPr>
             <w:rStyle w:val="Hyperlink"/>
@@ -1782,8 +1783,8 @@
         <w:t xml:space="preserve">, IETF, 2019</w:t>
       </w:r>
     </w:p>
-    <w:bookmarkEnd w:id="34"/>
-    <w:bookmarkStart w:id="36" w:name="ref-X.733"/>
+    <w:bookmarkEnd w:id="35"/>
+    <w:bookmarkStart w:id="37" w:name="_1c483dfdcd2d45170f9d1d1b9fcded940f44491"/>
     <w:p>
       <w:pPr>
         <w:pStyle w:val="Bibliography"/>
@@ -1803,7 +1804,7 @@
       <w:r>
         <w:t xml:space="preserve"> </w:t>
       </w:r>
-      <w:hyperlink r:id="rId35">
+      <w:hyperlink r:id="rId36">
         <w:r>
           <w:rPr>
             <w:rStyle w:val="Hyperlink"/>
@@ -1945,8 +1946,8 @@
         <w:t xml:space="preserve">, ITU-T, 1992</w:t>
       </w:r>
     </w:p>
-    <w:bookmarkEnd w:id="36"/>
-    <w:bookmarkStart w:id="38" w:name="ref-X.736"/>
+    <w:bookmarkEnd w:id="37"/>
+    <w:bookmarkStart w:id="39" w:name="_bcbc3edaee3875fd549183b99e7c4e09ee66c93"/>
     <w:p>
       <w:pPr>
         <w:pStyle w:val="Bibliography"/>
@@ -1966,7 +1967,7 @@
       <w:r>
         <w:t xml:space="preserve"> </w:t>
       </w:r>
-      <w:hyperlink r:id="rId37">
+      <w:hyperlink r:id="rId38">
         <w:r>
           <w:rPr>
             <w:rStyle w:val="Hyperlink"/>
@@ -2108,17 +2109,17 @@
         <w:t xml:space="preserve">, ITU-T, 1992</w:t>
       </w:r>
     </w:p>
-    <w:bookmarkEnd w:id="38"/>
     <w:bookmarkEnd w:id="39"/>
     <w:bookmarkEnd w:id="40"/>
-    <w:bookmarkStart w:id="42" w:name="sec:overview"/>
     <w:p>
       <w:pPr>
         <w:pStyle w:val="Heading1"/>
       </w:pPr>
+      <w:bookmarkStart w:id="41" w:name="_279c7be24ce3f918302a50480b57d7175e44ea1"/>
       <w:r>
         <w:t xml:space="preserve">Overview</w:t>
       </w:r>
+      <w:bookmarkEnd w:id="41"/>
     </w:p>
     <w:p>
       <w:pPr>
@@ -2128,14 +2129,15 @@
         <w:t xml:space="preserve">OD-360 provides a set of Best Current Practices for development of YANG Data Models in the Broadband Forum (BBF). The approach taken in establishing a set of best current practices is to utilize existing practices where those are relevant to the work of the Forum. The guidelines put forth by this document not only provide guidance for authors of BBF YANG models but are also enforced prior to YANG model publication to ensure a high level of quality and consistency across BBF projects.</w:t>
       </w:r>
     </w:p>
-    <w:bookmarkStart w:id="41" w:name="sec:yang-language-version"/>
     <w:p>
       <w:pPr>
         <w:pStyle w:val="Heading2"/>
       </w:pPr>
+      <w:bookmarkStart w:id="42" w:name="_7938ca58b1a63e8a9e94d50e2f6148fc6e7f1a2"/>
       <w:r>
         <w:t xml:space="preserve">YANG Language Version</w:t>
       </w:r>
+      <w:bookmarkEnd w:id="42"/>
     </w:p>
     <w:p>
       <w:pPr>
@@ -2147,7 +2149,7 @@
       <w:r>
         <w:t xml:space="preserve"> </w:t>
       </w:r>
-      <w:hyperlink w:anchor="ref-RFC7950">
+      <w:hyperlink w:anchor="_9aa1375053d51ce8fa8cdf71cde3bc0571671c1">
         <w:r>
           <w:rPr>
             <w:rStyle w:val="Hyperlink"/>
@@ -2162,16 +2164,15 @@
         <w:t xml:space="preserve">for use in all BBF YANG Data Models.</w:t>
       </w:r>
     </w:p>
-    <w:bookmarkEnd w:id="41"/>
-    <w:bookmarkEnd w:id="42"/>
-    <w:bookmarkStart w:id="161" w:name="sec:yang-guidelines"/>
     <w:p>
       <w:pPr>
         <w:pStyle w:val="Heading1"/>
       </w:pPr>
+      <w:bookmarkStart w:id="43" w:name="_d4e3303d2aa9431840568c280abcaf7ab0dc85f"/>
       <w:r>
         <w:t xml:space="preserve">YANG Guidelines</w:t>
       </w:r>
+      <w:bookmarkEnd w:id="43"/>
     </w:p>
     <w:p>
       <w:pPr>
@@ -2205,14 +2206,15 @@
         <w:t xml:space="preserve">Additional BBF-specific guidelines</w:t>
       </w:r>
     </w:p>
-    <w:bookmarkStart w:id="43" w:name="sec:terminology"/>
     <w:p>
       <w:pPr>
         <w:pStyle w:val="Heading2"/>
       </w:pPr>
+      <w:bookmarkStart w:id="44" w:name="_9e06e564bcba7e3683541d68bcfca03e0407aec"/>
       <w:r>
         <w:t xml:space="preserve">Terminology</w:t>
       </w:r>
+      <w:bookmarkEnd w:id="44"/>
     </w:p>
     <w:p>
       <w:pPr>
@@ -2234,15 +2236,15 @@
         <w:t xml:space="preserve">submodules, the term submodule is used instead.</w:t>
       </w:r>
     </w:p>
-    <w:bookmarkEnd w:id="43"/>
-    <w:bookmarkStart w:id="45" w:name="sec:template"/>
     <w:p>
       <w:pPr>
         <w:pStyle w:val="Heading2"/>
       </w:pPr>
+      <w:bookmarkStart w:id="45" w:name="_1dbe84289226fe43840398f43fc0ee3c2fd440d"/>
       <w:r>
         <w:t xml:space="preserve">Template</w:t>
       </w:r>
+      <w:bookmarkEnd w:id="45"/>
     </w:p>
     <w:p>
       <w:pPr>
@@ -2254,7 +2256,7 @@
       <w:r>
         <w:t xml:space="preserve"> </w:t>
       </w:r>
-      <w:hyperlink r:id="rId44">
+      <w:hyperlink r:id="rId46">
         <w:r>
           <w:rPr>
             <w:rStyle w:val="Hyperlink"/>
@@ -2278,15 +2280,15 @@
         <w:t xml:space="preserve">Guidelines.</w:t>
       </w:r>
     </w:p>
-    <w:bookmarkEnd w:id="45"/>
-    <w:bookmarkStart w:id="96" w:name="sec:ietf-yang-guidelines"/>
     <w:p>
       <w:pPr>
         <w:pStyle w:val="Heading2"/>
       </w:pPr>
+      <w:bookmarkStart w:id="47" w:name="_05a33df62f9fade32adb44065730830273476fd"/>
       <w:r>
         <w:t xml:space="preserve">IETF YANG Guidelines</w:t>
       </w:r>
+      <w:bookmarkEnd w:id="47"/>
     </w:p>
     <w:p>
       <w:pPr>
@@ -2298,7 +2300,7 @@
       <w:r>
         <w:t xml:space="preserve"> </w:t>
       </w:r>
-      <w:hyperlink w:anchor="ref-RFC8407">
+      <w:hyperlink w:anchor="_3ad76c0cb9b1ead647a1dff13fc24ddd70b3bb0">
         <w:r>
           <w:rPr>
             <w:rStyle w:val="Hyperlink"/>
@@ -2325,6 +2327,7 @@
     </w:p>
     <w:p>
       <w:pPr>
+        <w:pStyle w:val="FirstParagraph"/>
         <w:numPr>
           <w:ilvl w:val="0"/>
           <w:numId w:val="1013"/>
@@ -2348,6 +2351,7 @@
     </w:p>
     <w:p>
       <w:pPr>
+        <w:pStyle w:val="FirstParagraph"/>
         <w:numPr>
           <w:ilvl w:val="0"/>
           <w:numId w:val="1013"/>
@@ -2371,6 +2375,7 @@
     </w:p>
     <w:p>
       <w:pPr>
+        <w:pStyle w:val="FirstParagraph"/>
         <w:numPr>
           <w:ilvl w:val="0"/>
           <w:numId w:val="1013"/>
@@ -2404,14 +2409,15 @@
         <w:t xml:space="preserve">noted.</w:t>
       </w:r>
     </w:p>
-    <w:bookmarkStart w:id="47" w:name="sec:ietf-1-yang-terms"/>
     <w:p>
       <w:pPr>
         <w:pStyle w:val="Heading3"/>
       </w:pPr>
+      <w:bookmarkStart w:id="48" w:name="_918664b1c342a03f0eb6f355338e64acd046efd"/>
       <w:r>
         <w:t xml:space="preserve">IETF-1: YANG Terms</w:t>
       </w:r>
+      <w:bookmarkEnd w:id="48"/>
     </w:p>
     <w:p>
       <w:pPr>
@@ -2431,7 +2437,7 @@
         </w:rPr>
         <w:t xml:space="preserve"> </w:t>
       </w:r>
-      <w:hyperlink r:id="rId46">
+      <w:hyperlink r:id="rId49">
         <w:r>
           <w:rPr>
             <w:rStyle w:val="Hyperlink"/>
@@ -2462,7 +2468,7 @@
         </w:rPr>
         <w:t xml:space="preserve"> </w:t>
       </w:r>
-      <w:hyperlink w:anchor="ref-RFC8407">
+      <w:hyperlink w:anchor="_3ad76c0cb9b1ead647a1dff13fc24ddd70b3bb0">
         <w:r>
           <w:rPr>
             <w:rStyle w:val="Hyperlink"/>
@@ -2536,15 +2542,15 @@
         <w:t xml:space="preserve">.</w:t>
       </w:r>
     </w:p>
-    <w:bookmarkEnd w:id="47"/>
-    <w:bookmarkStart w:id="52" w:name="sec:ietf-2-yang-validation"/>
     <w:p>
       <w:pPr>
         <w:pStyle w:val="Heading3"/>
       </w:pPr>
+      <w:bookmarkStart w:id="50" w:name="_7921ac3c8863bd39deb94ab78d41c8062a8b7c2"/>
       <w:r>
         <w:t xml:space="preserve">IETF-2: YANG Validation</w:t>
       </w:r>
+      <w:bookmarkEnd w:id="50"/>
     </w:p>
     <w:p>
       <w:pPr>
@@ -2564,7 +2570,7 @@
         </w:rPr>
         <w:t xml:space="preserve"> </w:t>
       </w:r>
-      <w:hyperlink r:id="rId48">
+      <w:hyperlink r:id="rId51">
         <w:r>
           <w:rPr>
             <w:rStyle w:val="Hyperlink"/>
@@ -2595,7 +2601,7 @@
         </w:rPr>
         <w:t xml:space="preserve"> </w:t>
       </w:r>
-      <w:hyperlink w:anchor="ref-RFC8407">
+      <w:hyperlink w:anchor="_3ad76c0cb9b1ead647a1dff13fc24ddd70b3bb0">
         <w:r>
           <w:rPr>
             <w:rStyle w:val="Hyperlink"/>
@@ -2700,7 +2706,7 @@
       <w:r>
         <w:t xml:space="preserve"> </w:t>
       </w:r>
-      <w:hyperlink r:id="rId49">
+      <w:hyperlink r:id="rId52">
         <w:r>
           <w:rPr>
             <w:rStyle w:val="Hyperlink"/>
@@ -2722,7 +2728,7 @@
       <w:r>
         <w:t xml:space="preserve"> </w:t>
       </w:r>
-      <w:hyperlink r:id="rId50">
+      <w:hyperlink r:id="rId53">
         <w:r>
           <w:rPr>
             <w:rStyle w:val="Hyperlink"/>
@@ -2741,7 +2747,7 @@
       <w:r>
         <w:t xml:space="preserve"> </w:t>
       </w:r>
-      <w:hyperlink r:id="rId51">
+      <w:hyperlink r:id="rId54">
         <w:r>
           <w:rPr>
             <w:rStyle w:val="Hyperlink"/>
@@ -2750,15 +2756,15 @@
         </w:r>
       </w:hyperlink>
     </w:p>
-    <w:bookmarkEnd w:id="52"/>
-    <w:bookmarkStart w:id="54" w:name="sec:ietf-3-yang-usage-guidelines"/>
     <w:p>
       <w:pPr>
         <w:pStyle w:val="Heading3"/>
       </w:pPr>
+      <w:bookmarkStart w:id="55" w:name="_88dbe06ad087d664df1eaaba667a94d908af4a9"/>
       <w:r>
         <w:t xml:space="preserve">IETF-3: YANG Usage Guidelines</w:t>
       </w:r>
+      <w:bookmarkEnd w:id="55"/>
     </w:p>
     <w:p>
       <w:pPr>
@@ -2778,7 +2784,7 @@
         </w:rPr>
         <w:t xml:space="preserve"> </w:t>
       </w:r>
-      <w:hyperlink r:id="rId53">
+      <w:hyperlink r:id="rId56">
         <w:r>
           <w:rPr>
             <w:rStyle w:val="Hyperlink"/>
@@ -2809,7 +2815,7 @@
         </w:rPr>
         <w:t xml:space="preserve"> </w:t>
       </w:r>
-      <w:hyperlink w:anchor="ref-RFC8407">
+      <w:hyperlink w:anchor="_3ad76c0cb9b1ead647a1dff13fc24ddd70b3bb0">
         <w:r>
           <w:rPr>
             <w:rStyle w:val="Hyperlink"/>
@@ -2844,7 +2850,7 @@
       <w:r>
         <w:t xml:space="preserve"> </w:t>
       </w:r>
-      <w:hyperlink w:anchor="ref-RFC7950">
+      <w:hyperlink w:anchor="_9aa1375053d51ce8fa8cdf71cde3bc0571671c1">
         <w:r>
           <w:rPr>
             <w:rStyle w:val="Hyperlink"/>
@@ -2856,15 +2862,15 @@
         <w:t xml:space="preserve">.</w:t>
       </w:r>
     </w:p>
-    <w:bookmarkEnd w:id="54"/>
-    <w:bookmarkStart w:id="56" w:name="sec:ietf-4-file-layout"/>
     <w:p>
       <w:pPr>
         <w:pStyle w:val="Heading3"/>
       </w:pPr>
+      <w:bookmarkStart w:id="57" w:name="_b8fdca19ff532590433a175dac15d10cc009062"/>
       <w:r>
         <w:t xml:space="preserve">IETF-4: File Layout</w:t>
       </w:r>
+      <w:bookmarkEnd w:id="57"/>
     </w:p>
     <w:p>
       <w:pPr>
@@ -2884,7 +2890,7 @@
         </w:rPr>
         <w:t xml:space="preserve"> </w:t>
       </w:r>
-      <w:hyperlink r:id="rId55">
+      <w:hyperlink r:id="rId58">
         <w:r>
           <w:rPr>
             <w:rStyle w:val="Hyperlink"/>
@@ -2915,7 +2921,7 @@
         </w:rPr>
         <w:t xml:space="preserve"> </w:t>
       </w:r>
-      <w:hyperlink w:anchor="ref-RFC7950">
+      <w:hyperlink w:anchor="_9aa1375053d51ce8fa8cdf71cde3bc0571671c1">
         <w:r>
           <w:rPr>
             <w:rStyle w:val="Hyperlink"/>
@@ -2941,15 +2947,15 @@
         <w:t xml:space="preserve">Each BBF YANG module or submodule MUST be stored within a BBF YANG repository in a file called &lt;module-name&gt;.yang or &lt;submodule-name&gt;.yang without revision-date in the name.</w:t>
       </w:r>
     </w:p>
-    <w:bookmarkEnd w:id="56"/>
-    <w:bookmarkStart w:id="58" w:name="sec:ietf-5-quoting"/>
     <w:p>
       <w:pPr>
         <w:pStyle w:val="Heading3"/>
       </w:pPr>
+      <w:bookmarkStart w:id="59" w:name="_26e4bea6f8252c4978c4fb88ca5cd5227ac4d25"/>
       <w:r>
         <w:t xml:space="preserve">IETF-5: Quoting</w:t>
       </w:r>
+      <w:bookmarkEnd w:id="59"/>
     </w:p>
     <w:p>
       <w:pPr>
@@ -2969,7 +2975,7 @@
         </w:rPr>
         <w:t xml:space="preserve"> </w:t>
       </w:r>
-      <w:hyperlink r:id="rId57">
+      <w:hyperlink r:id="rId60">
         <w:r>
           <w:rPr>
             <w:rStyle w:val="Hyperlink"/>
@@ -3000,7 +3006,7 @@
         </w:rPr>
         <w:t xml:space="preserve"> </w:t>
       </w:r>
-      <w:hyperlink w:anchor="ref-RFC7950">
+      <w:hyperlink w:anchor="_9aa1375053d51ce8fa8cdf71cde3bc0571671c1">
         <w:r>
           <w:rPr>
             <w:rStyle w:val="Hyperlink"/>
@@ -3082,15 +3088,15 @@
         <w:t xml:space="preserve">  }</w:t>
       </w:r>
     </w:p>
-    <w:bookmarkEnd w:id="58"/>
-    <w:bookmarkStart w:id="60" w:name="sec:ietf-6-module-naming-conventions"/>
     <w:p>
       <w:pPr>
         <w:pStyle w:val="Heading3"/>
       </w:pPr>
+      <w:bookmarkStart w:id="61" w:name="_b37ac39e0dec648be19fdc71e663193d9624708"/>
       <w:r>
         <w:t xml:space="preserve">IETF-6: Module Naming Conventions</w:t>
       </w:r>
+      <w:bookmarkEnd w:id="61"/>
     </w:p>
     <w:p>
       <w:pPr>
@@ -3110,7 +3116,7 @@
         </w:rPr>
         <w:t xml:space="preserve"> </w:t>
       </w:r>
-      <w:hyperlink r:id="rId59">
+      <w:hyperlink r:id="rId62">
         <w:r>
           <w:rPr>
             <w:rStyle w:val="Hyperlink"/>
@@ -3141,7 +3147,7 @@
         </w:rPr>
         <w:t xml:space="preserve"> </w:t>
       </w:r>
-      <w:hyperlink w:anchor="ref-RFC8407">
+      <w:hyperlink w:anchor="_3ad76c0cb9b1ead647a1dff13fc24ddd70b3bb0">
         <w:r>
           <w:rPr>
             <w:rStyle w:val="Hyperlink"/>
@@ -3238,15 +3244,15 @@
         <w:t xml:space="preserve">.</w:t>
       </w:r>
     </w:p>
-    <w:bookmarkEnd w:id="60"/>
-    <w:bookmarkStart w:id="67" w:name="X6b1d9f9c38419ad118636afcc437f3f8656b382"/>
     <w:p>
       <w:pPr>
         <w:pStyle w:val="Heading3"/>
       </w:pPr>
+      <w:bookmarkStart w:id="63" w:name="_6b1d9f9c38419ad118636afcc437f3f8656b382"/>
       <w:r>
         <w:t xml:space="preserve">IETF-7: Module Header, Meta and Revision Statements</w:t>
       </w:r>
+      <w:bookmarkEnd w:id="63"/>
     </w:p>
     <w:p>
       <w:pPr>
@@ -3266,7 +3272,7 @@
         </w:rPr>
         <w:t xml:space="preserve"> </w:t>
       </w:r>
-      <w:hyperlink r:id="rId61">
+      <w:hyperlink r:id="rId64">
         <w:r>
           <w:rPr>
             <w:rStyle w:val="Hyperlink"/>
@@ -3297,7 +3303,7 @@
         </w:rPr>
         <w:t xml:space="preserve"> </w:t>
       </w:r>
-      <w:hyperlink w:anchor="ref-RFC8407">
+      <w:hyperlink w:anchor="_3ad76c0cb9b1ead647a1dff13fc24ddd70b3bb0">
         <w:r>
           <w:rPr>
             <w:rStyle w:val="Hyperlink"/>
@@ -3315,14 +3321,15 @@
         <w:t xml:space="preserve">.</w:t>
       </w:r>
     </w:p>
-    <w:bookmarkStart w:id="62" w:name="sec:namespace"/>
     <w:p>
       <w:pPr>
         <w:pStyle w:val="Heading4"/>
       </w:pPr>
+      <w:bookmarkStart w:id="65" w:name="_8423fb6d49f828feb050ae13fc3b3dded02076d"/>
       <w:r>
         <w:t xml:space="preserve">namespace</w:t>
       </w:r>
+      <w:bookmarkEnd w:id="65"/>
     </w:p>
     <w:p>
       <w:pPr>
@@ -3332,15 +3339,15 @@
         <w:t xml:space="preserve">See IETF-9.</w:t>
       </w:r>
     </w:p>
-    <w:bookmarkEnd w:id="62"/>
-    <w:bookmarkStart w:id="63" w:name="sec:organization"/>
     <w:p>
       <w:pPr>
         <w:pStyle w:val="Heading4"/>
       </w:pPr>
+      <w:bookmarkStart w:id="66" w:name="_b7c7a3c6a90c60f025168cdebc589109b887b24"/>
       <w:r>
         <w:t xml:space="preserve">organization</w:t>
       </w:r>
+      <w:bookmarkEnd w:id="66"/>
     </w:p>
     <w:p>
       <w:pPr>
@@ -3398,15 +3405,15 @@
         <w:t xml:space="preserve">  &lt;project stream name&gt; Project Stream";</w:t>
       </w:r>
     </w:p>
-    <w:bookmarkEnd w:id="63"/>
-    <w:bookmarkStart w:id="64" w:name="sec:contact"/>
     <w:p>
       <w:pPr>
         <w:pStyle w:val="Heading4"/>
       </w:pPr>
+      <w:bookmarkStart w:id="67" w:name="_279c74bcf58d78f98fea33b073941925a717fc3"/>
       <w:r>
         <w:t xml:space="preserve">contact</w:t>
       </w:r>
+      <w:bookmarkEnd w:id="67"/>
     </w:p>
     <w:p>
       <w:pPr>
@@ -3551,15 +3558,15 @@
         <w:t xml:space="preserve">  WA Director: &lt;name&gt;, &lt;company&gt;</w:t>
       </w:r>
     </w:p>
-    <w:bookmarkEnd w:id="64"/>
-    <w:bookmarkStart w:id="65" w:name="sec:description"/>
     <w:p>
       <w:pPr>
         <w:pStyle w:val="Heading4"/>
       </w:pPr>
+      <w:bookmarkStart w:id="68" w:name="_199e587f0c52df21f8b0a367cd8b9817b48761a"/>
       <w:r>
         <w:t xml:space="preserve">description</w:t>
       </w:r>
+      <w:bookmarkEnd w:id="68"/>
     </w:p>
     <w:p>
       <w:pPr>
@@ -3569,15 +3576,15 @@
         <w:t xml:space="preserve">See IETF-8.</w:t>
       </w:r>
     </w:p>
-    <w:bookmarkEnd w:id="65"/>
-    <w:bookmarkStart w:id="66" w:name="sec:revision"/>
     <w:p>
       <w:pPr>
         <w:pStyle w:val="Heading4"/>
       </w:pPr>
+      <w:bookmarkStart w:id="69" w:name="_47e9b6eeff93f0577b4a64294d25fdf8bb38eac"/>
       <w:r>
         <w:t xml:space="preserve">revision</w:t>
       </w:r>
+      <w:bookmarkEnd w:id="69"/>
     </w:p>
     <w:p>
       <w:pPr>
@@ -3673,16 +3680,15 @@
         <w:t xml:space="preserve">.</w:t>
       </w:r>
     </w:p>
-    <w:bookmarkEnd w:id="66"/>
-    <w:bookmarkEnd w:id="67"/>
-    <w:bookmarkStart w:id="68" w:name="X08b3505cb90c3b604f08700e4b6751d9d44e4a3"/>
     <w:p>
       <w:pPr>
         <w:pStyle w:val="Heading3"/>
       </w:pPr>
+      <w:bookmarkStart w:id="70" w:name="_08b3505cb90c3b604f08700e4b6751d9d44e4a3"/>
       <w:r>
         <w:t xml:space="preserve">IETF-8: Module Header, Meta and Revision Statements - Top Level Description</w:t>
       </w:r>
+      <w:bookmarkEnd w:id="70"/>
     </w:p>
     <w:p>
       <w:pPr>
@@ -3702,7 +3708,7 @@
         </w:rPr>
         <w:t xml:space="preserve"> </w:t>
       </w:r>
-      <w:hyperlink r:id="rId61">
+      <w:hyperlink r:id="rId64">
         <w:r>
           <w:rPr>
             <w:rStyle w:val="Hyperlink"/>
@@ -3733,7 +3739,7 @@
         </w:rPr>
         <w:t xml:space="preserve"> </w:t>
       </w:r>
-      <w:hyperlink w:anchor="ref-RFC8407">
+      <w:hyperlink w:anchor="_3ad76c0cb9b1ead647a1dff13fc24ddd70b3bb0">
         <w:r>
           <w:rPr>
             <w:rStyle w:val="Hyperlink"/>
@@ -3783,15 +3789,15 @@
         <w:t xml:space="preserve">BBF Notice Section</w:t>
       </w:r>
     </w:p>
-    <w:bookmarkEnd w:id="68"/>
-    <w:bookmarkStart w:id="70" w:name="sec:ietf-9-namespace-assignments"/>
     <w:p>
       <w:pPr>
         <w:pStyle w:val="Heading3"/>
       </w:pPr>
+      <w:bookmarkStart w:id="71" w:name="_e11e0cea20c5a00ee102445b8fb1bc689ff04f9"/>
       <w:r>
         <w:t xml:space="preserve">IETF-9: Namespace Assignments</w:t>
       </w:r>
+      <w:bookmarkEnd w:id="71"/>
     </w:p>
     <w:p>
       <w:pPr>
@@ -3811,7 +3817,7 @@
         </w:rPr>
         <w:t xml:space="preserve"> </w:t>
       </w:r>
-      <w:hyperlink r:id="rId69">
+      <w:hyperlink r:id="rId72">
         <w:r>
           <w:rPr>
             <w:rStyle w:val="Hyperlink"/>
@@ -3842,7 +3848,7 @@
         </w:rPr>
         <w:t xml:space="preserve"> </w:t>
       </w:r>
-      <w:hyperlink w:anchor="ref-RFC8407">
+      <w:hyperlink w:anchor="_3ad76c0cb9b1ead647a1dff13fc24ddd70b3bb0">
         <w:r>
           <w:rPr>
             <w:rStyle w:val="Hyperlink"/>
@@ -3944,15 +3950,15 @@
         <w:t xml:space="preserve">  urn:bbf:yang:&lt;module-name&gt;</w:t>
       </w:r>
     </w:p>
-    <w:bookmarkEnd w:id="70"/>
-    <w:bookmarkStart w:id="72" w:name="sec:ietf-10-prefixes---imported-modules"/>
     <w:p>
       <w:pPr>
         <w:pStyle w:val="Heading3"/>
       </w:pPr>
+      <w:bookmarkStart w:id="73" w:name="_b61dc949e4b94030c65e012501fe8a1f55d84b5"/>
       <w:r>
         <w:t xml:space="preserve">IETF-10: Prefixes - Imported Modules</w:t>
       </w:r>
+      <w:bookmarkEnd w:id="73"/>
     </w:p>
     <w:p>
       <w:pPr>
@@ -3972,7 +3978,7 @@
         </w:rPr>
         <w:t xml:space="preserve"> </w:t>
       </w:r>
-      <w:hyperlink r:id="rId71">
+      <w:hyperlink r:id="rId74">
         <w:r>
           <w:rPr>
             <w:rStyle w:val="Hyperlink"/>
@@ -4003,7 +4009,7 @@
         </w:rPr>
         <w:t xml:space="preserve"> </w:t>
       </w:r>
-      <w:hyperlink w:anchor="ref-RFC8407">
+      <w:hyperlink w:anchor="_3ad76c0cb9b1ead647a1dff13fc24ddd70b3bb0">
         <w:r>
           <w:rPr>
             <w:rStyle w:val="Hyperlink"/>
@@ -4143,15 +4149,15 @@
         <w:t xml:space="preserve">    ...</w:t>
       </w:r>
     </w:p>
-    <w:bookmarkEnd w:id="72"/>
-    <w:bookmarkStart w:id="74" w:name="sec:ietf-11-prefixes---usage"/>
     <w:p>
       <w:pPr>
         <w:pStyle w:val="Heading3"/>
       </w:pPr>
+      <w:bookmarkStart w:id="75" w:name="_c288c7b6eaec8219e6b694be9aac7ed199098ca"/>
       <w:r>
         <w:t xml:space="preserve">IETF-11: Prefixes - Usage</w:t>
       </w:r>
+      <w:bookmarkEnd w:id="75"/>
     </w:p>
     <w:p>
       <w:pPr>
@@ -4171,7 +4177,7 @@
         </w:rPr>
         <w:t xml:space="preserve"> </w:t>
       </w:r>
-      <w:hyperlink r:id="rId71">
+      <w:hyperlink r:id="rId74">
         <w:r>
           <w:rPr>
             <w:rStyle w:val="Hyperlink"/>
@@ -4202,7 +4208,7 @@
         </w:rPr>
         <w:t xml:space="preserve"> </w:t>
       </w:r>
-      <w:hyperlink w:anchor="ref-RFC8407">
+      <w:hyperlink w:anchor="_3ad76c0cb9b1ead647a1dff13fc24ddd70b3bb0">
         <w:r>
           <w:rPr>
             <w:rStyle w:val="Hyperlink"/>
@@ -4242,7 +4248,7 @@
       <w:r>
         <w:t xml:space="preserve"> </w:t>
       </w:r>
-      <w:hyperlink r:id="rId73">
+      <w:hyperlink r:id="rId76">
         <w:r>
           <w:rPr>
             <w:rStyle w:val="Hyperlink"/>
@@ -4259,7 +4265,7 @@
       <w:r>
         <w:t xml:space="preserve"> </w:t>
       </w:r>
-      <w:hyperlink w:anchor="ref-RFC7950">
+      <w:hyperlink w:anchor="_9aa1375053d51ce8fa8cdf71cde3bc0571671c1">
         <w:r>
           <w:rPr>
             <w:rStyle w:val="Hyperlink"/>
@@ -4295,15 +4301,15 @@
         <w:t xml:space="preserve">The local module prefix MAY be used for references to typedefs, groupings, extensions, features and identities defined in the module.</w:t>
       </w:r>
     </w:p>
-    <w:bookmarkEnd w:id="74"/>
-    <w:bookmarkStart w:id="76" w:name="X80044f5d3c8e8feac203f759e305a26d3483c81"/>
     <w:p>
       <w:pPr>
         <w:pStyle w:val="Heading3"/>
       </w:pPr>
+      <w:bookmarkStart w:id="77" w:name="_80044f5d3c8e8feac203f759e305a26d3483c81"/>
       <w:r>
         <w:t xml:space="preserve">IETF-12: Identifier Naming Conventions</w:t>
       </w:r>
+      <w:bookmarkEnd w:id="77"/>
     </w:p>
     <w:p>
       <w:pPr>
@@ -4323,7 +4329,7 @@
         </w:rPr>
         <w:t xml:space="preserve"> </w:t>
       </w:r>
-      <w:hyperlink r:id="rId75">
+      <w:hyperlink r:id="rId78">
         <w:r>
           <w:rPr>
             <w:rStyle w:val="Hyperlink"/>
@@ -4354,7 +4360,7 @@
         </w:rPr>
         <w:t xml:space="preserve"> </w:t>
       </w:r>
-      <w:hyperlink w:anchor="ref-RFC8407">
+      <w:hyperlink w:anchor="_3ad76c0cb9b1ead647a1dff13fc24ddd70b3bb0">
         <w:r>
           <w:rPr>
             <w:rStyle w:val="Hyperlink"/>
@@ -4428,15 +4434,15 @@
         <w:t xml:space="preserve">Identifiers SHOULD include complete words and/or well-known acronyms or abbreviations. There are some exceptions to this for performance reasons. See BBF-5 for further guidelines.</w:t>
       </w:r>
     </w:p>
-    <w:bookmarkEnd w:id="76"/>
-    <w:bookmarkStart w:id="78" w:name="sec:ietf-13-conditional-statements"/>
     <w:p>
       <w:pPr>
         <w:pStyle w:val="Heading3"/>
       </w:pPr>
+      <w:bookmarkStart w:id="79" w:name="_5fd63118332bd1533c4b3f4f34353d75870a0a2"/>
       <w:r>
         <w:t xml:space="preserve">IETF-13: Conditional Statements</w:t>
       </w:r>
+      <w:bookmarkEnd w:id="79"/>
     </w:p>
     <w:p>
       <w:pPr>
@@ -4456,7 +4462,7 @@
         </w:rPr>
         <w:t xml:space="preserve"> </w:t>
       </w:r>
-      <w:hyperlink r:id="rId77">
+      <w:hyperlink r:id="rId80">
         <w:r>
           <w:rPr>
             <w:rStyle w:val="Hyperlink"/>
@@ -4487,7 +4493,7 @@
         </w:rPr>
         <w:t xml:space="preserve"> </w:t>
       </w:r>
-      <w:hyperlink w:anchor="ref-RFC8407">
+      <w:hyperlink w:anchor="_3ad76c0cb9b1ead647a1dff13fc24ddd70b3bb0">
         <w:r>
           <w:rPr>
             <w:rStyle w:val="Hyperlink"/>
@@ -4537,15 +4543,15 @@
         <w:t xml:space="preserve">statement to constrain data based on other data nodes. At a minimum, the description should be used to convey a constraint which cannot be modeled.</w:t>
       </w:r>
     </w:p>
-    <w:bookmarkEnd w:id="78"/>
-    <w:bookmarkStart w:id="80" w:name="X7c516396929950e7009e7b01428c60f37f5e66f"/>
     <w:p>
       <w:pPr>
         <w:pStyle w:val="Heading3"/>
       </w:pPr>
+      <w:bookmarkStart w:id="81" w:name="_7c516396929950e7009e7b01428c60f37f5e66f"/>
       <w:r>
         <w:t xml:space="preserve">IETF-14: Conditional Augment Statements</w:t>
       </w:r>
+      <w:bookmarkEnd w:id="81"/>
     </w:p>
     <w:p>
       <w:pPr>
@@ -4565,7 +4571,7 @@
         </w:rPr>
         <w:t xml:space="preserve"> </w:t>
       </w:r>
-      <w:hyperlink r:id="rId79">
+      <w:hyperlink r:id="rId82">
         <w:r>
           <w:rPr>
             <w:rStyle w:val="Hyperlink"/>
@@ -4596,7 +4602,7 @@
         </w:rPr>
         <w:t xml:space="preserve"> </w:t>
       </w:r>
-      <w:hyperlink w:anchor="ref-RFC8407">
+      <w:hyperlink w:anchor="_3ad76c0cb9b1ead647a1dff13fc24ddd70b3bb0">
         <w:r>
           <w:rPr>
             <w:rStyle w:val="Hyperlink"/>
@@ -4678,15 +4684,15 @@
         <w:t xml:space="preserve">statements to each augment.</w:t>
       </w:r>
     </w:p>
-    <w:bookmarkEnd w:id="80"/>
-    <w:bookmarkStart w:id="82" w:name="Xd2cf503170de8fa411d07213b3f484e448ff459"/>
     <w:p>
       <w:pPr>
         <w:pStyle w:val="Heading3"/>
       </w:pPr>
+      <w:bookmarkStart w:id="83" w:name="_d2cf503170de8fa411d07213b3f484e448ff459"/>
       <w:r>
         <w:t xml:space="preserve">IETF-15: Import or Include By Revision</w:t>
       </w:r>
+      <w:bookmarkEnd w:id="83"/>
     </w:p>
     <w:p>
       <w:pPr>
@@ -4706,7 +4712,7 @@
         </w:rPr>
         <w:t xml:space="preserve"> </w:t>
       </w:r>
-      <w:hyperlink r:id="rId81">
+      <w:hyperlink r:id="rId84">
         <w:r>
           <w:rPr>
             <w:rStyle w:val="Hyperlink"/>
@@ -4737,7 +4743,7 @@
         </w:rPr>
         <w:t xml:space="preserve"> </w:t>
       </w:r>
-      <w:hyperlink w:anchor="ref-RFC8407">
+      <w:hyperlink w:anchor="_3ad76c0cb9b1ead647a1dff13fc24ddd70b3bb0">
         <w:r>
           <w:rPr>
             <w:rStyle w:val="Hyperlink"/>
@@ -4810,15 +4816,15 @@
         <w:t xml:space="preserve">on import and include statements.</w:t>
       </w:r>
     </w:p>
-    <w:bookmarkEnd w:id="82"/>
-    <w:bookmarkStart w:id="84" w:name="X780f7a06219eafeb084776145b6d63da678cf9a"/>
     <w:p>
       <w:pPr>
         <w:pStyle w:val="Heading3"/>
       </w:pPr>
+      <w:bookmarkStart w:id="85" w:name="_780f7a06219eafeb084776145b6d63da678cf9a"/>
       <w:r>
         <w:t xml:space="preserve">IETF-16: Legal Characters in YANG Modules</w:t>
       </w:r>
+      <w:bookmarkEnd w:id="85"/>
     </w:p>
     <w:p>
       <w:pPr>
@@ -4838,7 +4844,7 @@
         </w:rPr>
         <w:t xml:space="preserve"> </w:t>
       </w:r>
-      <w:hyperlink r:id="rId83">
+      <w:hyperlink r:id="rId86">
         <w:r>
           <w:rPr>
             <w:rStyle w:val="Hyperlink"/>
@@ -4869,7 +4875,7 @@
         </w:rPr>
         <w:t xml:space="preserve"> </w:t>
       </w:r>
-      <w:hyperlink w:anchor="ref-RFC7950">
+      <w:hyperlink w:anchor="_9aa1375053d51ce8fa8cdf71cde3bc0571671c1">
         <w:r>
           <w:rPr>
             <w:rStyle w:val="Hyperlink"/>
@@ -4895,12 +4901,11 @@
         <w:t xml:space="preserve">BBF YANG modules MUST be written using only printable ASCII characters.</w:t>
       </w:r>
     </w:p>
-    <w:bookmarkEnd w:id="84"/>
-    <w:bookmarkStart w:id="85" w:name="X7c19e059167da67820f4fb7766b40deca1bc898"/>
     <w:p>
       <w:pPr>
         <w:pStyle w:val="Heading3"/>
       </w:pPr>
+      <w:bookmarkStart w:id="87" w:name="_7c19e059167da67820f4fb7766b40deca1bc898"/>
       <w:r>
         <w:t xml:space="preserve">IETF-17: Prefix on</w:t>
       </w:r>
@@ -4916,6 +4921,7 @@
       <w:r>
         <w:t xml:space="preserve">Statements</w:t>
       </w:r>
+      <w:bookmarkEnd w:id="87"/>
     </w:p>
     <w:p>
       <w:pPr>
@@ -4935,7 +4941,7 @@
         </w:rPr>
         <w:t xml:space="preserve"> </w:t>
       </w:r>
-      <w:hyperlink r:id="rId71">
+      <w:hyperlink r:id="rId74">
         <w:r>
           <w:rPr>
             <w:rStyle w:val="Hyperlink"/>
@@ -4966,7 +4972,7 @@
         </w:rPr>
         <w:t xml:space="preserve"> </w:t>
       </w:r>
-      <w:hyperlink w:anchor="ref-RFC8407">
+      <w:hyperlink w:anchor="_3ad76c0cb9b1ead647a1dff13fc24ddd70b3bb0">
         <w:r>
           <w:rPr>
             <w:rStyle w:val="Hyperlink"/>
@@ -5101,12 +5107,11 @@
         <w:t xml:space="preserve">    ...</w:t>
       </w:r>
     </w:p>
-    <w:bookmarkEnd w:id="85"/>
-    <w:bookmarkStart w:id="87" w:name="Xcbd829666661b195829cbb3bb38c2991255df6e"/>
     <w:p>
       <w:pPr>
         <w:pStyle w:val="Heading3"/>
       </w:pPr>
+      <w:bookmarkStart w:id="88" w:name="_cbd829666661b195829cbb3bb38c2991255df6e"/>
       <w:r>
         <w:t xml:space="preserve">IETF-18:</w:t>
       </w:r>
@@ -5134,6 +5139,7 @@
       <w:r>
         <w:t xml:space="preserve">statement</w:t>
       </w:r>
+      <w:bookmarkEnd w:id="88"/>
     </w:p>
     <w:p>
       <w:pPr>
@@ -5153,7 +5159,7 @@
         </w:rPr>
         <w:t xml:space="preserve"> </w:t>
       </w:r>
-      <w:hyperlink r:id="rId86">
+      <w:hyperlink r:id="rId89">
         <w:r>
           <w:rPr>
             <w:rStyle w:val="Hyperlink"/>
@@ -5184,7 +5190,7 @@
         </w:rPr>
         <w:t xml:space="preserve"> </w:t>
       </w:r>
-      <w:hyperlink w:anchor="ref-RFC7950">
+      <w:hyperlink w:anchor="_9aa1375053d51ce8fa8cdf71cde3bc0571671c1">
         <w:r>
           <w:rPr>
             <w:rStyle w:val="Hyperlink"/>
@@ -5234,12 +5240,11 @@
         <w:t xml:space="preserve">statements in configuration data nodes for proper communication of the constraint validation failure.</w:t>
       </w:r>
     </w:p>
-    <w:bookmarkEnd w:id="87"/>
-    <w:bookmarkStart w:id="89" w:name="X80921fc05d606ee502d97a8f594d3fc1e4af16c"/>
     <w:p>
       <w:pPr>
         <w:pStyle w:val="Heading3"/>
       </w:pPr>
+      <w:bookmarkStart w:id="90" w:name="_80921fc05d606ee502d97a8f594d3fc1e4af16c"/>
       <w:r>
         <w:t xml:space="preserve">IETF-19:</w:t>
       </w:r>
@@ -5267,6 +5272,7 @@
       <w:r>
         <w:t xml:space="preserve">statement</w:t>
       </w:r>
+      <w:bookmarkEnd w:id="90"/>
     </w:p>
     <w:p>
       <w:pPr>
@@ -5286,7 +5292,7 @@
         </w:rPr>
         <w:t xml:space="preserve"> </w:t>
       </w:r>
-      <w:hyperlink r:id="rId88">
+      <w:hyperlink r:id="rId91">
         <w:r>
           <w:rPr>
             <w:rStyle w:val="Hyperlink"/>
@@ -5317,7 +5323,7 @@
         </w:rPr>
         <w:t xml:space="preserve"> </w:t>
       </w:r>
-      <w:hyperlink w:anchor="ref-RFC7950">
+      <w:hyperlink w:anchor="_9aa1375053d51ce8fa8cdf71cde3bc0571671c1">
         <w:r>
           <w:rPr>
             <w:rStyle w:val="Hyperlink"/>
@@ -5367,15 +5373,15 @@
         <w:t xml:space="preserve">condition in easy to understand language.</w:t>
       </w:r>
     </w:p>
-    <w:bookmarkEnd w:id="89"/>
-    <w:bookmarkStart w:id="90" w:name="sec:ietf-20-tabs-and-spacing"/>
     <w:p>
       <w:pPr>
         <w:pStyle w:val="Heading3"/>
       </w:pPr>
+      <w:bookmarkStart w:id="92" w:name="_a307ff9afa5b5ce6d68a8d31ef4ad3967443932"/>
       <w:r>
         <w:t xml:space="preserve">IETF-20: Tabs and Spacing</w:t>
       </w:r>
+      <w:bookmarkEnd w:id="92"/>
     </w:p>
     <w:p>
       <w:pPr>
@@ -5395,7 +5401,7 @@
         </w:rPr>
         <w:t xml:space="preserve"> </w:t>
       </w:r>
-      <w:hyperlink r:id="rId57">
+      <w:hyperlink r:id="rId60">
         <w:r>
           <w:rPr>
             <w:rStyle w:val="Hyperlink"/>
@@ -5426,7 +5432,7 @@
         </w:rPr>
         <w:t xml:space="preserve"> </w:t>
       </w:r>
-      <w:hyperlink w:anchor="ref-RFC7950">
+      <w:hyperlink w:anchor="_9aa1375053d51ce8fa8cdf71cde3bc0571671c1">
         <w:r>
           <w:rPr>
             <w:rStyle w:val="Hyperlink"/>
@@ -5452,15 +5458,15 @@
         <w:t xml:space="preserve">BBF YANG modules MUST NOT contain any tab characters and MUST use 2 space characters for indentation.</w:t>
       </w:r>
     </w:p>
-    <w:bookmarkEnd w:id="90"/>
-    <w:bookmarkStart w:id="92" w:name="sec:ietf-21-normative-language"/>
     <w:p>
       <w:pPr>
         <w:pStyle w:val="Heading3"/>
       </w:pPr>
+      <w:bookmarkStart w:id="93" w:name="_e6a333d15e9375ca8df3a7818e4907b118520da"/>
       <w:r>
         <w:t xml:space="preserve">IETF-21: Normative Language</w:t>
       </w:r>
+      <w:bookmarkEnd w:id="93"/>
     </w:p>
     <w:p>
       <w:pPr>
@@ -5480,7 +5486,7 @@
         </w:rPr>
         <w:t xml:space="preserve"> </w:t>
       </w:r>
-      <w:hyperlink r:id="rId91">
+      <w:hyperlink r:id="rId94">
         <w:r>
           <w:rPr>
             <w:rStyle w:val="Hyperlink"/>
@@ -5511,7 +5517,7 @@
         </w:rPr>
         <w:t xml:space="preserve"> </w:t>
       </w:r>
-      <w:hyperlink w:anchor="ref-RFC8407">
+      <w:hyperlink w:anchor="_3ad76c0cb9b1ead647a1dff13fc24ddd70b3bb0">
         <w:r>
           <w:rPr>
             <w:rStyle w:val="Hyperlink"/>
@@ -5539,7 +5545,7 @@
       <w:r>
         <w:t xml:space="preserve"> </w:t>
       </w:r>
-      <w:hyperlink w:anchor="ref-RFC2119">
+      <w:hyperlink w:anchor="_6c4b3b0cc44b9f22320d733ea58300db69e066a">
         <w:r>
           <w:rPr>
             <w:rStyle w:val="Hyperlink"/>
@@ -5556,7 +5562,7 @@
       <w:r>
         <w:t xml:space="preserve"> </w:t>
       </w:r>
-      <w:hyperlink w:anchor="ref-RFC8174">
+      <w:hyperlink w:anchor="_943b97c665eaf72ff6d393a545d612758cbcb3a">
         <w:r>
           <w:rPr>
             <w:rStyle w:val="Hyperlink"/>
@@ -5576,12 +5582,11 @@
         <w:t xml:space="preserve">This does not apply to the license text included as part of each top-level module description.</w:t>
       </w:r>
     </w:p>
-    <w:bookmarkEnd w:id="92"/>
-    <w:bookmarkStart w:id="94" w:name="sec:ietf-22-leafref-path-in-a-grouping"/>
     <w:p>
       <w:pPr>
         <w:pStyle w:val="Heading3"/>
       </w:pPr>
+      <w:bookmarkStart w:id="95" w:name="_d839f6baaa49978eb0da7f863295182e163b00e"/>
       <w:r>
         <w:t xml:space="preserve">IETF-22:</w:t>
       </w:r>
@@ -5603,6 +5608,7 @@
       <w:r>
         <w:t xml:space="preserve">‘grouping’</w:t>
       </w:r>
+      <w:bookmarkEnd w:id="95"/>
     </w:p>
     <w:p>
       <w:pPr>
@@ -5622,7 +5628,7 @@
         </w:rPr>
         <w:t xml:space="preserve"> </w:t>
       </w:r>
-      <w:hyperlink r:id="rId93">
+      <w:hyperlink r:id="rId96">
         <w:r>
           <w:rPr>
             <w:rStyle w:val="Hyperlink"/>
@@ -5653,7 +5659,7 @@
         </w:rPr>
         <w:t xml:space="preserve"> </w:t>
       </w:r>
-      <w:hyperlink w:anchor="ref-RFC8407">
+      <w:hyperlink w:anchor="_3ad76c0cb9b1ead647a1dff13fc24ddd70b3bb0">
         <w:r>
           <w:rPr>
             <w:rStyle w:val="Hyperlink"/>
@@ -6098,15 +6104,15 @@
         <w:t xml:space="preserve">}</w:t>
       </w:r>
     </w:p>
-    <w:bookmarkEnd w:id="94"/>
-    <w:bookmarkStart w:id="95" w:name="sec:ietf-23-prefix-naming-conventions"/>
     <w:p>
       <w:pPr>
         <w:pStyle w:val="Heading3"/>
       </w:pPr>
+      <w:bookmarkStart w:id="97" w:name="_5543cb58a26b4dd4233126a263034d14c333066"/>
       <w:r>
         <w:t xml:space="preserve">IETF-23: Prefix Naming Conventions</w:t>
       </w:r>
+      <w:bookmarkEnd w:id="97"/>
     </w:p>
     <w:p>
       <w:pPr>
@@ -6126,7 +6132,7 @@
         </w:rPr>
         <w:t xml:space="preserve"> </w:t>
       </w:r>
-      <w:hyperlink r:id="rId71">
+      <w:hyperlink r:id="rId74">
         <w:r>
           <w:rPr>
             <w:rStyle w:val="Hyperlink"/>
@@ -6157,7 +6163,7 @@
         </w:rPr>
         <w:t xml:space="preserve"> </w:t>
       </w:r>
-      <w:hyperlink w:anchor="ref-RFC8407">
+      <w:hyperlink w:anchor="_3ad76c0cb9b1ead647a1dff13fc24ddd70b3bb0">
         <w:r>
           <w:rPr>
             <w:rStyle w:val="Hyperlink"/>
@@ -6204,16 +6210,15 @@
         <w:t xml:space="preserve">in the module bbf-yang-types.</w:t>
       </w:r>
     </w:p>
-    <w:bookmarkEnd w:id="95"/>
-    <w:bookmarkEnd w:id="96"/>
-    <w:bookmarkStart w:id="139" w:name="sec:bbf-yang-guidelines"/>
     <w:p>
       <w:pPr>
         <w:pStyle w:val="Heading2"/>
       </w:pPr>
+      <w:bookmarkStart w:id="98" w:name="_e3acf4298635d407175b20c9f4a20ec747f17a3"/>
       <w:r>
         <w:t xml:space="preserve">BBF YANG Guidelines</w:t>
       </w:r>
+      <w:bookmarkEnd w:id="98"/>
     </w:p>
     <w:p>
       <w:pPr>
@@ -6229,14 +6234,15 @@
         <w:t xml:space="preserve">YANG Guidelines.</w:t>
       </w:r>
     </w:p>
-    <w:bookmarkStart w:id="97" w:name="sec:bbf-1-use-of-ianaietf-yang-modules"/>
     <w:p>
       <w:pPr>
         <w:pStyle w:val="Heading3"/>
       </w:pPr>
+      <w:bookmarkStart w:id="99" w:name="_9ea64ebd25596fb3effe929535d7b472e00bf8b"/>
       <w:r>
         <w:t xml:space="preserve">BBF-1: Use of IANA/IETF YANG Modules</w:t>
       </w:r>
+      <w:bookmarkEnd w:id="99"/>
     </w:p>
     <w:p>
       <w:pPr>
@@ -6284,15 +6290,15 @@
         <w:t xml:space="preserve">are applicable.</w:t>
       </w:r>
     </w:p>
-    <w:bookmarkEnd w:id="97"/>
-    <w:bookmarkStart w:id="98" w:name="sec:bbf-2-line-length"/>
     <w:p>
       <w:pPr>
         <w:pStyle w:val="Heading3"/>
       </w:pPr>
+      <w:bookmarkStart w:id="100" w:name="_4a5293c3866b939730d6b7bff464ef3e368b7c9"/>
       <w:r>
         <w:t xml:space="preserve">BBF-2: Line Length</w:t>
       </w:r>
+      <w:bookmarkEnd w:id="100"/>
     </w:p>
     <w:p>
       <w:pPr>
@@ -6302,15 +6308,15 @@
         <w:t xml:space="preserve">The length of each line of text in a YANG module MUST not exceed 70 characters.</w:t>
       </w:r>
     </w:p>
-    <w:bookmarkEnd w:id="98"/>
-    <w:bookmarkStart w:id="99" w:name="sec:bbf-3-deviations"/>
     <w:p>
       <w:pPr>
         <w:pStyle w:val="Heading3"/>
       </w:pPr>
+      <w:bookmarkStart w:id="101" w:name="_5617861ce55b119a78068f1d0579b64f74ebe73"/>
       <w:r>
         <w:t xml:space="preserve">BBF-3: Deviations</w:t>
       </w:r>
+      <w:bookmarkEnd w:id="101"/>
     </w:p>
     <w:p>
       <w:pPr>
@@ -6328,15 +6334,15 @@
         <w:t xml:space="preserve">However, deviations can be used alongside BBF YANG modules as described in the section BBF Deviation Guidelines.</w:t>
       </w:r>
     </w:p>
-    <w:bookmarkEnd w:id="99"/>
-    <w:bookmarkStart w:id="100" w:name="sec:bbf-4-short-names"/>
     <w:p>
       <w:pPr>
         <w:pStyle w:val="Heading3"/>
       </w:pPr>
+      <w:bookmarkStart w:id="102" w:name="_7a7c89436cc3c88a141d32f2f60c304482ac24d"/>
       <w:r>
         <w:t xml:space="preserve">BBF-4: Short Names</w:t>
       </w:r>
+      <w:bookmarkEnd w:id="102"/>
     </w:p>
     <w:p>
       <w:pPr>
@@ -6346,15 +6352,15 @@
         <w:t xml:space="preserve">Lists and leaf-lists may have many elements resulting in large amounts of data present on the line. For XML encoding, the name of each node appears twice for every element of the list or leaf-list. Although IETF-12 states that identifiers SHOULD include complete words, the expedient use of short names SHOULD be imposed to shorten on-the-wire messaging and improve efficiency.</w:t>
       </w:r>
     </w:p>
-    <w:bookmarkEnd w:id="100"/>
-    <w:bookmarkStart w:id="101" w:name="sec:bbf-5-descriptions-and-references"/>
     <w:p>
       <w:pPr>
         <w:pStyle w:val="Heading3"/>
       </w:pPr>
+      <w:bookmarkStart w:id="103" w:name="_1a71e76912fad3a8cf4edf89b4ee4e82c8ae1cb"/>
       <w:r>
         <w:t xml:space="preserve">BBF-5: Descriptions and References</w:t>
       </w:r>
+      <w:bookmarkEnd w:id="103"/>
     </w:p>
     <w:p>
       <w:pPr>
@@ -6366,7 +6372,7 @@
       <w:r>
         <w:t xml:space="preserve"> </w:t>
       </w:r>
-      <w:hyperlink w:anchor="sec:bbf-25-reference-statements">
+      <w:hyperlink w:anchor="_c26aa4a4935e7c62609c448c2df4a73231b7f52">
         <w:r>
           <w:rPr>
             <w:rStyle w:val="Hyperlink"/>
@@ -6381,15 +6387,15 @@
         <w:t xml:space="preserve">need not meet this requirement and do not need to terminate with a period.</w:t>
       </w:r>
     </w:p>
-    <w:bookmarkEnd w:id="101"/>
-    <w:bookmarkStart w:id="102" w:name="sec:bbf-6-special-values"/>
     <w:p>
       <w:pPr>
         <w:pStyle w:val="Heading3"/>
       </w:pPr>
+      <w:bookmarkStart w:id="104" w:name="_c44d917991b22256a09a5f9c45a4244d6940c98"/>
       <w:r>
         <w:t xml:space="preserve">BBF-6: Special Values</w:t>
       </w:r>
+      <w:bookmarkEnd w:id="104"/>
     </w:p>
     <w:p>
       <w:pPr>
@@ -6638,15 +6644,15 @@
         <w:t xml:space="preserve">refers to a value which is undetermined.</w:t>
       </w:r>
     </w:p>
-    <w:bookmarkEnd w:id="102"/>
-    <w:bookmarkStart w:id="103" w:name="Xbd0877fc21f18b9e0b42c79cdcd23a12ea24acb"/>
     <w:p>
       <w:pPr>
         <w:pStyle w:val="Heading3"/>
       </w:pPr>
+      <w:bookmarkStart w:id="105" w:name="_bd0877fc21f18b9e0b42c79cdcd23a12ea24acb"/>
       <w:r>
         <w:t xml:space="preserve">BBF-7: Paragraph Separation in Description Statements</w:t>
       </w:r>
+      <w:bookmarkEnd w:id="105"/>
     </w:p>
     <w:p>
       <w:pPr>
@@ -6696,15 +6702,15 @@
         <w:t xml:space="preserve">     This is the second paragraph of the description.";</w:t>
       </w:r>
     </w:p>
-    <w:bookmarkEnd w:id="103"/>
-    <w:bookmarkStart w:id="104" w:name="sec:bbf-8-revision-statements"/>
     <w:p>
       <w:pPr>
         <w:pStyle w:val="Heading3"/>
       </w:pPr>
+      <w:bookmarkStart w:id="106" w:name="_14ce8348646aa74b044fc9125d90fc9e928ec70"/>
       <w:r>
         <w:t xml:space="preserve">BBF-8: Revision Statements</w:t>
       </w:r>
+      <w:bookmarkEnd w:id="106"/>
     </w:p>
     <w:p>
       <w:pPr>
@@ -6714,15 +6720,15 @@
         <w:t xml:space="preserve">Superseded by BBF-15.</w:t>
       </w:r>
     </w:p>
-    <w:bookmarkEnd w:id="104"/>
-    <w:bookmarkStart w:id="105" w:name="sec:bbf-9-explicit-modeling"/>
     <w:p>
       <w:pPr>
         <w:pStyle w:val="Heading3"/>
       </w:pPr>
+      <w:bookmarkStart w:id="107" w:name="_db0df948887baf66e9b1cd9a008679f685e43a7"/>
       <w:r>
         <w:t xml:space="preserve">BBF-9: Explicit Modeling</w:t>
       </w:r>
+      <w:bookmarkEnd w:id="107"/>
     </w:p>
     <w:p>
       <w:pPr>
@@ -6865,15 +6871,15 @@
         <w:t xml:space="preserve">  }</w:t>
       </w:r>
     </w:p>
-    <w:bookmarkEnd w:id="105"/>
-    <w:bookmarkStart w:id="106" w:name="Xc8822cf271b3ba3489c4f60b5f40bba4bb3e20d"/>
     <w:p>
       <w:pPr>
         <w:pStyle w:val="Heading3"/>
       </w:pPr>
+      <w:bookmarkStart w:id="108" w:name="_c8822cf271b3ba3489c4f60b5f40bba4bb3e20d"/>
       <w:r>
         <w:t xml:space="preserve">BBF-10: Retroactive Application of OD-360 Guidelines</w:t>
       </w:r>
+      <w:bookmarkEnd w:id="108"/>
     </w:p>
     <w:p>
       <w:pPr>
@@ -6895,15 +6901,15 @@
         <w:t xml:space="preserve">MUST NOT be changed in published module as the resulting renaming is not backward compatible.</w:t>
       </w:r>
     </w:p>
-    <w:bookmarkEnd w:id="106"/>
-    <w:bookmarkStart w:id="107" w:name="sec:bbf-11-multi-word-identifiers"/>
     <w:p>
       <w:pPr>
         <w:pStyle w:val="Heading3"/>
       </w:pPr>
+      <w:bookmarkStart w:id="109" w:name="_3bae65f223544515e0679e83ff8433e2bdc2058"/>
       <w:r>
         <w:t xml:space="preserve">BBF-11: Multi-word Identifiers</w:t>
       </w:r>
+      <w:bookmarkEnd w:id="109"/>
     </w:p>
     <w:p>
       <w:pPr>
@@ -6922,15 +6928,15 @@
         <w:t xml:space="preserve">.</w:t>
       </w:r>
     </w:p>
-    <w:bookmarkEnd w:id="107"/>
-    <w:bookmarkStart w:id="108" w:name="X967a2fedd362844d661e2a0b6a18bc64ee49eef"/>
     <w:p>
       <w:pPr>
         <w:pStyle w:val="Heading3"/>
       </w:pPr>
+      <w:bookmarkStart w:id="110" w:name="_967a2fedd362844d661e2a0b6a18bc64ee49eef"/>
       <w:r>
         <w:t xml:space="preserve">BBF-12: Acronyms in Description Statements</w:t>
       </w:r>
+      <w:bookmarkEnd w:id="110"/>
     </w:p>
     <w:p>
       <w:pPr>
@@ -7013,15 +7019,15 @@
         <w:t xml:space="preserve">  }</w:t>
       </w:r>
     </w:p>
-    <w:bookmarkEnd w:id="108"/>
-    <w:bookmarkStart w:id="109" w:name="X990ed97808c690fc0c84dc0b1ccdecd491363d3"/>
     <w:p>
       <w:pPr>
         <w:pStyle w:val="Heading3"/>
       </w:pPr>
+      <w:bookmarkStart w:id="111" w:name="_990ed97808c690fc0c84dc0b1ccdecd491363d3"/>
       <w:r>
         <w:t xml:space="preserve">BBF-13: Abbreviations in Description Statements</w:t>
       </w:r>
+      <w:bookmarkEnd w:id="111"/>
     </w:p>
     <w:p>
       <w:pPr>
@@ -7031,15 +7037,15 @@
         <w:t xml:space="preserve">Abbreviations can be used in description statements. However, the first instance of the abbreviation in a description statement SHOULD have its meaning clearly conveyed.</w:t>
       </w:r>
     </w:p>
-    <w:bookmarkEnd w:id="109"/>
-    <w:bookmarkStart w:id="110" w:name="X365a74e662931a7eefdfcf499af0597b5ba63d7"/>
     <w:p>
       <w:pPr>
         <w:pStyle w:val="Heading3"/>
       </w:pPr>
+      <w:bookmarkStart w:id="112" w:name="_365a74e662931a7eefdfcf499af0597b5ba63d7"/>
       <w:r>
         <w:t xml:space="preserve">BBF-14: Creating and/or Extending BBF YANG Models</w:t>
       </w:r>
+      <w:bookmarkEnd w:id="112"/>
     </w:p>
     <w:p>
       <w:pPr>
@@ -7059,6 +7065,7 @@
     </w:p>
     <w:p>
       <w:pPr>
+        <w:pStyle w:val="FirstParagraph"/>
         <w:numPr>
           <w:ilvl w:val="0"/>
           <w:numId w:val="1019"/>
@@ -7089,6 +7096,7 @@
     </w:p>
     <w:p>
       <w:pPr>
+        <w:pStyle w:val="FirstParagraph"/>
         <w:numPr>
           <w:ilvl w:val="0"/>
           <w:numId w:val="1019"/>
@@ -7119,6 +7127,7 @@
     </w:p>
     <w:p>
       <w:pPr>
+        <w:pStyle w:val="FirstParagraph"/>
         <w:numPr>
           <w:ilvl w:val="0"/>
           <w:numId w:val="1019"/>
@@ -7143,6 +7152,7 @@
     </w:p>
     <w:p>
       <w:pPr>
+        <w:pStyle w:val="FirstParagraph"/>
         <w:numPr>
           <w:ilvl w:val="1"/>
           <w:numId w:val="1020"/>
@@ -7154,6 +7164,7 @@
     </w:p>
     <w:p>
       <w:pPr>
+        <w:pStyle w:val="FirstParagraph"/>
         <w:numPr>
           <w:ilvl w:val="1"/>
           <w:numId w:val="1020"/>
@@ -7165,6 +7176,7 @@
     </w:p>
     <w:p>
       <w:pPr>
+        <w:pStyle w:val="FirstParagraph"/>
         <w:numPr>
           <w:ilvl w:val="1"/>
           <w:numId w:val="1020"/>
@@ -7176,6 +7188,7 @@
     </w:p>
     <w:p>
       <w:pPr>
+        <w:pStyle w:val="FirstParagraph"/>
         <w:numPr>
           <w:ilvl w:val="1"/>
           <w:numId w:val="1020"/>
@@ -7187,6 +7200,7 @@
     </w:p>
     <w:p>
       <w:pPr>
+        <w:pStyle w:val="FirstParagraph"/>
         <w:numPr>
           <w:ilvl w:val="1"/>
           <w:numId w:val="1020"/>
@@ -7196,15 +7210,15 @@
         <w:t xml:space="preserve">The new requirement must be reviewed by any Work Area(s) or Project Stream(s) for which it is clearly applicable (e.g., a PON related requirement is to be reviewed by the FAN WA).</w:t>
       </w:r>
     </w:p>
-    <w:bookmarkEnd w:id="110"/>
-    <w:bookmarkStart w:id="114" w:name="Xfd86df72343459f7f132fd88c2e94d18a11bec1"/>
     <w:p>
       <w:pPr>
         <w:pStyle w:val="Heading3"/>
       </w:pPr>
+      <w:bookmarkStart w:id="113" w:name="_fd86df72343459f7f132fd88c2e94d18a11bec1"/>
       <w:r>
         <w:t xml:space="preserve">BBF-15: YANG Model Revisions and License</w:t>
       </w:r>
+      <w:bookmarkEnd w:id="113"/>
     </w:p>
     <w:p>
       <w:pPr>
@@ -7258,14 +7272,15 @@
         <w:t xml:space="preserve">In order to allow BBF members to consume BBF YANG models in any state, the following apply with regards to revision statements and license text.</w:t>
       </w:r>
     </w:p>
-    <w:bookmarkStart w:id="111" w:name="sec:published"/>
     <w:p>
       <w:pPr>
         <w:pStyle w:val="Heading4"/>
       </w:pPr>
+      <w:bookmarkStart w:id="114" w:name="_bf6a83b498383e2f1b6f60b1f9a290a0924f71e"/>
       <w:r>
         <w:t xml:space="preserve">Published</w:t>
       </w:r>
+      <w:bookmarkEnd w:id="114"/>
     </w:p>
     <w:p>
       <w:pPr>
@@ -7311,15 +7326,15 @@
         <w:t xml:space="preserve">contain the standard BBF software license with correct copyright year(s).</w:t>
       </w:r>
     </w:p>
-    <w:bookmarkEnd w:id="111"/>
-    <w:bookmarkStart w:id="112" w:name="sec:draft"/>
     <w:p>
       <w:pPr>
         <w:pStyle w:val="Heading4"/>
       </w:pPr>
+      <w:bookmarkStart w:id="115" w:name="_991fc34a4c1a5155722d47533ec0f7b9e35fc74"/>
       <w:r>
         <w:t xml:space="preserve">Draft</w:t>
       </w:r>
+      <w:bookmarkEnd w:id="115"/>
     </w:p>
     <w:p>
       <w:pPr>
@@ -7365,15 +7380,15 @@
         <w:t xml:space="preserve">contain the draft BBF software license with correct copyright year(s).</w:t>
       </w:r>
     </w:p>
-    <w:bookmarkEnd w:id="112"/>
-    <w:bookmarkStart w:id="113" w:name="sec:development"/>
     <w:p>
       <w:pPr>
         <w:pStyle w:val="Heading4"/>
       </w:pPr>
+      <w:bookmarkStart w:id="116" w:name="_27088a095ca65ffedf053a04aa8b9c3bb010b8d"/>
       <w:r>
         <w:t xml:space="preserve">Development</w:t>
       </w:r>
+      <w:bookmarkEnd w:id="116"/>
     </w:p>
     <w:p>
       <w:pPr>
@@ -7529,16 +7544,15 @@
         <w:t xml:space="preserve">  }</w:t>
       </w:r>
     </w:p>
-    <w:bookmarkEnd w:id="113"/>
-    <w:bookmarkEnd w:id="114"/>
-    <w:bookmarkStart w:id="115" w:name="sec:bbf-16-enum-naming"/>
     <w:p>
       <w:pPr>
         <w:pStyle w:val="Heading3"/>
       </w:pPr>
+      <w:bookmarkStart w:id="117" w:name="_84b4cfabcb4b441b24468100ddcd523e7c4741f"/>
       <w:r>
         <w:t xml:space="preserve">BBF-16: Enum Naming</w:t>
       </w:r>
+      <w:bookmarkEnd w:id="117"/>
     </w:p>
     <w:p>
       <w:pPr>
@@ -7919,15 +7933,15 @@
         <w:t xml:space="preserve">    }</w:t>
       </w:r>
     </w:p>
-    <w:bookmarkEnd w:id="115"/>
-    <w:bookmarkStart w:id="116" w:name="sec:bbf-17-value-statements"/>
     <w:p>
       <w:pPr>
         <w:pStyle w:val="Heading3"/>
       </w:pPr>
+      <w:bookmarkStart w:id="118" w:name="_3c99dd0f9ebd140fdf429a8240fecc08008f7f7"/>
       <w:r>
         <w:t xml:space="preserve">BBF-17: Value Statements</w:t>
       </w:r>
+      <w:bookmarkEnd w:id="118"/>
     </w:p>
     <w:p>
       <w:pPr>
@@ -8198,12 +8212,11 @@
         <w:t xml:space="preserve">    }</w:t>
       </w:r>
     </w:p>
-    <w:bookmarkEnd w:id="116"/>
-    <w:bookmarkStart w:id="117" w:name="Xc0a7f9e5a82313fbca8666f2d3b491f4f3b8663"/>
     <w:p>
       <w:pPr>
         <w:pStyle w:val="Heading3"/>
       </w:pPr>
+      <w:bookmarkStart w:id="119" w:name="_c0a7f9e5a82313fbca8666f2d3b491f4f3b8663"/>
       <w:r>
         <w:t xml:space="preserve">BBF-18: Prefix on</w:t>
       </w:r>
@@ -8219,6 +8232,7 @@
       <w:r>
         <w:t xml:space="preserve">Statements</w:t>
       </w:r>
+      <w:bookmarkEnd w:id="119"/>
     </w:p>
     <w:p>
       <w:pPr>
@@ -8536,15 +8550,15 @@
         <w:t xml:space="preserve">  }</w:t>
       </w:r>
     </w:p>
-    <w:bookmarkEnd w:id="117"/>
-    <w:bookmarkStart w:id="120" w:name="Xcb8ec127efd0a3543271a81f49bbc6152df386b"/>
     <w:p>
       <w:pPr>
         <w:pStyle w:val="Heading3"/>
       </w:pPr>
+      <w:bookmarkStart w:id="120" w:name="_cb8ec127efd0a3543271a81f49bbc6152df386b"/>
       <w:r>
         <w:t xml:space="preserve">BBF-19: Default Case of a Choice Statement - Empty Typed Leaf</w:t>
       </w:r>
+      <w:bookmarkEnd w:id="120"/>
     </w:p>
     <w:p>
       <w:pPr>
@@ -8564,7 +8578,7 @@
         </w:rPr>
         <w:t xml:space="preserve"> </w:t>
       </w:r>
-      <w:hyperlink r:id="rId118">
+      <w:hyperlink r:id="rId121">
         <w:r>
           <w:rPr>
             <w:rStyle w:val="Hyperlink"/>
@@ -8595,7 +8609,7 @@
         </w:rPr>
         <w:t xml:space="preserve"> </w:t>
       </w:r>
-      <w:hyperlink r:id="rId119">
+      <w:hyperlink r:id="rId122">
         <w:r>
           <w:rPr>
             <w:rStyle w:val="Hyperlink"/>
@@ -8626,7 +8640,7 @@
         </w:rPr>
         <w:t xml:space="preserve"> </w:t>
       </w:r>
-      <w:hyperlink w:anchor="ref-RFC7950">
+      <w:hyperlink w:anchor="_9aa1375053d51ce8fa8cdf71cde3bc0571671c1">
         <w:r>
           <w:rPr>
             <w:rStyle w:val="Hyperlink"/>
@@ -9031,12 +9045,11 @@
         <w:t xml:space="preserve">  }</w:t>
       </w:r>
     </w:p>
-    <w:bookmarkEnd w:id="120"/>
-    <w:bookmarkStart w:id="121" w:name="Xa6044de28c4be7f5f32a38ecbb8c01b0d409037"/>
     <w:p>
       <w:pPr>
         <w:pStyle w:val="Heading3"/>
       </w:pPr>
+      <w:bookmarkStart w:id="123" w:name="_a6044de28c4be7f5f32a38ecbb8c01b0d409037"/>
       <w:r>
         <w:t xml:space="preserve">BBF-20: Formatting</w:t>
       </w:r>
@@ -9052,6 +9065,7 @@
       <w:r>
         <w:t xml:space="preserve">statements</w:t>
       </w:r>
+      <w:bookmarkEnd w:id="123"/>
     </w:p>
     <w:p>
       <w:pPr>
@@ -9130,7 +9144,7 @@
       <w:r>
         <w:t xml:space="preserve"> </w:t>
       </w:r>
-      <w:hyperlink w:anchor="ref-RFC7950">
+      <w:hyperlink w:anchor="_9aa1375053d51ce8fa8cdf71cde3bc0571671c1">
         <w:r>
           <w:rPr>
             <w:rStyle w:val="Hyperlink"/>
@@ -9144,7 +9158,7 @@
       <w:r>
         <w:t xml:space="preserve"> </w:t>
       </w:r>
-      <w:hyperlink r:id="rId57">
+      <w:hyperlink r:id="rId60">
         <w:r>
           <w:rPr>
             <w:rStyle w:val="Hyperlink"/>
@@ -9262,15 +9276,15 @@
         <w:t xml:space="preserve">&lt;error-message&gt;The name of a multicast interface to host can not be the name of a multicast network interface.&lt;/error-message&gt;</w:t>
       </w:r>
     </w:p>
-    <w:bookmarkEnd w:id="121"/>
-    <w:bookmarkStart w:id="122" w:name="X4dec392c9843aa4f569c2015eb960eb0d83ae6b"/>
     <w:p>
       <w:pPr>
         <w:pStyle w:val="Heading3"/>
       </w:pPr>
+      <w:bookmarkStart w:id="124" w:name="_4dec392c9843aa4f569c2015eb960eb0d83ae6b"/>
       <w:r>
         <w:t xml:space="preserve">BBF-21: Deprecating and Obsoleting Data Nodes</w:t>
       </w:r>
+      <w:bookmarkEnd w:id="124"/>
     </w:p>
     <w:p>
       <w:pPr>
@@ -9426,15 +9440,15 @@
         <w:t xml:space="preserve">The obsoleted data nodes MUST never be deleted from the YANG model.</w:t>
       </w:r>
     </w:p>
-    <w:bookmarkEnd w:id="122"/>
-    <w:bookmarkStart w:id="125" w:name="sec:bbf-22-backwards-compatibility"/>
     <w:p>
       <w:pPr>
         <w:pStyle w:val="Heading3"/>
       </w:pPr>
+      <w:bookmarkStart w:id="125" w:name="_e77f95c44ceaac832290315e7dead456592ef93"/>
       <w:r>
         <w:t xml:space="preserve">BBF-22: Backwards Compatibility</w:t>
       </w:r>
+      <w:bookmarkEnd w:id="125"/>
     </w:p>
     <w:p>
       <w:pPr>
@@ -9454,7 +9468,7 @@
       <w:r>
         <w:t xml:space="preserve"> </w:t>
       </w:r>
-      <w:hyperlink w:anchor="ref-RFC7950">
+      <w:hyperlink w:anchor="_9aa1375053d51ce8fa8cdf71cde3bc0571671c1">
         <w:r>
           <w:rPr>
             <w:rStyle w:val="Hyperlink"/>
@@ -9471,7 +9485,7 @@
       <w:r>
         <w:t xml:space="preserve"> </w:t>
       </w:r>
-      <w:hyperlink r:id="rId123">
+      <w:hyperlink r:id="rId126">
         <w:r>
           <w:rPr>
             <w:rStyle w:val="Hyperlink"/>
@@ -9485,7 +9499,7 @@
       <w:r>
         <w:t xml:space="preserve"> </w:t>
       </w:r>
-      <w:hyperlink w:anchor="ref-RFC7950">
+      <w:hyperlink w:anchor="_9aa1375053d51ce8fa8cdf71cde3bc0571671c1">
         <w:r>
           <w:rPr>
             <w:rStyle w:val="Hyperlink"/>
@@ -9502,7 +9516,7 @@
       <w:r>
         <w:t xml:space="preserve"> </w:t>
       </w:r>
-      <w:hyperlink r:id="rId124">
+      <w:hyperlink r:id="rId127">
         <w:r>
           <w:rPr>
             <w:rStyle w:val="Hyperlink"/>
@@ -9539,7 +9553,7 @@
       <w:r>
         <w:t xml:space="preserve"> </w:t>
       </w:r>
-      <w:hyperlink w:anchor="ref-RFC7950">
+      <w:hyperlink w:anchor="_9aa1375053d51ce8fa8cdf71cde3bc0571671c1">
         <w:r>
           <w:rPr>
             <w:rStyle w:val="Hyperlink"/>
@@ -9556,7 +9570,7 @@
       <w:r>
         <w:t xml:space="preserve"> </w:t>
       </w:r>
-      <w:hyperlink r:id="rId123">
+      <w:hyperlink r:id="rId126">
         <w:r>
           <w:rPr>
             <w:rStyle w:val="Hyperlink"/>
@@ -9585,7 +9599,7 @@
       <w:r>
         <w:t xml:space="preserve"> </w:t>
       </w:r>
-      <w:hyperlink w:anchor="ref-RFC7950">
+      <w:hyperlink w:anchor="_9aa1375053d51ce8fa8cdf71cde3bc0571671c1">
         <w:r>
           <w:rPr>
             <w:rStyle w:val="Hyperlink"/>
@@ -9602,7 +9616,7 @@
       <w:r>
         <w:t xml:space="preserve"> </w:t>
       </w:r>
-      <w:hyperlink r:id="rId123">
+      <w:hyperlink r:id="rId126">
         <w:r>
           <w:rPr>
             <w:rStyle w:val="Hyperlink"/>
@@ -9637,12 +9651,11 @@
         <w:t xml:space="preserve">Before agreeing to such changes to a published YANG module, Work Areas must ensure, to the greatest possible extent, that these changes will indeed be backwards compatible and not impact any existing operator configuration or operations or other SDOs or vendors augmentations of these standardized modules.</w:t>
       </w:r>
     </w:p>
-    <w:bookmarkEnd w:id="125"/>
-    <w:bookmarkStart w:id="126" w:name="sec:bbf-23-enable-vs.-enabled"/>
     <w:p>
       <w:pPr>
         <w:pStyle w:val="Heading3"/>
       </w:pPr>
+      <w:bookmarkStart w:id="128" w:name="_462b5ee56e3ea101c815bfba1fc483583a4e391"/>
       <w:r>
         <w:t xml:space="preserve">BBF-23:</w:t>
       </w:r>
@@ -9661,6 +9674,7 @@
       <w:r>
         <w:t xml:space="preserve">“enabled”</w:t>
       </w:r>
+      <w:bookmarkEnd w:id="128"/>
     </w:p>
     <w:p>
       <w:pPr>
@@ -9712,12 +9726,11 @@
         <w:t xml:space="preserve">. This also applies to the names of enums or bits.</w:t>
       </w:r>
     </w:p>
-    <w:bookmarkEnd w:id="126"/>
-    <w:bookmarkStart w:id="127" w:name="sec:bbf-24-oper-state-vs.-oper-status"/>
     <w:p>
       <w:pPr>
         <w:pStyle w:val="Heading3"/>
       </w:pPr>
+      <w:bookmarkStart w:id="129" w:name="_d9361fe1321a23105005f3b0a41d84aec0e5756"/>
       <w:r>
         <w:t xml:space="preserve">BBF-24:</w:t>
       </w:r>
@@ -9736,6 +9749,7 @@
       <w:r>
         <w:t xml:space="preserve">“oper-status”</w:t>
       </w:r>
+      <w:bookmarkEnd w:id="129"/>
     </w:p>
     <w:p>
       <w:pPr>
@@ -9775,15 +9789,15 @@
         <w:t xml:space="preserve">.</w:t>
       </w:r>
     </w:p>
-    <w:bookmarkEnd w:id="127"/>
-    <w:bookmarkStart w:id="128" w:name="sec:bbf-25-reference-statements"/>
     <w:p>
       <w:pPr>
         <w:pStyle w:val="Heading3"/>
       </w:pPr>
+      <w:bookmarkStart w:id="130" w:name="_c26aa4a4935e7c62609c448c2df4a73231b7f52"/>
       <w:r>
         <w:t xml:space="preserve">BBF-25: Reference Statements</w:t>
       </w:r>
+      <w:bookmarkEnd w:id="130"/>
     </w:p>
     <w:p>
       <w:pPr>
@@ -10453,15 +10467,15 @@
         <w:t xml:space="preserve">URL references should be periodically reviewed to ensure they still exist or have not been moved.</w:t>
       </w:r>
     </w:p>
-    <w:bookmarkEnd w:id="128"/>
-    <w:bookmarkStart w:id="131" w:name="sec:bbf-26-body-statements"/>
     <w:p>
       <w:pPr>
         <w:pStyle w:val="Heading3"/>
       </w:pPr>
+      <w:bookmarkStart w:id="131" w:name="_e508e6802eb3ceb31bc84672d531ce23ce85a0a"/>
       <w:r>
         <w:t xml:space="preserve">BBF-26: Body Statements</w:t>
       </w:r>
+      <w:bookmarkEnd w:id="131"/>
     </w:p>
     <w:p>
       <w:pPr>
@@ -10473,7 +10487,7 @@
       <w:r>
         <w:t xml:space="preserve"> </w:t>
       </w:r>
-      <w:hyperlink w:anchor="ref-RFC7950">
+      <w:hyperlink w:anchor="_9aa1375053d51ce8fa8cdf71cde3bc0571671c1">
         <w:r>
           <w:rPr>
             <w:rStyle w:val="Hyperlink"/>
@@ -10490,7 +10504,7 @@
       <w:r>
         <w:t xml:space="preserve"> </w:t>
       </w:r>
-      <w:hyperlink r:id="rId129">
+      <w:hyperlink r:id="rId132">
         <w:r>
           <w:rPr>
             <w:rStyle w:val="Hyperlink"/>
@@ -10507,7 +10521,7 @@
       <w:r>
         <w:t xml:space="preserve"> </w:t>
       </w:r>
-      <w:hyperlink w:anchor="ref-RFC8407">
+      <w:hyperlink w:anchor="_3ad76c0cb9b1ead647a1dff13fc24ddd70b3bb0">
         <w:r>
           <w:rPr>
             <w:rStyle w:val="Hyperlink"/>
@@ -10524,7 +10538,7 @@
       <w:r>
         <w:t xml:space="preserve"> </w:t>
       </w:r>
-      <w:hyperlink r:id="rId130">
+      <w:hyperlink r:id="rId133">
         <w:r>
           <w:rPr>
             <w:rStyle w:val="Hyperlink"/>
@@ -10661,12 +10675,11 @@
         <w:t xml:space="preserve">notification statements</w:t>
       </w:r>
     </w:p>
-    <w:bookmarkEnd w:id="131"/>
-    <w:bookmarkStart w:id="132" w:name="Xba1c62665070be3155a84b4d1da73d5a18d616d"/>
     <w:p>
       <w:pPr>
         <w:pStyle w:val="Heading3"/>
       </w:pPr>
+      <w:bookmarkStart w:id="134" w:name="_ba1c62665070be3155a84b4d1da73d5a18d616d"/>
       <w:r>
         <w:t xml:space="preserve">BBF-27:</w:t>
       </w:r>
@@ -10694,6 +10707,7 @@
       <w:r>
         <w:t xml:space="preserve">Naming and Descriptions</w:t>
       </w:r>
+      <w:bookmarkEnd w:id="134"/>
     </w:p>
     <w:p>
       <w:pPr>
@@ -11050,12 +11064,11 @@
         <w:t xml:space="preserve">}</w:t>
       </w:r>
     </w:p>
-    <w:bookmarkEnd w:id="132"/>
-    <w:bookmarkStart w:id="133" w:name="Xec0f6fb32d61293c49cd1103edc2f277edb476e"/>
     <w:p>
       <w:pPr>
         <w:pStyle w:val="Heading3"/>
       </w:pPr>
+      <w:bookmarkStart w:id="135" w:name="_ec0f6fb32d61293c49cd1103edc2f277edb476e"/>
       <w:r>
         <w:t xml:space="preserve">BBF-28: Description on</w:t>
       </w:r>
@@ -11071,6 +11084,7 @@
       <w:r>
         <w:t xml:space="preserve">statements</w:t>
       </w:r>
+      <w:bookmarkEnd w:id="135"/>
     </w:p>
     <w:p>
       <w:pPr>
@@ -11242,15 +11256,15 @@
         <w:t xml:space="preserve">}</w:t>
       </w:r>
     </w:p>
-    <w:bookmarkEnd w:id="133"/>
-    <w:bookmarkStart w:id="134" w:name="sec:bbf-29-use-of-english-contractions"/>
     <w:p>
       <w:pPr>
         <w:pStyle w:val="Heading3"/>
       </w:pPr>
+      <w:bookmarkStart w:id="136" w:name="_c9affe6aed5e6e759f50754ed9c153c96a8cf23"/>
       <w:r>
         <w:t xml:space="preserve">BBF-29: Use of English Contractions</w:t>
       </w:r>
+      <w:bookmarkEnd w:id="136"/>
     </w:p>
     <w:p>
       <w:pPr>
@@ -11260,15 +11274,15 @@
         <w:t xml:space="preserve">Descriptions in YANG modules are considered to be formal documentation. Therefore, English contractions, e.g., can’t, isn’t, etc., SHALL NOT be used in description statements.</w:t>
       </w:r>
     </w:p>
-    <w:bookmarkEnd w:id="134"/>
-    <w:bookmarkStart w:id="135" w:name="sec:bbf-30-use-of-presence-statements"/>
     <w:p>
       <w:pPr>
         <w:pStyle w:val="Heading3"/>
       </w:pPr>
+      <w:bookmarkStart w:id="137" w:name="_32ddaa0fff65a70ade013c047f5f36a8e8c9193"/>
       <w:r>
         <w:t xml:space="preserve">BBF-30: Use of Presence statements</w:t>
       </w:r>
+      <w:bookmarkEnd w:id="137"/>
     </w:p>
     <w:p>
       <w:pPr>
@@ -11549,15 +11563,15 @@
         <w:t xml:space="preserve">        mandatory true;  &lt;&lt; to make this leaf conditionally mandatory</w:t>
       </w:r>
     </w:p>
-    <w:bookmarkEnd w:id="135"/>
-    <w:bookmarkStart w:id="136" w:name="X79b6fd6ecbb4358b3ec3fadbfda31be16bc6461"/>
     <w:p>
       <w:pPr>
         <w:pStyle w:val="Heading3"/>
       </w:pPr>
+      <w:bookmarkStart w:id="138" w:name="_79b6fd6ecbb4358b3ec3fadbfda31be16bc6461"/>
       <w:r>
         <w:t xml:space="preserve">BBF-31: Formatting XPath expression arguments of YANG statements</w:t>
       </w:r>
+      <w:bookmarkEnd w:id="138"/>
     </w:p>
     <w:p>
       <w:pPr>
@@ -11930,15 +11944,15 @@
         <w:t xml:space="preserve">    }</w:t>
       </w:r>
     </w:p>
-    <w:bookmarkEnd w:id="136"/>
-    <w:bookmarkStart w:id="137" w:name="sec:bbf-32-naming-choices"/>
     <w:p>
       <w:pPr>
         <w:pStyle w:val="Heading3"/>
       </w:pPr>
+      <w:bookmarkStart w:id="139" w:name="_d30abc44b378765c394a2a6918424033f00b789"/>
       <w:r>
         <w:t xml:space="preserve">BBF-32: Naming choices</w:t>
       </w:r>
+      <w:bookmarkEnd w:id="139"/>
     </w:p>
     <w:p>
       <w:pPr>
@@ -12305,15 +12319,15 @@
         <w:t xml:space="preserve">    }</w:t>
       </w:r>
     </w:p>
-    <w:bookmarkEnd w:id="137"/>
-    <w:bookmarkStart w:id="138" w:name="X2e42482474bff85602ba9b0a80398eec573ea06"/>
     <w:p>
       <w:pPr>
         <w:pStyle w:val="Heading3"/>
       </w:pPr>
+      <w:bookmarkStart w:id="140" w:name="_2e42482474bff85602ba9b0a80398eec573ea06"/>
       <w:r>
         <w:t xml:space="preserve">BBF-33: Mapping of alarm type identifiers to ITU-T X.733 and ITU-T X.736 event types</w:t>
       </w:r>
+      <w:bookmarkEnd w:id="140"/>
     </w:p>
     <w:p>
       <w:pPr>
@@ -12325,7 +12339,7 @@
       <w:r>
         <w:t xml:space="preserve"> </w:t>
       </w:r>
-      <w:hyperlink w:anchor="ref-X.733">
+      <w:hyperlink w:anchor="_1c483dfdcd2d45170f9d1d1b9fcded940f44491">
         <w:r>
           <w:rPr>
             <w:rStyle w:val="Hyperlink"/>
@@ -12342,7 +12356,7 @@
       <w:r>
         <w:t xml:space="preserve"> </w:t>
       </w:r>
-      <w:hyperlink w:anchor="ref-X.736">
+      <w:hyperlink w:anchor="_bcbc3edaee3875fd549183b99e7c4e09ee66c93">
         <w:r>
           <w:rPr>
             <w:rStyle w:val="Hyperlink"/>
@@ -12454,7 +12468,7 @@
       <w:r>
         <w:t xml:space="preserve"> </w:t>
       </w:r>
-      <w:hyperlink w:anchor="ref-TR-383">
+      <w:hyperlink w:anchor="_c881cfca486279894d799dfa985220a9373daeb">
         <w:r>
           <w:rPr>
             <w:rStyle w:val="Hyperlink"/>
@@ -12483,7 +12497,7 @@
       <w:r>
         <w:t xml:space="preserve"> </w:t>
       </w:r>
-      <w:hyperlink w:anchor="ref-RFC8632">
+      <w:hyperlink w:anchor="_989e6c6e50f32938c6eb9e2e354cca8a0aff0ae">
         <w:r>
           <w:rPr>
             <w:rStyle w:val="Hyperlink"/>
@@ -13413,16 +13427,15 @@
         <w:t xml:space="preserve">     }</w:t>
       </w:r>
     </w:p>
-    <w:bookmarkEnd w:id="138"/>
-    <w:bookmarkEnd w:id="139"/>
-    <w:bookmarkStart w:id="148" w:name="sec:bbf-deviation-guidelines"/>
     <w:p>
       <w:pPr>
         <w:pStyle w:val="Heading2"/>
       </w:pPr>
+      <w:bookmarkStart w:id="141" w:name="_ef961dcbd222be4a71b0d38d8a9359ce47fdbb6"/>
       <w:r>
         <w:t xml:space="preserve">BBF Deviation Guidelines</w:t>
       </w:r>
+      <w:bookmarkEnd w:id="141"/>
     </w:p>
     <w:p>
       <w:pPr>
@@ -13480,14 +13493,15 @@
         <w:t xml:space="preserve">they are expected to be used in the Broadband Forum.</w:t>
       </w:r>
     </w:p>
-    <w:bookmarkStart w:id="140" w:name="sec:types-of-deviations"/>
     <w:p>
       <w:pPr>
         <w:pStyle w:val="Heading3"/>
       </w:pPr>
+      <w:bookmarkStart w:id="142" w:name="_f8cf1fdc9f14b812b434f9ccffc86e855003c41"/>
       <w:r>
         <w:t xml:space="preserve">Types of Deviations</w:t>
       </w:r>
+      <w:bookmarkEnd w:id="142"/>
     </w:p>
     <w:p>
       <w:pPr>
@@ -13609,15 +13623,15 @@
         <w:t xml:space="preserve">Deletes existing properties of the target node.</w:t>
       </w:r>
     </w:p>
-    <w:bookmarkEnd w:id="140"/>
-    <w:bookmarkStart w:id="141" w:name="sec:dev-1-not-supported"/>
     <w:p>
       <w:pPr>
         <w:pStyle w:val="Heading3"/>
       </w:pPr>
+      <w:bookmarkStart w:id="143" w:name="_6e3536ea2575906b5eb617b1d807356ba068bd9"/>
       <w:r>
         <w:t xml:space="preserve">DEV-1: not-supported</w:t>
       </w:r>
+      <w:bookmarkEnd w:id="143"/>
     </w:p>
     <w:p>
       <w:pPr>
@@ -13753,15 +13767,15 @@
         <w:t xml:space="preserve">  }</w:t>
       </w:r>
     </w:p>
-    <w:bookmarkEnd w:id="141"/>
-    <w:bookmarkStart w:id="142" w:name="sec:dev-2-add---number-of-elements"/>
     <w:p>
       <w:pPr>
         <w:pStyle w:val="Heading3"/>
       </w:pPr>
+      <w:bookmarkStart w:id="144" w:name="_a8e9328cd4a7f8287ac2b23ea63c2211f18467e"/>
       <w:r>
         <w:t xml:space="preserve">DEV-2: add - Number of Elements</w:t>
       </w:r>
+      <w:bookmarkEnd w:id="144"/>
     </w:p>
     <w:p>
       <w:pPr>
@@ -14053,12 +14067,11 @@
         <w:t xml:space="preserve">  }</w:t>
       </w:r>
     </w:p>
-    <w:bookmarkEnd w:id="142"/>
-    <w:bookmarkStart w:id="143" w:name="sec:dev-3-add---must-constraints"/>
     <w:p>
       <w:pPr>
         <w:pStyle w:val="Heading3"/>
       </w:pPr>
+      <w:bookmarkStart w:id="145" w:name="_460c3baa5153b7e7e8ebb87befbc074bb3a08b7"/>
       <w:r>
         <w:t xml:space="preserve">DEV-3: add -</w:t>
       </w:r>
@@ -14074,6 +14087,7 @@
       <w:r>
         <w:t xml:space="preserve">Constraints</w:t>
       </w:r>
+      <w:bookmarkEnd w:id="145"/>
     </w:p>
     <w:p>
       <w:pPr>
@@ -14123,7 +14137,7 @@
         </w:rPr>
         <w:t xml:space="preserve"> </w:t>
       </w:r>
-      <w:hyperlink w:anchor="ref-RFC7223">
+      <w:hyperlink w:anchor="_f831072a942d0ab6406c7261ba9cac8a33a6879">
         <w:r>
           <w:rPr>
             <w:rStyle w:val="Hyperlink"/>
@@ -14205,15 +14219,15 @@
         <w:t xml:space="preserve">  }</w:t>
       </w:r>
     </w:p>
-    <w:bookmarkEnd w:id="143"/>
-    <w:bookmarkStart w:id="144" w:name="sec:dev-4-replace---data-type"/>
     <w:p>
       <w:pPr>
         <w:pStyle w:val="Heading3"/>
       </w:pPr>
+      <w:bookmarkStart w:id="146" w:name="_e76f1e216ccb0d3e6c0d07a8a8e046aad336dd6"/>
       <w:r>
         <w:t xml:space="preserve">DEV-4: replace - Data Type</w:t>
       </w:r>
+      <w:bookmarkEnd w:id="146"/>
     </w:p>
     <w:p>
       <w:pPr>
@@ -14585,15 +14599,15 @@
         <w:t xml:space="preserve">  }</w:t>
       </w:r>
     </w:p>
-    <w:bookmarkEnd w:id="144"/>
-    <w:bookmarkStart w:id="145" w:name="sec:dev-5-replace---number-of-elements"/>
     <w:p>
       <w:pPr>
         <w:pStyle w:val="Heading3"/>
       </w:pPr>
+      <w:bookmarkStart w:id="147" w:name="_028042156d2f316b63ae640d7d981b27ae4b00b"/>
       <w:r>
         <w:t xml:space="preserve">DEV-5: replace - Number of Elements</w:t>
       </w:r>
+      <w:bookmarkEnd w:id="147"/>
     </w:p>
     <w:p>
       <w:pPr>
@@ -14854,15 +14868,15 @@
         <w:t xml:space="preserve">  }</w:t>
       </w:r>
     </w:p>
-    <w:bookmarkEnd w:id="145"/>
-    <w:bookmarkStart w:id="146" w:name="sec:dev-6-delete"/>
     <w:p>
       <w:pPr>
         <w:pStyle w:val="Heading3"/>
       </w:pPr>
+      <w:bookmarkStart w:id="148" w:name="_f4a2c6b0262bc2c38976be19bfd03790aad8153"/>
       <w:r>
         <w:t xml:space="preserve">DEV-6: delete</w:t>
       </w:r>
+      <w:bookmarkEnd w:id="148"/>
     </w:p>
     <w:p>
       <w:pPr>
@@ -14896,15 +14910,15 @@
         <w:t xml:space="preserve">By deleting a property, the value space of an object is typically being expanded which means the value accepted by the deviated definition is not valid per the original definition and thus, should never be allowed.</w:t>
       </w:r>
     </w:p>
-    <w:bookmarkEnd w:id="146"/>
-    <w:bookmarkStart w:id="147" w:name="sec:dev-7-add---mandatory-leaf"/>
     <w:p>
       <w:pPr>
         <w:pStyle w:val="Heading3"/>
       </w:pPr>
+      <w:bookmarkStart w:id="149" w:name="_1c7e76447454d31558b243ea8021d683c056863"/>
       <w:r>
         <w:t xml:space="preserve">DEV-7: add - Mandatory leaf</w:t>
       </w:r>
+      <w:bookmarkEnd w:id="149"/>
     </w:p>
     <w:p>
       <w:pPr>
@@ -15068,13 +15082,11 @@
         <w:t xml:space="preserve">Note that this is similar to the deviation of introducing a min-elements to a list or leaf-list that also makes one or more elements in the list mandatory.</w:t>
       </w:r>
     </w:p>
-    <w:bookmarkEnd w:id="147"/>
-    <w:bookmarkEnd w:id="148"/>
-    <w:bookmarkStart w:id="160" w:name="sec:bbf-guidelines-for-units-statements"/>
     <w:p>
       <w:pPr>
         <w:pStyle w:val="Heading2"/>
       </w:pPr>
+      <w:bookmarkStart w:id="150" w:name="_1db2b8ff96e2758feaefb7a1a6d4a74b0764e70"/>
       <w:r>
         <w:t xml:space="preserve">BBF Guidelines for</w:t>
       </w:r>
@@ -15090,6 +15102,7 @@
       <w:r>
         <w:t xml:space="preserve">Statements</w:t>
       </w:r>
+      <w:bookmarkEnd w:id="150"/>
     </w:p>
     <w:p>
       <w:pPr>
@@ -15143,7 +15156,7 @@
           <w:numId w:val="1048"/>
         </w:numPr>
       </w:pPr>
-      <w:hyperlink r:id="rId149">
+      <w:hyperlink r:id="rId151">
         <w:r>
           <w:rPr>
             <w:rStyle w:val="Hyperlink"/>
@@ -15152,14 +15165,15 @@
         </w:r>
       </w:hyperlink>
     </w:p>
-    <w:bookmarkStart w:id="150" w:name="sec:terminology-1"/>
     <w:p>
       <w:pPr>
         <w:pStyle w:val="Heading3"/>
       </w:pPr>
+      <w:bookmarkStart w:id="152" w:name="_edac0ef63beaddeeec10e2733c72da79437c1b4"/>
       <w:r>
         <w:t xml:space="preserve">Terminology</w:t>
       </w:r>
+      <w:bookmarkEnd w:id="152"/>
     </w:p>
     <w:p>
       <w:pPr>
@@ -15292,15 +15306,15 @@
         </w:tc>
       </w:tr>
     </w:tbl>
-    <w:bookmarkEnd w:id="150"/>
-    <w:bookmarkStart w:id="151" w:name="sec:units-1-unit-vs-symbol"/>
     <w:p>
       <w:pPr>
         <w:pStyle w:val="Heading3"/>
       </w:pPr>
+      <w:bookmarkStart w:id="153" w:name="_a2a61051f9da7c383f97a3d1dd06c87ab02ef11"/>
       <w:r>
         <w:t xml:space="preserve">UNITS-1: Unit vs Symbol</w:t>
       </w:r>
+      <w:bookmarkEnd w:id="153"/>
     </w:p>
     <w:p>
       <w:pPr>
@@ -15406,15 +15420,15 @@
         <w:t xml:space="preserve">is not commonly used.</w:t>
       </w:r>
     </w:p>
-    <w:bookmarkEnd w:id="151"/>
-    <w:bookmarkStart w:id="152" w:name="sec:units-2-plural-form"/>
     <w:p>
       <w:pPr>
         <w:pStyle w:val="Heading3"/>
       </w:pPr>
+      <w:bookmarkStart w:id="154" w:name="_01be8e6e58cedc8c122ae00fbdb5681301163e5"/>
       <w:r>
         <w:t xml:space="preserve">UNITS-2: Plural Form</w:t>
       </w:r>
+      <w:bookmarkEnd w:id="154"/>
     </w:p>
     <w:p>
       <w:pPr>
@@ -15436,15 +15450,15 @@
         <w:t xml:space="preserve">text SHALL be written in plural form, e.g., seconds vs. second. This differs from the definitions in IEEE Std. 260.1 but aligns with NIST 811 as well as the current practice in industry standard YANG data models.</w:t>
       </w:r>
     </w:p>
-    <w:bookmarkEnd w:id="152"/>
-    <w:bookmarkStart w:id="153" w:name="sec:units-3-base-vs-derived"/>
     <w:p>
       <w:pPr>
         <w:pStyle w:val="Heading3"/>
       </w:pPr>
+      <w:bookmarkStart w:id="155" w:name="_806aa7fd587c26361e4711f6421b7166ef9bfbd"/>
       <w:r>
         <w:t xml:space="preserve">UNITS-3: Base vs Derived</w:t>
       </w:r>
+      <w:bookmarkEnd w:id="155"/>
     </w:p>
     <w:p>
       <w:pPr>
@@ -15478,15 +15492,15 @@
         <w:t xml:space="preserve">from the base, e.g., seconds, milliseconds, nanoseconds.</w:t>
       </w:r>
     </w:p>
-    <w:bookmarkEnd w:id="153"/>
-    <w:bookmarkStart w:id="154" w:name="sec:units-4-memory"/>
     <w:p>
       <w:pPr>
         <w:pStyle w:val="Heading3"/>
       </w:pPr>
+      <w:bookmarkStart w:id="156" w:name="_7d39381540a888cd3d05d30494a1fdb8aeb47e4"/>
       <w:r>
         <w:t xml:space="preserve">UNITS-4: Memory</w:t>
       </w:r>
+      <w:bookmarkEnd w:id="156"/>
     </w:p>
     <w:p>
       <w:pPr>
@@ -15517,15 +15531,15 @@
         <w:t xml:space="preserve">, e.g., bytes, kibibytes, mebibytes.</w:t>
       </w:r>
     </w:p>
-    <w:bookmarkEnd w:id="154"/>
-    <w:bookmarkStart w:id="155" w:name="sec:units-5-unit-combinations"/>
     <w:p>
       <w:pPr>
         <w:pStyle w:val="Heading3"/>
       </w:pPr>
+      <w:bookmarkStart w:id="157" w:name="_97ae81b6c2cd8dffa519d6e59efc5c294be212e"/>
       <w:r>
         <w:t xml:space="preserve">UNITS-5: Unit Combinations</w:t>
       </w:r>
+      <w:bookmarkEnd w:id="157"/>
     </w:p>
     <w:p>
       <w:pPr>
@@ -15595,15 +15609,15 @@
         <w:t xml:space="preserve">.</w:t>
       </w:r>
     </w:p>
-    <w:bookmarkEnd w:id="155"/>
-    <w:bookmarkStart w:id="156" w:name="sec:units-6-equivalent-units"/>
     <w:p>
       <w:pPr>
         <w:pStyle w:val="Heading3"/>
       </w:pPr>
+      <w:bookmarkStart w:id="158" w:name="_c6706faa2619b2ff3a8fbefc1f2474b6bf7b771"/>
       <w:r>
         <w:t xml:space="preserve">UNITS-6: Equivalent Units</w:t>
       </w:r>
+      <w:bookmarkEnd w:id="158"/>
     </w:p>
     <w:p>
       <w:pPr>
@@ -15646,15 +15660,15 @@
         <w:t xml:space="preserve">.</w:t>
       </w:r>
     </w:p>
-    <w:bookmarkEnd w:id="156"/>
-    <w:bookmarkStart w:id="157" w:name="sec:units-7-use-of-decimal64"/>
     <w:p>
       <w:pPr>
         <w:pStyle w:val="Heading3"/>
       </w:pPr>
+      <w:bookmarkStart w:id="159" w:name="_f78378e751648b95f634015fc5562494143b14f"/>
       <w:r>
         <w:t xml:space="preserve">UNITS-7: Use of decimal64</w:t>
       </w:r>
+      <w:bookmarkEnd w:id="159"/>
     </w:p>
     <w:p>
       <w:pPr>
@@ -15875,15 +15889,15 @@
         <w:t xml:space="preserve">.</w:t>
       </w:r>
     </w:p>
-    <w:bookmarkEnd w:id="157"/>
-    <w:bookmarkStart w:id="158" w:name="sec:units-8-exceptions"/>
     <w:p>
       <w:pPr>
         <w:pStyle w:val="Heading3"/>
       </w:pPr>
+      <w:bookmarkStart w:id="160" w:name="_5098fe57461ddfafaed3b03a481ce8fb3900ec5"/>
       <w:r>
         <w:t xml:space="preserve">UNITS-8: Exceptions</w:t>
       </w:r>
+      <w:bookmarkEnd w:id="160"/>
     </w:p>
     <w:p>
       <w:pPr>
@@ -15947,15 +15961,15 @@
         <w:t xml:space="preserve">is as equally important as is the representation of time.</w:t>
       </w:r>
     </w:p>
-    <w:bookmarkEnd w:id="158"/>
-    <w:bookmarkStart w:id="159" w:name="X04bb541aae3b3cf33164758e7fb4852ff067084"/>
     <w:p>
       <w:pPr>
         <w:pStyle w:val="Heading3"/>
       </w:pPr>
+      <w:bookmarkStart w:id="161" w:name="_04bb541aae3b3cf33164758e7fb4852ff067084"/>
       <w:r>
         <w:t xml:space="preserve">UNITS-9: Frames vs Packets vs Messages</w:t>
       </w:r>
+      <w:bookmarkEnd w:id="161"/>
     </w:p>
     <w:p>
       <w:pPr>
@@ -16070,9 +16084,6 @@
         <w:t xml:space="preserve">when referring to protocols, e.g., DHCP messages, IGMP messages, etc.</w:t>
       </w:r>
     </w:p>
-    <w:bookmarkEnd w:id="159"/>
-    <w:bookmarkEnd w:id="160"/>
-    <w:bookmarkEnd w:id="161"/>
     <w:sectPr>
       <w:footnotePr>
         <w:numRestart w:val="eachSect"/>
@@ -16776,10 +16787,10 @@
   <w:docDefaults>
     <w:rPrDefault>
       <w:rPr>
-        <w:rFonts w:asciiTheme="minorHAnsi" w:cstheme="minorBidi" w:eastAsiaTheme="minorEastAsia" w:hAnsiTheme="minorHAnsi"/>
+        <w:rFonts w:asciiTheme="minorHAnsi" w:eastAsiaTheme="minorEastAsia" w:hAnsiTheme="minorHAnsi" w:cstheme="minorBidi"/>
         <w:sz w:val="24"/>
         <w:szCs w:val="24"/>
-        <w:lang w:bidi="ar-SA" w:eastAsia="zh-CN" w:val="en-US"/>
+        <w:lang w:val="en-US" w:eastAsia="zh-CN" w:bidi="ar-SA"/>
       </w:rPr>
     </w:rPrDefault>
     <w:pPrDefault>
@@ -16788,35 +16799,35 @@
       </w:pPr>
     </w:pPrDefault>
   </w:docDefaults>
-  <w:latentStyles w:count="276" w:defLockedState="0" w:defQFormat="0" w:defSemiHidden="0" w:defUIPriority="0" w:defUnhideWhenUsed="0"/>
-  <w:style w:default="1" w:styleId="Normal" w:type="paragraph">
+  <w:latentStyles w:defLockedState="0" w:defUIPriority="0" w:defSemiHidden="0" w:defUnhideWhenUsed="0" w:defQFormat="0" w:count="276"/>
+  <w:style w:type="paragraph" w:default="1" w:styleId="Normal">
     <w:name w:val="Normal"/>
     <w:qFormat/>
   </w:style>
-  <w:style w:styleId="BodyText" w:type="paragraph">
+  <w:style w:type="paragraph" w:styleId="BodyText">
     <w:name w:val="Body Text"/>
     <w:basedOn w:val="Normal"/>
     <w:link w:val="BodyTextChar"/>
     <w:qFormat/>
     <w:pPr>
-      <w:spacing w:after="180" w:before="180"/>
+      <w:spacing w:before="180" w:after="180"/>
     </w:pPr>
   </w:style>
-  <w:style w:customStyle="1" w:styleId="FirstParagraph" w:type="paragraph">
+  <w:style w:type="paragraph" w:customStyle="1" w:styleId="FirstParagraph">
     <w:name w:val="First Paragraph"/>
     <w:basedOn w:val="BodyText"/>
     <w:next w:val="BodyText"/>
     <w:qFormat/>
   </w:style>
-  <w:style w:customStyle="1" w:styleId="Compact" w:type="paragraph">
+  <w:style w:type="paragraph" w:customStyle="1" w:styleId="Compact">
     <w:name w:val="Compact"/>
     <w:basedOn w:val="BodyText"/>
     <w:qFormat/>
     <w:pPr>
-      <w:spacing w:after="36" w:before="36"/>
+      <w:spacing w:before="36" w:after="36"/>
     </w:pPr>
   </w:style>
-  <w:style w:styleId="Title" w:type="paragraph">
+  <w:style w:type="paragraph" w:styleId="Title">
     <w:name w:val="Title"/>
     <w:basedOn w:val="Normal"/>
     <w:next w:val="BodyText"/>
@@ -16830,24 +16841,24 @@
       <w:jc w:val="center"/>
     </w:pPr>
     <w:rPr>
-      <w:rFonts w:asciiTheme="majorHAnsi" w:cstheme="majorBidi" w:eastAsiaTheme="majorEastAsia" w:hAnsiTheme="majorHAnsi"/>
+      <w:rFonts w:asciiTheme="majorHAnsi" w:eastAsiaTheme="majorEastAsia" w:hAnsiTheme="majorHAnsi" w:cstheme="majorBidi"/>
       <w:sz w:val="56"/>
       <w:szCs w:val="56"/>
     </w:rPr>
   </w:style>
-  <w:style w:customStyle="1" w:styleId="TitleChar" w:type="character">
+  <w:style w:type="character" w:customStyle="1" w:styleId="TitleChar">
     <w:name w:val="Title Char"/>
     <w:basedOn w:val="DefaultParagraphFont"/>
     <w:link w:val="Title"/>
     <w:uiPriority w:val="10"/>
     <w:rsid w:val="00A10FD9"/>
     <w:rPr>
-      <w:rFonts w:asciiTheme="majorHAnsi" w:cstheme="majorBidi" w:eastAsiaTheme="majorEastAsia" w:hAnsiTheme="majorHAnsi"/>
+      <w:rFonts w:asciiTheme="majorHAnsi" w:eastAsiaTheme="majorEastAsia" w:hAnsiTheme="majorHAnsi" w:cstheme="majorBidi"/>
       <w:sz w:val="56"/>
       <w:szCs w:val="56"/>
     </w:rPr>
   </w:style>
-  <w:style w:styleId="Subtitle" w:type="paragraph">
+  <w:style w:type="paragraph" w:styleId="Subtitle">
     <w:name w:val="Subtitle"/>
     <w:basedOn w:val="Title"/>
     <w:next w:val="BodyText"/>
@@ -16861,27 +16872,27 @@
       </w:numPr>
     </w:pPr>
     <w:rPr>
-      <w:rFonts w:cstheme="majorBidi" w:eastAsiaTheme="majorEastAsia"/>
+      <w:rFonts w:eastAsiaTheme="majorEastAsia" w:cstheme="majorBidi"/>
       <w:spacing w:val="15"/>
       <w:sz w:val="28"/>
       <w:szCs w:val="28"/>
     </w:rPr>
   </w:style>
-  <w:style w:customStyle="1" w:styleId="SubtitleChar" w:type="character">
+  <w:style w:type="character" w:customStyle="1" w:styleId="SubtitleChar">
     <w:name w:val="Subtitle Char"/>
     <w:basedOn w:val="DefaultParagraphFont"/>
     <w:link w:val="Subtitle"/>
     <w:uiPriority w:val="11"/>
     <w:rsid w:val="00A10FD9"/>
     <w:rPr>
-      <w:rFonts w:cstheme="majorBidi" w:eastAsiaTheme="majorEastAsia"/>
-      <w:color w:themeColor="text1" w:themeTint="A6" w:val="595959"/>
+      <w:rFonts w:eastAsiaTheme="majorEastAsia" w:cstheme="majorBidi"/>
+      <w:color w:val="595959" w:themeColor="text1" w:themeTint="A6"/>
       <w:spacing w:val="15"/>
       <w:sz w:val="28"/>
       <w:szCs w:val="28"/>
     </w:rPr>
   </w:style>
-  <w:style w:customStyle="1" w:styleId="Author" w:type="paragraph">
+  <w:style w:type="paragraph" w:customStyle="1" w:styleId="Author">
     <w:name w:val="Author"/>
     <w:basedOn w:val="Title"/>
     <w:next w:val="BodyText"/>
@@ -16895,7 +16906,7 @@
       <w:szCs w:val="24"/>
     </w:rPr>
   </w:style>
-  <w:style w:styleId="Date" w:type="paragraph">
+  <w:style w:type="paragraph" w:styleId="Date">
     <w:name w:val="Date"/>
     <w:basedOn w:val="Title"/>
     <w:next w:val="BodyText"/>
@@ -16909,7 +16920,7 @@
       <w:szCs w:val="24"/>
     </w:rPr>
   </w:style>
-  <w:style w:customStyle="1" w:styleId="AbstractTitle" w:type="paragraph">
+  <w:style w:type="paragraph" w:customStyle="1" w:styleId="AbstractTitle">
     <w:name w:val="Abstract Title"/>
     <w:basedOn w:val="Normal"/>
     <w:next w:val="Abstract"/>
@@ -16917,7 +16928,7 @@
     <w:pPr>
       <w:keepNext/>
       <w:keepLines/>
-      <w:spacing w:after="0" w:before="300"/>
+      <w:spacing w:before="300" w:after="0"/>
       <w:jc w:val="center"/>
     </w:pPr>
     <w:rPr>
@@ -16926,7 +16937,7 @@
       <w:szCs w:val="20"/>
     </w:rPr>
   </w:style>
-  <w:style w:customStyle="1" w:styleId="Abstract" w:type="paragraph">
+  <w:style w:type="paragraph" w:customStyle="1" w:styleId="Abstract">
     <w:name w:val="Abstract"/>
     <w:basedOn w:val="Normal"/>
     <w:next w:val="BodyText"/>
@@ -16934,14 +16945,14 @@
     <w:pPr>
       <w:keepNext/>
       <w:keepLines/>
-      <w:spacing w:after="300" w:before="100"/>
+      <w:spacing w:before="100" w:after="300"/>
     </w:pPr>
     <w:rPr>
       <w:sz w:val="20"/>
       <w:szCs w:val="20"/>
     </w:rPr>
   </w:style>
-  <w:style w:styleId="Bibliography" w:type="paragraph">
+  <w:style w:type="paragraph" w:styleId="Bibliography">
     <w:name w:val="Bibliography"/>
     <w:basedOn w:val="Normal"/>
     <w:next w:val="Bibliography"/>
@@ -16949,7 +16960,7 @@
     <w:pPr/>
     <w:rPr/>
   </w:style>
-  <w:style w:styleId="Heading1" w:type="paragraph">
+  <w:style w:type="paragraph" w:styleId="Heading1">
     <w:name w:val="heading 1"/>
     <w:basedOn w:val="Normal"/>
     <w:next w:val="BodyText"/>
@@ -16960,17 +16971,17 @@
     <w:pPr>
       <w:keepNext/>
       <w:keepLines/>
-      <w:spacing w:after="80" w:before="360"/>
+      <w:spacing w:before="360" w:after="80"/>
       <w:outlineLvl w:val="0"/>
     </w:pPr>
     <w:rPr>
-      <w:rFonts w:asciiTheme="majorHAnsi" w:cstheme="majorBidi" w:eastAsiaTheme="majorEastAsia" w:hAnsiTheme="majorHAnsi"/>
-      <w:color w:themeColor="accent1" w:themeShade="BF" w:val="0F4761"/>
+      <w:rFonts w:asciiTheme="majorHAnsi" w:eastAsiaTheme="majorEastAsia" w:hAnsiTheme="majorHAnsi" w:cstheme="majorBidi"/>
+      <w:color w:val="0F4761" w:themeColor="accent1" w:themeShade="BF"/>
       <w:sz w:val="40"/>
       <w:szCs w:val="40"/>
     </w:rPr>
   </w:style>
-  <w:style w:styleId="Heading2" w:type="paragraph">
+  <w:style w:type="paragraph" w:styleId="Heading2">
     <w:name w:val="heading 2"/>
     <w:basedOn w:val="Normal"/>
     <w:next w:val="BodyText"/>
@@ -16983,17 +16994,17 @@
     <w:pPr>
       <w:keepNext/>
       <w:keepLines/>
-      <w:spacing w:after="80" w:before="160"/>
+      <w:spacing w:before="160" w:after="80"/>
       <w:outlineLvl w:val="1"/>
     </w:pPr>
     <w:rPr>
-      <w:rFonts w:asciiTheme="majorHAnsi" w:cstheme="majorBidi" w:eastAsiaTheme="majorEastAsia" w:hAnsiTheme="majorHAnsi"/>
-      <w:color w:themeColor="accent1" w:themeShade="BF" w:val="0F4761"/>
+      <w:rFonts w:asciiTheme="majorHAnsi" w:eastAsiaTheme="majorEastAsia" w:hAnsiTheme="majorHAnsi" w:cstheme="majorBidi"/>
+      <w:color w:val="0F4761" w:themeColor="accent1" w:themeShade="BF"/>
       <w:sz w:val="32"/>
       <w:szCs w:val="32"/>
     </w:rPr>
   </w:style>
-  <w:style w:styleId="Heading3" w:type="paragraph">
+  <w:style w:type="paragraph" w:styleId="Heading3">
     <w:name w:val="heading 3"/>
     <w:basedOn w:val="Normal"/>
     <w:next w:val="BodyText"/>
@@ -17006,17 +17017,17 @@
     <w:pPr>
       <w:keepNext/>
       <w:keepLines/>
-      <w:spacing w:after="80" w:before="160"/>
+      <w:spacing w:before="160" w:after="80"/>
       <w:outlineLvl w:val="2"/>
     </w:pPr>
     <w:rPr>
-      <w:rFonts w:cstheme="majorBidi" w:eastAsiaTheme="majorEastAsia"/>
-      <w:color w:themeColor="accent1" w:themeShade="BF" w:val="0F4761"/>
+      <w:rFonts w:eastAsiaTheme="majorEastAsia" w:cstheme="majorBidi"/>
+      <w:color w:val="0F4761" w:themeColor="accent1" w:themeShade="BF"/>
       <w:sz w:val="28"/>
       <w:szCs w:val="28"/>
     </w:rPr>
   </w:style>
-  <w:style w:styleId="Heading4" w:type="paragraph">
+  <w:style w:type="paragraph" w:styleId="Heading4">
     <w:name w:val="heading 4"/>
     <w:basedOn w:val="Normal"/>
     <w:next w:val="BodyText"/>
@@ -17029,17 +17040,17 @@
     <w:pPr>
       <w:keepNext/>
       <w:keepLines/>
-      <w:spacing w:after="40" w:before="80"/>
+      <w:spacing w:before="80" w:after="40"/>
       <w:outlineLvl w:val="3"/>
     </w:pPr>
     <w:rPr>
-      <w:rFonts w:cstheme="majorBidi" w:eastAsiaTheme="majorEastAsia"/>
+      <w:rFonts w:eastAsiaTheme="majorEastAsia" w:cstheme="majorBidi"/>
       <w:i/>
       <w:iCs/>
-      <w:color w:themeColor="accent1" w:themeShade="BF" w:val="0F4761"/>
+      <w:color w:val="0F4761" w:themeColor="accent1" w:themeShade="BF"/>
     </w:rPr>
   </w:style>
-  <w:style w:styleId="Heading5" w:type="paragraph">
+  <w:style w:type="paragraph" w:styleId="Heading5">
     <w:name w:val="heading 5"/>
     <w:basedOn w:val="Normal"/>
     <w:next w:val="BodyText"/>
@@ -17052,15 +17063,15 @@
     <w:pPr>
       <w:keepNext/>
       <w:keepLines/>
-      <w:spacing w:after="40" w:before="80"/>
+      <w:spacing w:before="80" w:after="40"/>
       <w:outlineLvl w:val="4"/>
     </w:pPr>
     <w:rPr>
-      <w:rFonts w:cstheme="majorBidi" w:eastAsiaTheme="majorEastAsia"/>
-      <w:color w:themeColor="accent1" w:themeShade="BF" w:val="0F4761"/>
+      <w:rFonts w:eastAsiaTheme="majorEastAsia" w:cstheme="majorBidi"/>
+      <w:color w:val="0F4761" w:themeColor="accent1" w:themeShade="BF"/>
     </w:rPr>
   </w:style>
-  <w:style w:styleId="Heading6" w:type="paragraph">
+  <w:style w:type="paragraph" w:styleId="Heading6">
     <w:name w:val="heading 6"/>
     <w:basedOn w:val="Normal"/>
     <w:next w:val="BodyText"/>
@@ -17073,17 +17084,17 @@
     <w:pPr>
       <w:keepNext/>
       <w:keepLines/>
-      <w:spacing w:after="0" w:before="40"/>
+      <w:spacing w:before="40" w:after="0"/>
       <w:outlineLvl w:val="5"/>
     </w:pPr>
     <w:rPr>
-      <w:rFonts w:cstheme="majorBidi" w:eastAsiaTheme="majorEastAsia"/>
+      <w:rFonts w:eastAsiaTheme="majorEastAsia" w:cstheme="majorBidi"/>
       <w:i/>
       <w:iCs/>
-      <w:color w:themeColor="text1" w:themeTint="A6" w:val="595959"/>
+      <w:color w:val="595959" w:themeColor="text1" w:themeTint="A6"/>
     </w:rPr>
   </w:style>
-  <w:style w:styleId="Heading7" w:type="paragraph">
+  <w:style w:type="paragraph" w:styleId="Heading7">
     <w:name w:val="heading 7"/>
     <w:basedOn w:val="Normal"/>
     <w:next w:val="BodyText"/>
@@ -17096,15 +17107,15 @@
     <w:pPr>
       <w:keepNext/>
       <w:keepLines/>
-      <w:spacing w:after="0" w:before="40"/>
+      <w:spacing w:before="40" w:after="0"/>
       <w:outlineLvl w:val="6"/>
     </w:pPr>
     <w:rPr>
-      <w:rFonts w:cstheme="majorBidi" w:eastAsiaTheme="majorEastAsia"/>
-      <w:color w:themeColor="text1" w:themeTint="A6" w:val="595959"/>
+      <w:rFonts w:eastAsiaTheme="majorEastAsia" w:cstheme="majorBidi"/>
+      <w:color w:val="595959" w:themeColor="text1" w:themeTint="A6"/>
     </w:rPr>
   </w:style>
-  <w:style w:styleId="Heading8" w:type="paragraph">
+  <w:style w:type="paragraph" w:styleId="Heading8">
     <w:name w:val="heading 8"/>
     <w:basedOn w:val="Normal"/>
     <w:next w:val="BodyText"/>
@@ -17121,13 +17132,13 @@
       <w:outlineLvl w:val="7"/>
     </w:pPr>
     <w:rPr>
-      <w:rFonts w:cstheme="majorBidi" w:eastAsiaTheme="majorEastAsia"/>
+      <w:rFonts w:eastAsiaTheme="majorEastAsia" w:cstheme="majorBidi"/>
       <w:i/>
       <w:iCs/>
-      <w:color w:themeColor="text1" w:themeTint="D8" w:val="272727"/>
+      <w:color w:val="272727" w:themeColor="text1" w:themeTint="D8"/>
     </w:rPr>
   </w:style>
-  <w:style w:styleId="Heading9" w:type="paragraph">
+  <w:style w:type="paragraph" w:styleId="Heading9">
     <w:name w:val="heading 9"/>
     <w:basedOn w:val="Normal"/>
     <w:next w:val="BodyText"/>
@@ -17144,24 +17155,24 @@
       <w:outlineLvl w:val="8"/>
     </w:pPr>
     <w:rPr>
-      <w:rFonts w:cstheme="majorBidi" w:eastAsiaTheme="majorEastAsia"/>
-      <w:color w:themeColor="text1" w:themeTint="D8" w:val="272727"/>
+      <w:rFonts w:eastAsiaTheme="majorEastAsia" w:cstheme="majorBidi"/>
+      <w:color w:val="272727" w:themeColor="text1" w:themeTint="D8"/>
     </w:rPr>
   </w:style>
-  <w:style w:customStyle="1" w:styleId="Heading1Char" w:type="character">
+  <w:style w:type="character" w:customStyle="1" w:styleId="Heading1Char">
     <w:name w:val="Heading 1 Char"/>
     <w:basedOn w:val="DefaultParagraphFont"/>
     <w:link w:val="Heading1"/>
     <w:uiPriority w:val="9"/>
     <w:rsid w:val="00A10FD9"/>
     <w:rPr>
-      <w:rFonts w:asciiTheme="majorHAnsi" w:cstheme="majorBidi" w:eastAsiaTheme="majorEastAsia" w:hAnsiTheme="majorHAnsi"/>
-      <w:color w:themeColor="accent1" w:themeShade="BF" w:val="0F4761"/>
+      <w:rFonts w:asciiTheme="majorHAnsi" w:eastAsiaTheme="majorEastAsia" w:hAnsiTheme="majorHAnsi" w:cstheme="majorBidi"/>
+      <w:color w:val="0F4761" w:themeColor="accent1" w:themeShade="BF"/>
       <w:sz w:val="40"/>
       <w:szCs w:val="40"/>
     </w:rPr>
   </w:style>
-  <w:style w:customStyle="1" w:styleId="Heading2Char" w:type="character">
+  <w:style w:type="character" w:customStyle="1" w:styleId="Heading2Char">
     <w:name w:val="Heading 2 Char"/>
     <w:basedOn w:val="DefaultParagraphFont"/>
     <w:link w:val="Heading2"/>
@@ -17169,13 +17180,13 @@
     <w:semiHidden/>
     <w:rsid w:val="00A10FD9"/>
     <w:rPr>
-      <w:rFonts w:asciiTheme="majorHAnsi" w:cstheme="majorBidi" w:eastAsiaTheme="majorEastAsia" w:hAnsiTheme="majorHAnsi"/>
-      <w:color w:themeColor="accent1" w:themeShade="BF" w:val="0F4761"/>
+      <w:rFonts w:asciiTheme="majorHAnsi" w:eastAsiaTheme="majorEastAsia" w:hAnsiTheme="majorHAnsi" w:cstheme="majorBidi"/>
+      <w:color w:val="0F4761" w:themeColor="accent1" w:themeShade="BF"/>
       <w:sz w:val="32"/>
       <w:szCs w:val="32"/>
     </w:rPr>
   </w:style>
-  <w:style w:customStyle="1" w:styleId="Heading3Char" w:type="character">
+  <w:style w:type="character" w:customStyle="1" w:styleId="Heading3Char">
     <w:name w:val="Heading 3 Char"/>
     <w:basedOn w:val="DefaultParagraphFont"/>
     <w:link w:val="Heading3"/>
@@ -17183,13 +17194,13 @@
     <w:semiHidden/>
     <w:rsid w:val="00A10FD9"/>
     <w:rPr>
-      <w:rFonts w:cstheme="majorBidi" w:eastAsiaTheme="majorEastAsia"/>
-      <w:color w:themeColor="accent1" w:themeShade="BF" w:val="0F4761"/>
+      <w:rFonts w:eastAsiaTheme="majorEastAsia" w:cstheme="majorBidi"/>
+      <w:color w:val="0F4761" w:themeColor="accent1" w:themeShade="BF"/>
       <w:sz w:val="28"/>
       <w:szCs w:val="28"/>
     </w:rPr>
   </w:style>
-  <w:style w:customStyle="1" w:styleId="Heading4Char" w:type="character">
+  <w:style w:type="character" w:customStyle="1" w:styleId="Heading4Char">
     <w:name w:val="Heading 4 Char"/>
     <w:basedOn w:val="DefaultParagraphFont"/>
     <w:link w:val="Heading4"/>
@@ -17197,13 +17208,13 @@
     <w:semiHidden/>
     <w:rsid w:val="00A10FD9"/>
     <w:rPr>
-      <w:rFonts w:cstheme="majorBidi" w:eastAsiaTheme="majorEastAsia"/>
+      <w:rFonts w:eastAsiaTheme="majorEastAsia" w:cstheme="majorBidi"/>
       <w:i/>
       <w:iCs/>
-      <w:color w:themeColor="accent1" w:themeShade="BF" w:val="0F4761"/>
+      <w:color w:val="0F4761" w:themeColor="accent1" w:themeShade="BF"/>
     </w:rPr>
   </w:style>
-  <w:style w:customStyle="1" w:styleId="Heading5Char" w:type="character">
+  <w:style w:type="character" w:customStyle="1" w:styleId="Heading5Char">
     <w:name w:val="Heading 5 Char"/>
     <w:basedOn w:val="DefaultParagraphFont"/>
     <w:link w:val="Heading5"/>
@@ -17211,11 +17222,11 @@
     <w:semiHidden/>
     <w:rsid w:val="00A10FD9"/>
     <w:rPr>
-      <w:rFonts w:cstheme="majorBidi" w:eastAsiaTheme="majorEastAsia"/>
-      <w:color w:themeColor="accent1" w:themeShade="BF" w:val="0F4761"/>
+      <w:rFonts w:eastAsiaTheme="majorEastAsia" w:cstheme="majorBidi"/>
+      <w:color w:val="0F4761" w:themeColor="accent1" w:themeShade="BF"/>
     </w:rPr>
   </w:style>
-  <w:style w:customStyle="1" w:styleId="Heading6Char" w:type="character">
+  <w:style w:type="character" w:customStyle="1" w:styleId="Heading6Char">
     <w:name w:val="Heading 6 Char"/>
     <w:basedOn w:val="DefaultParagraphFont"/>
     <w:link w:val="Heading6"/>
@@ -17223,13 +17234,13 @@
     <w:semiHidden/>
     <w:rsid w:val="00A10FD9"/>
     <w:rPr>
-      <w:rFonts w:cstheme="majorBidi" w:eastAsiaTheme="majorEastAsia"/>
+      <w:rFonts w:eastAsiaTheme="majorEastAsia" w:cstheme="majorBidi"/>
       <w:i/>
       <w:iCs/>
-      <w:color w:themeColor="text1" w:themeTint="A6" w:val="595959"/>
+      <w:color w:val="595959" w:themeColor="text1" w:themeTint="A6"/>
     </w:rPr>
   </w:style>
-  <w:style w:customStyle="1" w:styleId="Heading7Char" w:type="character">
+  <w:style w:type="character" w:customStyle="1" w:styleId="Heading7Char">
     <w:name w:val="Heading 7 Char"/>
     <w:basedOn w:val="DefaultParagraphFont"/>
     <w:link w:val="Heading7"/>
@@ -17237,11 +17248,11 @@
     <w:semiHidden/>
     <w:rsid w:val="00A10FD9"/>
     <w:rPr>
-      <w:rFonts w:cstheme="majorBidi" w:eastAsiaTheme="majorEastAsia"/>
-      <w:color w:themeColor="text1" w:themeTint="A6" w:val="595959"/>
+      <w:rFonts w:eastAsiaTheme="majorEastAsia" w:cstheme="majorBidi"/>
+      <w:color w:val="595959" w:themeColor="text1" w:themeTint="A6"/>
     </w:rPr>
   </w:style>
-  <w:style w:customStyle="1" w:styleId="Heading8Char" w:type="character">
+  <w:style w:type="character" w:customStyle="1" w:styleId="Heading8Char">
     <w:name w:val="Heading 8 Char"/>
     <w:basedOn w:val="DefaultParagraphFont"/>
     <w:link w:val="Heading8"/>
@@ -17249,13 +17260,13 @@
     <w:semiHidden/>
     <w:rsid w:val="00A10FD9"/>
     <w:rPr>
-      <w:rFonts w:cstheme="majorBidi" w:eastAsiaTheme="majorEastAsia"/>
+      <w:rFonts w:eastAsiaTheme="majorEastAsia" w:cstheme="majorBidi"/>
       <w:i/>
       <w:iCs/>
-      <w:color w:themeColor="text1" w:themeTint="D8" w:val="272727"/>
+      <w:color w:val="272727" w:themeColor="text1" w:themeTint="D8"/>
     </w:rPr>
   </w:style>
-  <w:style w:customStyle="1" w:styleId="Heading9Char" w:type="character">
+  <w:style w:type="character" w:customStyle="1" w:styleId="Heading9Char">
     <w:name w:val="Heading 9 Char"/>
     <w:basedOn w:val="DefaultParagraphFont"/>
     <w:link w:val="Heading9"/>
@@ -17263,11 +17274,11 @@
     <w:semiHidden/>
     <w:rsid w:val="00A10FD9"/>
     <w:rPr>
-      <w:rFonts w:cstheme="majorBidi" w:eastAsiaTheme="majorEastAsia"/>
-      <w:color w:themeColor="text1" w:themeTint="D8" w:val="272727"/>
+      <w:rFonts w:eastAsiaTheme="majorEastAsia" w:cstheme="majorBidi"/>
+      <w:color w:val="272727" w:themeColor="text1" w:themeTint="D8"/>
     </w:rPr>
   </w:style>
-  <w:style w:styleId="BlockText" w:type="paragraph">
+  <w:style w:type="paragraph" w:styleId="BlockText">
     <w:name w:val="Block Text"/>
     <w:basedOn w:val="BodyText"/>
     <w:next w:val="BodyText"/>
@@ -17275,11 +17286,11 @@
     <w:unhideWhenUsed/>
     <w:qFormat/>
     <w:pPr>
-      <w:spacing w:after="100" w:before="100"/>
+      <w:spacing w:before="100" w:after="100"/>
       <w:ind w:firstLine="0" w:left="480" w:right="480"/>
     </w:pPr>
   </w:style>
-  <w:style w:styleId="FootnoteText" w:type="paragraph">
+  <w:style w:type="paragraph" w:styleId="FootnoteText">
     <w:name w:val="Footnote Text"/>
     <w:basedOn w:val="Normal"/>
     <w:next w:val="FootnoteText"/>
@@ -17287,7 +17298,7 @@
     <w:unhideWhenUsed/>
     <w:qFormat/>
   </w:style>
-  <w:style w:styleId="FootnoteBlockText" w:type="paragraph">
+  <w:style w:type="paragraph" w:styleId="FootnoteBlockText">
     <w:name w:val="Footnote Block Text"/>
     <w:basedOn w:val="FootnoteText"/>
     <w:next w:val="FootnoteText"/>
@@ -17295,28 +17306,26 @@
     <w:unhideWhenUsed/>
     <w:qFormat/>
     <w:pPr>
-      <w:spacing w:after="100" w:before="100"/>
+      <w:spacing w:before="100" w:after="100"/>
       <w:ind w:firstLine="0" w:left="480" w:right="480"/>
     </w:pPr>
   </w:style>
-  <w:style w:default="1" w:styleId="DefaultParagraphFont" w:type="character">
+  <w:style w:type="character" w:default="1" w:styleId="DefaultParagraphFont">
     <w:name w:val="Default Paragraph Font"/>
     <w:semiHidden/>
     <w:unhideWhenUsed/>
   </w:style>
-  <w:style w:default="1" w:styleId="Table" w:type="table">
+  <w:style w:type="table" w:default="1" w:styleId="Table">
     <w:name w:val="Table"/>
     <w:basedOn w:val="TableNormal"/>
-    <w:semiHidden/>
-    <w:unhideWhenUsed/>
     <w:qFormat/>
     <w:tblPr>
-      <w:tblInd w:type="dxa" w:w="0"/>
+      <w:tblInd w:w="0" w:type="dxa"/>
       <w:tblCellMar>
-        <w:top w:type="dxa" w:w="0"/>
-        <w:left w:type="dxa" w:w="108"/>
-        <w:bottom w:type="dxa" w:w="0"/>
-        <w:right w:type="dxa" w:w="108"/>
+        <w:top w:w="0" w:type="dxa"/>
+        <w:left w:w="108" w:type="dxa"/>
+        <w:bottom w:w="0" w:type="dxa"/>
+        <w:right w:w="108" w:type="dxa"/>
       </w:tblCellMar>
     </w:tblPr>
     <w:tblStylePr w:type="firstRow">
@@ -17328,7 +17337,7 @@
       </w:tcPr>
     </w:tblStylePr>
   </w:style>
-  <w:style w:customStyle="1" w:styleId="DefinitionTerm" w:type="paragraph">
+  <w:style w:type="paragraph" w:customStyle="1" w:styleId="DefinitionTerm">
     <w:name w:val="Definition Term"/>
     <w:basedOn w:val="Normal"/>
     <w:next w:val="Definition"/>
@@ -17341,49 +17350,49 @@
       <w:b/>
     </w:rPr>
   </w:style>
-  <w:style w:customStyle="1" w:styleId="Definition" w:type="paragraph">
+  <w:style w:type="paragraph" w:customStyle="1" w:styleId="Definition">
     <w:name w:val="Definition"/>
     <w:basedOn w:val="Normal"/>
   </w:style>
-  <w:style w:styleId="Caption" w:type="paragraph">
+  <w:style w:type="paragraph" w:styleId="Caption">
     <w:name w:val="Caption"/>
     <w:basedOn w:val="Normal"/>
     <w:link w:val="BodyTextChar"/>
     <w:pPr>
-      <w:spacing w:after="120" w:before="0"/>
+      <w:spacing w:before="0" w:after="120"/>
     </w:pPr>
     <w:rPr>
       <w:i/>
     </w:rPr>
   </w:style>
-  <w:style w:customStyle="1" w:styleId="TableCaption" w:type="paragraph">
+  <w:style w:type="paragraph" w:customStyle="1" w:styleId="TableCaption">
     <w:name w:val="Table Caption"/>
     <w:basedOn w:val="Caption"/>
     <w:pPr>
       <w:keepNext/>
     </w:pPr>
   </w:style>
-  <w:style w:customStyle="1" w:styleId="ImageCaption" w:type="paragraph">
+  <w:style w:type="paragraph" w:customStyle="1" w:styleId="ImageCaption">
     <w:name w:val="Image Caption"/>
     <w:basedOn w:val="Caption"/>
   </w:style>
-  <w:style w:customStyle="1" w:styleId="Figure" w:type="paragraph">
+  <w:style w:type="paragraph" w:customStyle="1" w:styleId="Figure">
     <w:name w:val="Figure"/>
     <w:basedOn w:val="Normal"/>
   </w:style>
-  <w:style w:customStyle="1" w:styleId="CaptionedFigure" w:type="paragraph">
+  <w:style w:type="paragraph" w:customStyle="1" w:styleId="CaptionedFigure">
     <w:name w:val="Captioned Figure"/>
     <w:basedOn w:val="Figure"/>
     <w:pPr>
       <w:keepNext/>
     </w:pPr>
   </w:style>
-  <w:style w:customStyle="1" w:styleId="BodyTextChar" w:type="character">
+  <w:style w:type="character" w:customStyle="1" w:styleId="BodyTextChar">
     <w:name w:val="Body Text Char"/>
     <w:basedOn w:val="DefaultParagraphFont"/>
     <w:link w:val="BodyText"/>
   </w:style>
-  <w:style w:customStyle="1" w:styleId="VerbatimChar" w:type="character">
+  <w:style w:type="character" w:customStyle="1" w:styleId="VerbatimChar">
     <w:name w:val="Verbatim Char"/>
     <w:basedOn w:val="BodyTextChar"/>
     <w:rPr>
@@ -17391,25 +17400,25 @@
       <w:sz w:val="22"/>
     </w:rPr>
   </w:style>
-  <w:style w:customStyle="1" w:styleId="SectionNumber" w:type="character">
+  <w:style w:type="character" w:customStyle="1" w:styleId="SectionNumber">
     <w:name w:val="Section Number"/>
     <w:basedOn w:val="BodyTextChar"/>
   </w:style>
-  <w:style w:styleId="FootnoteReference" w:type="character">
+  <w:style w:type="character" w:styleId="FootnoteReference">
     <w:name w:val="Footnote Reference"/>
     <w:basedOn w:val="BodyTextChar"/>
     <w:rPr>
       <w:vertAlign w:val="superscript"/>
     </w:rPr>
   </w:style>
-  <w:style w:styleId="Hyperlink" w:type="character">
+  <w:style w:type="character" w:styleId="Hyperlink">
     <w:name w:val="Hyperlink"/>
     <w:basedOn w:val="BodyTextChar"/>
     <w:rPr>
-      <w:color w:themeColor="accent1" w:val="4F81BD"/>
+      <w:color w:val="4F81BD" w:themeColor="accent1"/>
     </w:rPr>
   </w:style>
-  <w:style w:styleId="TOCHeading" w:type="paragraph">
+  <w:style w:type="paragraph" w:styleId="TOCHeading">
     <w:name w:val="TOC Heading"/>
     <w:basedOn w:val="Heading1"/>
     <w:next w:val="BodyText"/>
@@ -17421,10 +17430,10 @@
       <w:outlineLvl w:val="9"/>
     </w:pPr>
     <w:rPr>
-      <w:rFonts w:asciiTheme="majorHAnsi" w:cstheme="majorBidi" w:eastAsiaTheme="majorEastAsia" w:hAnsiTheme="majorHAnsi"/>
+      <w:rFonts w:asciiTheme="majorHAnsi" w:eastAsiaTheme="majorEastAsia" w:hAnsiTheme="majorHAnsi" w:cstheme="majorBidi"/>
       <w:b w:val="0"/>
       <w:bCs w:val="0"/>
-      <w:color w:themeColor="accent1" w:themeShade="BF" w:val="365F91"/>
+      <w:color w:val="365F91" w:themeColor="accent1" w:themeShade="BF"/>
     </w:rPr>
   </w:style>
   <w:style w:type="paragraph" w:customStyle="1" w:styleId="SourceCode">

</xml_diff>